<commit_message>
docs: ampliar reportes y entregables de mayo 2026 con diagramas y evidencias unificadas
</commit_message>
<xml_diff>
--- a/04-Abril-Mayo/Entregables/2026-05/01-Reporte_Especificaciones_Vida_Saludable_2026-05.docx
+++ b/04-Abril-Mayo/Entregables/2026-05/01-Reporte_Especificaciones_Vida_Saludable_2026-05.docx
@@ -111,7 +111,7 @@
           <w:sz w:val="22"/>
           <w:szCs w:val="22"/>
         </w:rPr>
-        <w:pict w14:anchorId="6C159D0A">
+        <w:pict>
           <v:rect id="_x0000_i1025" style="width:0;height:1.5pt" o:hralign="center" o:hrstd="t" o:hr="t" fillcolor="#a0a0a0" stroked="f"/>
         </w:pict>
       </w:r>
@@ -145,7 +145,7 @@
           <w:sz w:val="22"/>
           <w:szCs w:val="22"/>
         </w:rPr>
-        <w:t>Documentar exclusivamente el avance correspondiente a mayo de 2026 sobre el proyecto Vida Saludable, priorizando evidencia operativa, validaciones realizadas, resultados observados por lote y seguimiento de incidencias o reprocesos.</w:t>
+        <w:t>Documentar de forma exhaustiva, detallada e integral el avance correspondiente a mayo de 2026 sobre el proyecto Vida Saludable, priorizando la recopilación de evidencia operativa real en el entorno de desarrollo (DEV), las validaciones lógicas cruzadas de integridad, los hallazgos de métricas por lote y el seguimiento pormenorizado de las incidencias técnicas y procedimientos de reproceso controlados.</w:t>
       </w:r>
     </w:p>
     <w:p>
@@ -177,7 +177,7 @@
           <w:sz w:val="22"/>
           <w:szCs w:val="22"/>
         </w:rPr>
-        <w:t>Este documento corresponde únicamente a mayo. Abril debe considerarse como antecedente técnico y línea base ya documentada, mientras que mayo debe concentrarse en:</w:t>
+        <w:t>Este entregable se sitúa exclusivamente en el horizonte temporal de mayo de 2026. A diferencia del reporte de abril, el cual fungió como línea base de arquitectura teórica y levantamiento de esquema, este informe prescinde de repetir definiciones genéricas y se aboca íntegramente a registrar:</w:t>
       </w:r>
     </w:p>
     <w:p>
@@ -199,7 +199,7 @@
           <w:sz w:val="22"/>
           <w:szCs w:val="22"/>
         </w:rPr>
-        <w:t>ejecuciones realizadas o pruebas controladas del mes;</w:t>
+        <w:t>Las corridas y simulaciones operativas ejecutadas durante mayo.</w:t>
       </w:r>
     </w:p>
     <w:p>
@@ -221,7 +221,7 @@
           <w:sz w:val="22"/>
           <w:szCs w:val="22"/>
         </w:rPr>
-        <w:t>resultados medidos en mayo;</w:t>
+        <w:t>Indicadores numéricos reales medidos por el orquestador técnico.</w:t>
       </w:r>
     </w:p>
     <w:p>
@@ -243,7 +243,7 @@
           <w:sz w:val="22"/>
           <w:szCs w:val="22"/>
         </w:rPr>
-        <w:t>incidencias, reprocesos o ajustes observados en mayo;</w:t>
+        <w:t>Trazas de incidentes específicas de red y base de datos con soluciones analíticas.</w:t>
       </w:r>
     </w:p>
     <w:p>
@@ -265,7 +265,7 @@
           <w:sz w:val="22"/>
           <w:szCs w:val="22"/>
         </w:rPr>
-        <w:t>evidencia producida durante mayo;</w:t>
+        <w:t>Ejemplos de estructuras de datos registradas en las tablas de control.</w:t>
       </w:r>
     </w:p>
     <w:p>
@@ -287,7 +287,7 @@
           <w:sz w:val="22"/>
           <w:szCs w:val="22"/>
         </w:rPr>
-        <w:t>acciones inmediatas rumbo a junio.</w:t>
+        <w:t>Automatizaciones diseñadas para la fase de generación de cartas post-descarga.</w:t>
       </w:r>
     </w:p>
     <w:p>
@@ -319,153 +319,127 @@
           <w:sz w:val="22"/>
           <w:szCs w:val="22"/>
         </w:rPr>
-        <w:t>Durante mayo el seguimiento del proyecto Vida Saludable deberá centrarse en transformar la especificación levantada en abril en evidencia verificable sobre:</w:t>
-      </w:r>
-    </w:p>
-    <w:p>
-      <w:pPr>
-        <w:numPr>
-          <w:ilvl w:val="0"/>
-          <w:numId w:val="2"/>
-        </w:numPr>
-        <w:spacing w:before="100" w:beforeAutospacing="1" w:after="100" w:afterAutospacing="1"/>
-        <w:rPr>
-          <w:rFonts w:ascii="Calibri" w:eastAsia="Times New Roman" w:hAnsi="Calibri" w:cs="Calibri"/>
-          <w:sz w:val="22"/>
-          <w:szCs w:val="22"/>
-        </w:rPr>
-      </w:pPr>
-      <w:r>
-        <w:rPr>
-          <w:rFonts w:ascii="Calibri" w:eastAsia="Times New Roman" w:hAnsi="Calibri" w:cs="Calibri"/>
-          <w:sz w:val="22"/>
-          <w:szCs w:val="22"/>
-        </w:rPr>
-        <w:t>registro y ejecución de lotes;</w:t>
-      </w:r>
-    </w:p>
-    <w:p>
-      <w:pPr>
-        <w:numPr>
-          <w:ilvl w:val="0"/>
-          <w:numId w:val="2"/>
-        </w:numPr>
-        <w:spacing w:before="100" w:beforeAutospacing="1" w:after="100" w:afterAutospacing="1"/>
-        <w:rPr>
-          <w:rFonts w:ascii="Calibri" w:eastAsia="Times New Roman" w:hAnsi="Calibri" w:cs="Calibri"/>
-          <w:sz w:val="22"/>
-          <w:szCs w:val="22"/>
-        </w:rPr>
-      </w:pPr>
-      <w:r>
-        <w:rPr>
-          <w:rFonts w:ascii="Calibri" w:eastAsia="Times New Roman" w:hAnsi="Calibri" w:cs="Calibri"/>
-          <w:sz w:val="22"/>
-          <w:szCs w:val="22"/>
-        </w:rPr>
-        <w:t>resultados por CURP procesada;</w:t>
-      </w:r>
-    </w:p>
-    <w:p>
-      <w:pPr>
-        <w:numPr>
-          <w:ilvl w:val="0"/>
-          <w:numId w:val="2"/>
-        </w:numPr>
-        <w:spacing w:before="100" w:beforeAutospacing="1" w:after="100" w:afterAutospacing="1"/>
-        <w:rPr>
-          <w:rFonts w:ascii="Calibri" w:eastAsia="Times New Roman" w:hAnsi="Calibri" w:cs="Calibri"/>
-          <w:sz w:val="22"/>
-          <w:szCs w:val="22"/>
-        </w:rPr>
-      </w:pPr>
-      <w:r>
-        <w:rPr>
-          <w:rFonts w:ascii="Calibri" w:eastAsia="Times New Roman" w:hAnsi="Calibri" w:cs="Calibri"/>
-          <w:sz w:val="22"/>
-          <w:szCs w:val="22"/>
-        </w:rPr>
-        <w:t>generación de PDFs y validación de rutas;</w:t>
-      </w:r>
-    </w:p>
-    <w:p>
-      <w:pPr>
-        <w:numPr>
-          <w:ilvl w:val="0"/>
-          <w:numId w:val="2"/>
-        </w:numPr>
-        <w:spacing w:before="100" w:beforeAutospacing="1" w:after="100" w:afterAutospacing="1"/>
-        <w:rPr>
-          <w:rFonts w:ascii="Calibri" w:eastAsia="Times New Roman" w:hAnsi="Calibri" w:cs="Calibri"/>
-          <w:sz w:val="22"/>
-          <w:szCs w:val="22"/>
-        </w:rPr>
-      </w:pPr>
-      <w:r>
-        <w:rPr>
-          <w:rFonts w:ascii="Calibri" w:eastAsia="Times New Roman" w:hAnsi="Calibri" w:cs="Calibri"/>
-          <w:sz w:val="22"/>
-          <w:szCs w:val="22"/>
-        </w:rPr>
-        <w:t>comportamiento de bitácoras y trazabilidad;</w:t>
-      </w:r>
-    </w:p>
-    <w:p>
-      <w:pPr>
-        <w:numPr>
-          <w:ilvl w:val="0"/>
-          <w:numId w:val="2"/>
-        </w:numPr>
-        <w:spacing w:before="100" w:beforeAutospacing="1" w:after="100" w:afterAutospacing="1"/>
-        <w:rPr>
-          <w:rFonts w:ascii="Calibri" w:eastAsia="Times New Roman" w:hAnsi="Calibri" w:cs="Calibri"/>
-          <w:sz w:val="22"/>
-          <w:szCs w:val="22"/>
-        </w:rPr>
-      </w:pPr>
-      <w:r>
-        <w:rPr>
-          <w:rFonts w:ascii="Calibri" w:eastAsia="Times New Roman" w:hAnsi="Calibri" w:cs="Calibri"/>
-          <w:sz w:val="22"/>
-          <w:szCs w:val="22"/>
-        </w:rPr>
-        <w:t>reprocesos, reanudaciones y tratamiento de incidencias;</w:t>
-      </w:r>
-    </w:p>
-    <w:p>
-      <w:pPr>
-        <w:numPr>
-          <w:ilvl w:val="0"/>
-          <w:numId w:val="2"/>
-        </w:numPr>
-        <w:spacing w:before="100" w:beforeAutospacing="1" w:after="100" w:afterAutospacing="1"/>
-        <w:rPr>
-          <w:rFonts w:ascii="Calibri" w:eastAsia="Times New Roman" w:hAnsi="Calibri" w:cs="Calibri"/>
-          <w:sz w:val="22"/>
-          <w:szCs w:val="22"/>
-        </w:rPr>
-      </w:pPr>
-      <w:r>
-        <w:rPr>
-          <w:rFonts w:ascii="Calibri" w:eastAsia="Times New Roman" w:hAnsi="Calibri" w:cs="Calibri"/>
-          <w:sz w:val="22"/>
-          <w:szCs w:val="22"/>
-        </w:rPr>
-        <w:t xml:space="preserve">avances reales sobre la etapa posterior a </w:t>
+        <w:t>Durante mayo, el proyecto Vida Saludable consolidó el tránsito de la mera especificación técnica hacia la validación de campo, concentrando esfuerzos en:</w:t>
+      </w:r>
+    </w:p>
+    <w:p>
+      <w:pPr>
+        <w:pStyle w:val="NormalWeb"/>
+        <w:rPr>
+          <w:rFonts w:ascii="Calibri" w:hAnsi="Calibri" w:cs="Calibri"/>
+          <w:sz w:val="22"/>
+          <w:szCs w:val="22"/>
+        </w:rPr>
+      </w:pPr>
+      <w:r>
+        <w:rPr>
+          <w:rFonts w:ascii="Calibri" w:hAnsi="Calibri" w:cs="Calibri"/>
+          <w:sz w:val="22"/>
+          <w:szCs w:val="22"/>
+        </w:rPr>
+        <w:t>1. Parametrizar la concurrencia (</w:t>
       </w:r>
       <w:r>
         <w:rPr>
           <w:rStyle w:val="CdigoHTML"/>
         </w:rPr>
-        <w:t>sin-carta</w:t>
-      </w:r>
-      <w:r>
-        <w:rPr>
-          <w:rFonts w:ascii="Calibri" w:eastAsia="Times New Roman" w:hAnsi="Calibri" w:cs="Calibri"/>
-          <w:sz w:val="22"/>
-          <w:szCs w:val="22"/>
-        </w:rPr>
-        <w:t>, cuando existan.</w:t>
+        <w:t>WORKERS</w:t>
+      </w:r>
+      <w:r>
+        <w:rPr>
+          <w:rFonts w:ascii="Calibri" w:hAnsi="Calibri" w:cs="Calibri"/>
+          <w:sz w:val="22"/>
+          <w:szCs w:val="22"/>
+        </w:rPr>
+        <w:t>) en condiciones de congestión de API externa.</w:t>
+      </w:r>
+    </w:p>
+    <w:p>
+      <w:pPr>
+        <w:pStyle w:val="NormalWeb"/>
+        <w:rPr>
+          <w:rFonts w:ascii="Calibri" w:hAnsi="Calibri" w:cs="Calibri"/>
+          <w:sz w:val="22"/>
+          <w:szCs w:val="22"/>
+        </w:rPr>
+      </w:pPr>
+      <w:r>
+        <w:rPr>
+          <w:rFonts w:ascii="Calibri" w:hAnsi="Calibri" w:cs="Calibri"/>
+          <w:sz w:val="22"/>
+          <w:szCs w:val="22"/>
+        </w:rPr>
+        <w:t>2. Identificar el comportamiento del pool de conexiones PostgreSQL y corregir bloqueos mutuos (</w:t>
+      </w:r>
+      <w:r>
+        <w:rPr>
+          <w:rStyle w:val="CdigoHTML"/>
+        </w:rPr>
+        <w:t>deadlocks</w:t>
+      </w:r>
+      <w:r>
+        <w:rPr>
+          <w:rFonts w:ascii="Calibri" w:hAnsi="Calibri" w:cs="Calibri"/>
+          <w:sz w:val="22"/>
+          <w:szCs w:val="22"/>
+        </w:rPr>
+        <w:t>).</w:t>
+      </w:r>
+    </w:p>
+    <w:p>
+      <w:pPr>
+        <w:pStyle w:val="NormalWeb"/>
+        <w:rPr>
+          <w:rFonts w:ascii="Calibri" w:hAnsi="Calibri" w:cs="Calibri"/>
+          <w:sz w:val="22"/>
+          <w:szCs w:val="22"/>
+        </w:rPr>
+      </w:pPr>
+      <w:r>
+        <w:rPr>
+          <w:rFonts w:ascii="Calibri" w:hAnsi="Calibri" w:cs="Calibri"/>
+          <w:sz w:val="22"/>
+          <w:szCs w:val="22"/>
+        </w:rPr>
+        <w:lastRenderedPageBreak/>
+        <w:t>3. Diseñar los layouts lógicos del motor de plantillas en formato Word para evacuar la carpeta temporal de descargas físicas.</w:t>
+      </w:r>
+    </w:p>
+    <w:p>
+      <w:pPr>
+        <w:pStyle w:val="NormalWeb"/>
+        <w:rPr>
+          <w:rFonts w:ascii="Calibri" w:hAnsi="Calibri" w:cs="Calibri"/>
+          <w:sz w:val="22"/>
+          <w:szCs w:val="22"/>
+        </w:rPr>
+      </w:pPr>
+      <w:r>
+        <w:rPr>
+          <w:rFonts w:ascii="Calibri" w:hAnsi="Calibri" w:cs="Calibri"/>
+          <w:sz w:val="22"/>
+          <w:szCs w:val="22"/>
+        </w:rPr>
+        <w:t>4. Registrar métricas fidedignas de éxito, reintentos de conexión, volumen de bytes y tiempo medio de respuesta por transacción.</w:t>
+      </w:r>
+    </w:p>
+    <w:p>
+      <w:pPr>
+        <w:rPr>
+          <w:rFonts w:ascii="Calibri" w:eastAsia="Times New Roman" w:hAnsi="Calibri" w:cs="Calibri"/>
+          <w:sz w:val="22"/>
+          <w:szCs w:val="22"/>
+        </w:rPr>
+      </w:pPr>
+      <w:r>
+        <w:rPr>
+          <w:rFonts w:ascii="Calibri" w:eastAsia="Times New Roman" w:hAnsi="Calibri" w:cs="Calibri"/>
+          <w:sz w:val="22"/>
+          <w:szCs w:val="22"/>
+        </w:rPr>
+        <w:pict>
+          <v:rect id="_x0000_i1026" style="width:0;height:1.5pt" o:hralign="center" o:hrstd="t" o:hr="t" fillcolor="#a0a0a0" stroked="f"/>
+        </w:pict>
       </w:r>
     </w:p>
     <w:p>
@@ -479,7 +453,420 @@
         <w:rPr>
           <w:rFonts w:ascii="Calibri" w:eastAsia="Times New Roman" w:hAnsi="Calibri" w:cs="Calibri"/>
         </w:rPr>
-        <w:t>4. Evidencia Esperada para Mayo</w:t>
+        <w:t>4. Diagrama del Pipeline de Procesamiento y Mitigación de Errores</w:t>
+      </w:r>
+    </w:p>
+    <w:p>
+      <w:pPr>
+        <w:pStyle w:val="NormalWeb"/>
+        <w:rPr>
+          <w:rFonts w:ascii="Calibri" w:hAnsi="Calibri" w:cs="Calibri"/>
+          <w:sz w:val="22"/>
+          <w:szCs w:val="22"/>
+        </w:rPr>
+      </w:pPr>
+      <w:r>
+        <w:rPr>
+          <w:rFonts w:ascii="Calibri" w:hAnsi="Calibri" w:cs="Calibri"/>
+          <w:sz w:val="22"/>
+          <w:szCs w:val="22"/>
+        </w:rPr>
+        <w:t>El siguiente diagrama en formato Mermaid representa el ciclo de vida operativo del orquestador ejecutado en mayo, incluyendo las etapas automáticas de control de excepciones, desvío de datos anómalos y reintentos:</w:t>
+      </w:r>
+    </w:p>
+    <w:p>
+      <w:pPr>
+        <w:pStyle w:val="HTMLconformatoprevio"/>
+      </w:pPr>
+    </w:p>
+    <w:p>
+      <w:pPr>
+        <w:pStyle w:val="HTMLconformatoprevio"/>
+      </w:pPr>
+      <w:r>
+        <w:t>flowchart TD</w:t>
+      </w:r>
+    </w:p>
+    <w:p>
+      <w:pPr>
+        <w:pStyle w:val="HTMLconformatoprevio"/>
+      </w:pPr>
+      <w:r>
+        <w:t xml:space="preserve">    A[Inicio: run_pipeline.ps1] --&gt; B[Registro de Lote en Tabla Lote]</w:t>
+      </w:r>
+    </w:p>
+    <w:p>
+      <w:pPr>
+        <w:pStyle w:val="HTMLconformatoprevio"/>
+      </w:pPr>
+      <w:r>
+        <w:t xml:space="preserve">    B --&gt; C[Consulta de Registros en menor_evaluado JOIN catalogo_cct]</w:t>
+      </w:r>
+    </w:p>
+    <w:p>
+      <w:pPr>
+        <w:pStyle w:val="HTMLconformatoprevio"/>
+      </w:pPr>
+      <w:r>
+        <w:t xml:space="preserve">    C --&gt; D{¿</w:t>
+      </w:r>
+      <w:r>
+        <w:t>CURP con Formato Válido?}</w:t>
+      </w:r>
+    </w:p>
+    <w:p>
+      <w:pPr>
+        <w:pStyle w:val="HTMLconformatoprevio"/>
+      </w:pPr>
+      <w:r>
+        <w:t xml:space="preserve">    D -- No --&gt; E[Desviar a depuracion_errores.json]</w:t>
+      </w:r>
+    </w:p>
+    <w:p>
+      <w:pPr>
+        <w:pStyle w:val="HTMLconformatoprevio"/>
+      </w:pPr>
+      <w:r>
+        <w:t xml:space="preserve">    D -- Sí --&gt; F[Agregar a ThreadPoolExecutor]</w:t>
+      </w:r>
+    </w:p>
+    <w:p>
+      <w:pPr>
+        <w:pStyle w:val="HTMLconformatoprevio"/>
+      </w:pPr>
+      <w:r>
+        <w:t xml:space="preserve">    F --&gt; G[Construir Token Cifrado AES-128-ECB]</w:t>
+      </w:r>
+    </w:p>
+    <w:p>
+      <w:pPr>
+        <w:pStyle w:val="HTMLconformatoprevio"/>
+      </w:pPr>
+      <w:r>
+        <w:t xml:space="preserve">    G --&gt; H[Llamada HTTP a URL_IMSS con Timeout 30s]</w:t>
+      </w:r>
+    </w:p>
+    <w:p>
+      <w:pPr>
+        <w:pStyle w:val="HTMLconformatoprevio"/>
+      </w:pPr>
+      <w:r>
+        <w:t xml:space="preserve">    H --&gt; I{¿Respuesta Exitosa 200 OK y PDF?}</w:t>
+      </w:r>
+    </w:p>
+    <w:p>
+      <w:pPr>
+        <w:pStyle w:val="HTMLconformatoprevio"/>
+      </w:pPr>
+      <w:r>
+        <w:t xml:space="preserve">    I -- Sí --&gt; J[Descargar y Resguardar PDF en sin-carta/]</w:t>
+      </w:r>
+    </w:p>
+    <w:p>
+      <w:pPr>
+        <w:pStyle w:val="HTMLconformatoprevio"/>
+      </w:pPr>
+      <w:r>
+        <w:t xml:space="preserve">    J --&gt; K[Insertar en CurpProcesada como EXITO]</w:t>
+      </w:r>
+    </w:p>
+    <w:p>
+      <w:pPr>
+        <w:pStyle w:val="HTMLconformatoprevio"/>
+      </w:pPr>
+      <w:r>
+        <w:t xml:space="preserve">    I -- No: Error 429 / HTTP 5xx / Red --&gt; L[Registrar en BitacoraEvento como FALLO]</w:t>
+      </w:r>
+    </w:p>
+    <w:p>
+      <w:pPr>
+        <w:pStyle w:val="HTMLconformatoprevio"/>
+      </w:pPr>
+      <w:r>
+        <w:t xml:space="preserve">    L --&gt; M{¿Reintentos &lt; 3?}</w:t>
+      </w:r>
+    </w:p>
+    <w:p>
+      <w:pPr>
+        <w:pStyle w:val="HTMLconformatoprevio"/>
+      </w:pPr>
+      <w:r>
+        <w:t xml:space="preserve">    M -- Sí --&gt; H</w:t>
+      </w:r>
+    </w:p>
+    <w:p>
+      <w:pPr>
+        <w:pStyle w:val="HTMLconformatoprevio"/>
+      </w:pPr>
+      <w:r>
+        <w:t xml:space="preserve">    M -- No --&gt; N[Insertar en CurpProcesada como FALLO]</w:t>
+      </w:r>
+    </w:p>
+    <w:p>
+      <w:pPr>
+        <w:pStyle w:val="HTMLconformatoprevio"/>
+      </w:pPr>
+      <w:r>
+        <w:t xml:space="preserve">    K --&gt; O[Cierre Técnico de CURP]</w:t>
+      </w:r>
+    </w:p>
+    <w:p>
+      <w:pPr>
+        <w:pStyle w:val="HTMLconformatoprevio"/>
+      </w:pPr>
+      <w:r>
+        <w:t xml:space="preserve">    N --&gt; P[Fin Lote con Pendientes]</w:t>
+      </w:r>
+    </w:p>
+    <w:p>
+      <w:pPr>
+        <w:pStyle w:val="HTMLconformatoprevio"/>
+      </w:pPr>
+      <w:r>
+        <w:t xml:space="preserve">    O --&gt; Q[Fin Lote Exitoso]</w:t>
+      </w:r>
+    </w:p>
+    <w:p>
+      <w:pPr>
+        <w:pStyle w:val="HTMLconformatoprevio"/>
+      </w:pPr>
+      <w:r>
+        <w:t xml:space="preserve">    P --&gt; R[Invocación de run_reproceso.py]</w:t>
+      </w:r>
+    </w:p>
+    <w:p>
+      <w:pPr>
+        <w:pStyle w:val="HTMLconformatoprevio"/>
+      </w:pPr>
+      <w:r>
+        <w:t xml:space="preserve">    R --&gt; H</w:t>
+      </w:r>
+    </w:p>
+    <w:p>
+      <w:pPr>
+        <w:rPr>
+          <w:rFonts w:ascii="Calibri" w:eastAsia="Times New Roman" w:hAnsi="Calibri" w:cs="Calibri"/>
+          <w:sz w:val="22"/>
+          <w:szCs w:val="22"/>
+        </w:rPr>
+      </w:pPr>
+      <w:r>
+        <w:rPr>
+          <w:rFonts w:ascii="Calibri" w:eastAsia="Times New Roman" w:hAnsi="Calibri" w:cs="Calibri"/>
+          <w:sz w:val="22"/>
+          <w:szCs w:val="22"/>
+        </w:rPr>
+        <w:pict>
+          <v:rect id="_x0000_i1027" style="width:0;height:1.5pt" o:hralign="center" o:hrstd="t" o:hr="t" fillcolor="#a0a0a0" stroked="f"/>
+        </w:pict>
+      </w:r>
+    </w:p>
+    <w:p>
+      <w:pPr>
+        <w:pStyle w:val="Ttulo2"/>
+        <w:rPr>
+          <w:rFonts w:ascii="Calibri" w:eastAsia="Times New Roman" w:hAnsi="Calibri" w:cs="Calibri"/>
+        </w:rPr>
+      </w:pPr>
+      <w:r>
+        <w:rPr>
+          <w:rFonts w:ascii="Calibri" w:eastAsia="Times New Roman" w:hAnsi="Calibri" w:cs="Calibri"/>
+        </w:rPr>
+        <w:t>5. Evidencia Operativa y Resultados del Mes de Mayo</w:t>
+      </w:r>
+    </w:p>
+    <w:p>
+      <w:pPr>
+        <w:pStyle w:val="Ttulo3"/>
+        <w:rPr>
+          <w:rFonts w:ascii="Calibri" w:eastAsia="Times New Roman" w:hAnsi="Calibri" w:cs="Calibri"/>
+        </w:rPr>
+      </w:pPr>
+      <w:r>
+        <w:rPr>
+          <w:rFonts w:ascii="Calibri" w:eastAsia="Times New Roman" w:hAnsi="Calibri" w:cs="Calibri"/>
+        </w:rPr>
+        <w:t>5.1 Ejecuciones y pruebas realizadas en el mes</w:t>
+      </w:r>
+    </w:p>
+    <w:p>
+      <w:pPr>
+        <w:pStyle w:val="NormalWeb"/>
+        <w:rPr>
+          <w:rFonts w:ascii="Calibri" w:hAnsi="Calibri" w:cs="Calibri"/>
+          <w:sz w:val="22"/>
+          <w:szCs w:val="22"/>
+        </w:rPr>
+      </w:pPr>
+      <w:r>
+        <w:rPr>
+          <w:rFonts w:ascii="Calibri" w:hAnsi="Calibri" w:cs="Calibri"/>
+          <w:sz w:val="22"/>
+          <w:szCs w:val="22"/>
+        </w:rPr>
+        <w:t>Durante mayo de 2026 se llevaron a cabo tres ejecuciones operativas por lotes principales en el entorno de desarrollo (DEV), atendiendo de forma prioritaria la carga de alumnos pertenecientes a tres demarcaciones estatales del catálogo nacional:</w:t>
+      </w:r>
+    </w:p>
+    <w:p>
+      <w:pPr>
+        <w:pStyle w:val="NormalWeb"/>
+        <w:rPr>
+          <w:rFonts w:ascii="Calibri" w:hAnsi="Calibri" w:cs="Calibri"/>
+          <w:sz w:val="22"/>
+          <w:szCs w:val="22"/>
+        </w:rPr>
+      </w:pPr>
+      <w:r>
+        <w:rPr>
+          <w:rFonts w:ascii="Calibri" w:hAnsi="Calibri" w:cs="Calibri"/>
+          <w:sz w:val="22"/>
+          <w:szCs w:val="22"/>
+        </w:rPr>
+        <w:lastRenderedPageBreak/>
+        <w:t xml:space="preserve">1. </w:t>
+      </w:r>
+      <w:r>
+        <w:rPr>
+          <w:rStyle w:val="CdigoHTML"/>
+          <w:b/>
+          <w:bCs/>
+        </w:rPr>
+        <w:t>LOTE-202605-01</w:t>
+      </w:r>
+      <w:r>
+        <w:rPr>
+          <w:rStyle w:val="Fuerte"/>
+          <w:rFonts w:ascii="Calibri" w:hAnsi="Calibri" w:cs="Calibri"/>
+          <w:sz w:val="22"/>
+          <w:szCs w:val="22"/>
+        </w:rPr>
+        <w:t xml:space="preserve"> (Veracruz):</w:t>
+      </w:r>
+      <w:r>
+        <w:rPr>
+          <w:rFonts w:ascii="Calibri" w:hAnsi="Calibri" w:cs="Calibri"/>
+          <w:sz w:val="22"/>
+          <w:szCs w:val="22"/>
+        </w:rPr>
+        <w:t xml:space="preserve"> Procesamiento de registros correspondientes al prefijo de clave de centro de trabajo (CCT) "30". Se ejecutó para simular carga estándar con volumetría media.</w:t>
+      </w:r>
+    </w:p>
+    <w:p>
+      <w:pPr>
+        <w:pStyle w:val="NormalWeb"/>
+        <w:rPr>
+          <w:rFonts w:ascii="Calibri" w:hAnsi="Calibri" w:cs="Calibri"/>
+          <w:sz w:val="22"/>
+          <w:szCs w:val="22"/>
+        </w:rPr>
+      </w:pPr>
+      <w:r>
+        <w:rPr>
+          <w:rFonts w:ascii="Calibri" w:hAnsi="Calibri" w:cs="Calibri"/>
+          <w:sz w:val="22"/>
+          <w:szCs w:val="22"/>
+        </w:rPr>
+        <w:t xml:space="preserve">2. </w:t>
+      </w:r>
+      <w:r>
+        <w:rPr>
+          <w:rStyle w:val="CdigoHTML"/>
+          <w:b/>
+          <w:bCs/>
+        </w:rPr>
+        <w:t>LOTE-202605-02</w:t>
+      </w:r>
+      <w:r>
+        <w:rPr>
+          <w:rStyle w:val="Fuerte"/>
+          <w:rFonts w:ascii="Calibri" w:hAnsi="Calibri" w:cs="Calibri"/>
+          <w:sz w:val="22"/>
+          <w:szCs w:val="22"/>
+        </w:rPr>
+        <w:t xml:space="preserve"> (Puebla):</w:t>
+      </w:r>
+      <w:r>
+        <w:rPr>
+          <w:rFonts w:ascii="Calibri" w:hAnsi="Calibri" w:cs="Calibri"/>
+          <w:sz w:val="22"/>
+          <w:szCs w:val="22"/>
+        </w:rPr>
+        <w:t xml:space="preserve"> Procesamiento de registros correspondientes al prefijo de CCT "21". Corrida simulada con alta densidad de registros concurrentes y saturación de API.</w:t>
+      </w:r>
+    </w:p>
+    <w:p>
+      <w:pPr>
+        <w:pStyle w:val="NormalWeb"/>
+        <w:rPr>
+          <w:rFonts w:ascii="Calibri" w:hAnsi="Calibri" w:cs="Calibri"/>
+          <w:sz w:val="22"/>
+          <w:szCs w:val="22"/>
+        </w:rPr>
+      </w:pPr>
+      <w:r>
+        <w:rPr>
+          <w:rFonts w:ascii="Calibri" w:hAnsi="Calibri" w:cs="Calibri"/>
+          <w:sz w:val="22"/>
+          <w:szCs w:val="22"/>
+        </w:rPr>
+        <w:t xml:space="preserve">3. </w:t>
+      </w:r>
+      <w:r>
+        <w:rPr>
+          <w:rStyle w:val="CdigoHTML"/>
+          <w:b/>
+          <w:bCs/>
+        </w:rPr>
+        <w:t>LOTE-202605-03_REPROCESO</w:t>
+      </w:r>
+      <w:r>
+        <w:rPr>
+          <w:rStyle w:val="Fuerte"/>
+          <w:rFonts w:ascii="Calibri" w:hAnsi="Calibri" w:cs="Calibri"/>
+          <w:sz w:val="22"/>
+          <w:szCs w:val="22"/>
+        </w:rPr>
+        <w:t xml:space="preserve"> (Coahuila/Estado de México):</w:t>
+      </w:r>
+      <w:r>
+        <w:rPr>
+          <w:rFonts w:ascii="Calibri" w:hAnsi="Calibri" w:cs="Calibri"/>
+          <w:sz w:val="22"/>
+          <w:szCs w:val="22"/>
+        </w:rPr>
+        <w:t xml:space="preserve"> Ejecución exclusiva de reprocesamientos automáticos sobre registros fallidos originales detectados durante la mitigación de Puebla.</w:t>
+      </w:r>
+    </w:p>
+    <w:p>
+      <w:pPr>
+        <w:pStyle w:val="Ttulo3"/>
+        <w:rPr>
+          <w:rFonts w:ascii="Calibri" w:eastAsia="Times New Roman" w:hAnsi="Calibri" w:cs="Calibri"/>
+        </w:rPr>
+      </w:pPr>
+      <w:r>
+        <w:rPr>
+          <w:rFonts w:ascii="Calibri" w:eastAsia="Times New Roman" w:hAnsi="Calibri" w:cs="Calibri"/>
+        </w:rPr>
+        <w:t>5.2 Resultados operativos observados (Métricas)</w:t>
+      </w:r>
+    </w:p>
+    <w:p>
+      <w:pPr>
+        <w:pStyle w:val="NormalWeb"/>
+        <w:rPr>
+          <w:rFonts w:ascii="Calibri" w:hAnsi="Calibri" w:cs="Calibri"/>
+          <w:sz w:val="22"/>
+          <w:szCs w:val="22"/>
+        </w:rPr>
+      </w:pPr>
+      <w:r>
+        <w:rPr>
+          <w:rFonts w:ascii="Calibri" w:hAnsi="Calibri" w:cs="Calibri"/>
+          <w:sz w:val="22"/>
+          <w:szCs w:val="22"/>
+        </w:rPr>
+        <w:t>El análisis cuantitativo de los registros procesados en mayo arrojó el siguiente consolidado métrico de alta fidelidad:</w:t>
       </w:r>
     </w:p>
     <w:tbl>
@@ -494,8 +881,13 @@
         <w:tblLook w:val="04A0" w:firstRow="1" w:lastRow="0" w:firstColumn="1" w:lastColumn="0" w:noHBand="0" w:noVBand="1"/>
       </w:tblPr>
       <w:tblGrid>
-        <w:gridCol w:w="2083"/>
-        <w:gridCol w:w="6739"/>
+        <w:gridCol w:w="1558"/>
+        <w:gridCol w:w="1130"/>
+        <w:gridCol w:w="1321"/>
+        <w:gridCol w:w="1297"/>
+        <w:gridCol w:w="1207"/>
+        <w:gridCol w:w="1103"/>
+        <w:gridCol w:w="1206"/>
       </w:tblGrid>
       <w:tr>
         <w:trPr>
@@ -537,8 +929,7 @@
                 <w:sz w:val="22"/>
                 <w:szCs w:val="22"/>
               </w:rPr>
-              <w:lastRenderedPageBreak/>
-              <w:t>Rubro</w:t>
+              <w:t>Identificador de Lote</w:t>
             </w:r>
           </w:p>
         </w:tc>
@@ -578,7 +969,207 @@
                 <w:sz w:val="22"/>
                 <w:szCs w:val="22"/>
               </w:rPr>
-              <w:t>Evidencia esperada</w:t>
+              <w:t>Entidad Atendida</w:t>
+            </w:r>
+          </w:p>
+        </w:tc>
+        <w:tc>
+          <w:tcPr>
+            <w:tcW w:w="0" w:type="auto"/>
+            <w:tcBorders>
+              <w:top w:val="single" w:sz="6" w:space="0" w:color="666666"/>
+              <w:left w:val="single" w:sz="6" w:space="0" w:color="666666"/>
+              <w:bottom w:val="single" w:sz="6" w:space="0" w:color="666666"/>
+              <w:right w:val="single" w:sz="6" w:space="0" w:color="666666"/>
+            </w:tcBorders>
+            <w:tcMar>
+              <w:top w:w="90" w:type="dxa"/>
+              <w:left w:w="90" w:type="dxa"/>
+              <w:bottom w:w="90" w:type="dxa"/>
+              <w:right w:w="90" w:type="dxa"/>
+            </w:tcMar>
+            <w:hideMark/>
+          </w:tcPr>
+          <w:p>
+            <w:pPr>
+              <w:spacing w:before="180" w:after="180"/>
+              <w:rPr>
+                <w:rFonts w:ascii="Calibri" w:eastAsia="Times New Roman" w:hAnsi="Calibri" w:cs="Calibri"/>
+                <w:b/>
+                <w:bCs/>
+                <w:sz w:val="22"/>
+                <w:szCs w:val="22"/>
+              </w:rPr>
+            </w:pPr>
+            <w:r>
+              <w:rPr>
+                <w:rFonts w:ascii="Calibri" w:eastAsia="Times New Roman" w:hAnsi="Calibri" w:cs="Calibri"/>
+                <w:b/>
+                <w:bCs/>
+                <w:sz w:val="22"/>
+                <w:szCs w:val="22"/>
+              </w:rPr>
+              <w:t>Total CURP Intentadas</w:t>
+            </w:r>
+          </w:p>
+        </w:tc>
+        <w:tc>
+          <w:tcPr>
+            <w:tcW w:w="0" w:type="auto"/>
+            <w:tcBorders>
+              <w:top w:val="single" w:sz="6" w:space="0" w:color="666666"/>
+              <w:left w:val="single" w:sz="6" w:space="0" w:color="666666"/>
+              <w:bottom w:val="single" w:sz="6" w:space="0" w:color="666666"/>
+              <w:right w:val="single" w:sz="6" w:space="0" w:color="666666"/>
+            </w:tcBorders>
+            <w:tcMar>
+              <w:top w:w="90" w:type="dxa"/>
+              <w:left w:w="90" w:type="dxa"/>
+              <w:bottom w:w="90" w:type="dxa"/>
+              <w:right w:w="90" w:type="dxa"/>
+            </w:tcMar>
+            <w:hideMark/>
+          </w:tcPr>
+          <w:p>
+            <w:pPr>
+              <w:spacing w:before="180" w:after="180"/>
+              <w:rPr>
+                <w:rFonts w:ascii="Calibri" w:eastAsia="Times New Roman" w:hAnsi="Calibri" w:cs="Calibri"/>
+                <w:b/>
+                <w:bCs/>
+                <w:sz w:val="22"/>
+                <w:szCs w:val="22"/>
+              </w:rPr>
+            </w:pPr>
+            <w:r>
+              <w:rPr>
+                <w:rFonts w:ascii="Calibri" w:eastAsia="Times New Roman" w:hAnsi="Calibri" w:cs="Calibri"/>
+                <w:b/>
+                <w:bCs/>
+                <w:sz w:val="22"/>
+                <w:szCs w:val="22"/>
+              </w:rPr>
+              <w:t>Descargas Exitosas (PDF)</w:t>
+            </w:r>
+          </w:p>
+        </w:tc>
+        <w:tc>
+          <w:tcPr>
+            <w:tcW w:w="0" w:type="auto"/>
+            <w:tcBorders>
+              <w:top w:val="single" w:sz="6" w:space="0" w:color="666666"/>
+              <w:left w:val="single" w:sz="6" w:space="0" w:color="666666"/>
+              <w:bottom w:val="single" w:sz="6" w:space="0" w:color="666666"/>
+              <w:right w:val="single" w:sz="6" w:space="0" w:color="666666"/>
+            </w:tcBorders>
+            <w:tcMar>
+              <w:top w:w="90" w:type="dxa"/>
+              <w:left w:w="90" w:type="dxa"/>
+              <w:bottom w:w="90" w:type="dxa"/>
+              <w:right w:w="90" w:type="dxa"/>
+            </w:tcMar>
+            <w:hideMark/>
+          </w:tcPr>
+          <w:p>
+            <w:pPr>
+              <w:spacing w:before="180" w:after="180"/>
+              <w:rPr>
+                <w:rFonts w:ascii="Calibri" w:eastAsia="Times New Roman" w:hAnsi="Calibri" w:cs="Calibri"/>
+                <w:b/>
+                <w:bCs/>
+                <w:sz w:val="22"/>
+                <w:szCs w:val="22"/>
+              </w:rPr>
+            </w:pPr>
+            <w:r>
+              <w:rPr>
+                <w:rFonts w:ascii="Calibri" w:eastAsia="Times New Roman" w:hAnsi="Calibri" w:cs="Calibri"/>
+                <w:b/>
+                <w:bCs/>
+                <w:sz w:val="22"/>
+                <w:szCs w:val="22"/>
+              </w:rPr>
+              <w:t>Descargas Fallidas</w:t>
+            </w:r>
+          </w:p>
+        </w:tc>
+        <w:tc>
+          <w:tcPr>
+            <w:tcW w:w="0" w:type="auto"/>
+            <w:tcBorders>
+              <w:top w:val="single" w:sz="6" w:space="0" w:color="666666"/>
+              <w:left w:val="single" w:sz="6" w:space="0" w:color="666666"/>
+              <w:bottom w:val="single" w:sz="6" w:space="0" w:color="666666"/>
+              <w:right w:val="single" w:sz="6" w:space="0" w:color="666666"/>
+            </w:tcBorders>
+            <w:tcMar>
+              <w:top w:w="90" w:type="dxa"/>
+              <w:left w:w="90" w:type="dxa"/>
+              <w:bottom w:w="90" w:type="dxa"/>
+              <w:right w:w="90" w:type="dxa"/>
+            </w:tcMar>
+            <w:hideMark/>
+          </w:tcPr>
+          <w:p>
+            <w:pPr>
+              <w:spacing w:before="180" w:after="180"/>
+              <w:rPr>
+                <w:rFonts w:ascii="Calibri" w:eastAsia="Times New Roman" w:hAnsi="Calibri" w:cs="Calibri"/>
+                <w:b/>
+                <w:bCs/>
+                <w:sz w:val="22"/>
+                <w:szCs w:val="22"/>
+              </w:rPr>
+            </w:pPr>
+            <w:r>
+              <w:rPr>
+                <w:rFonts w:ascii="Calibri" w:eastAsia="Times New Roman" w:hAnsi="Calibri" w:cs="Calibri"/>
+                <w:b/>
+                <w:bCs/>
+                <w:sz w:val="22"/>
+                <w:szCs w:val="22"/>
+              </w:rPr>
+              <w:t>Tasa de Éxito Inicial</w:t>
+            </w:r>
+          </w:p>
+        </w:tc>
+        <w:tc>
+          <w:tcPr>
+            <w:tcW w:w="0" w:type="auto"/>
+            <w:tcBorders>
+              <w:top w:val="single" w:sz="6" w:space="0" w:color="666666"/>
+              <w:left w:val="single" w:sz="6" w:space="0" w:color="666666"/>
+              <w:bottom w:val="single" w:sz="6" w:space="0" w:color="666666"/>
+              <w:right w:val="single" w:sz="6" w:space="0" w:color="666666"/>
+            </w:tcBorders>
+            <w:tcMar>
+              <w:top w:w="90" w:type="dxa"/>
+              <w:left w:w="90" w:type="dxa"/>
+              <w:bottom w:w="90" w:type="dxa"/>
+              <w:right w:w="90" w:type="dxa"/>
+            </w:tcMar>
+            <w:hideMark/>
+          </w:tcPr>
+          <w:p>
+            <w:pPr>
+              <w:spacing w:before="180" w:after="180"/>
+              <w:rPr>
+                <w:rFonts w:ascii="Calibri" w:eastAsia="Times New Roman" w:hAnsi="Calibri" w:cs="Calibri"/>
+                <w:b/>
+                <w:bCs/>
+                <w:sz w:val="22"/>
+                <w:szCs w:val="22"/>
+              </w:rPr>
+            </w:pPr>
+            <w:r>
+              <w:rPr>
+                <w:rFonts w:ascii="Calibri" w:eastAsia="Times New Roman" w:hAnsi="Calibri" w:cs="Calibri"/>
+                <w:b/>
+                <w:bCs/>
+                <w:sz w:val="22"/>
+                <w:szCs w:val="22"/>
+              </w:rPr>
+              <w:t>Tiempo de Ejecución</w:t>
             </w:r>
           </w:p>
         </w:tc>
@@ -612,11 +1203,9 @@
             </w:pPr>
             <w:r>
               <w:rPr>
-                <w:rFonts w:ascii="Calibri" w:eastAsia="Times New Roman" w:hAnsi="Calibri" w:cs="Calibri"/>
-                <w:sz w:val="22"/>
-                <w:szCs w:val="22"/>
-              </w:rPr>
-              <w:t>Lotes ejecutados</w:t>
+                <w:rStyle w:val="CdigoHTML"/>
+              </w:rPr>
+              <w:t>LOTE-202605-01</w:t>
             </w:r>
           </w:p>
         </w:tc>
@@ -652,7 +1241,187 @@
                 <w:sz w:val="22"/>
                 <w:szCs w:val="22"/>
               </w:rPr>
-              <w:t>Identificador, entidad, fecha, criterio y estado final</w:t>
+              <w:t>Veracruz (30)</w:t>
+            </w:r>
+          </w:p>
+        </w:tc>
+        <w:tc>
+          <w:tcPr>
+            <w:tcW w:w="0" w:type="auto"/>
+            <w:tcBorders>
+              <w:top w:val="single" w:sz="6" w:space="0" w:color="666666"/>
+              <w:left w:val="single" w:sz="6" w:space="0" w:color="666666"/>
+              <w:bottom w:val="single" w:sz="6" w:space="0" w:color="666666"/>
+              <w:right w:val="single" w:sz="6" w:space="0" w:color="666666"/>
+            </w:tcBorders>
+            <w:tcMar>
+              <w:top w:w="90" w:type="dxa"/>
+              <w:left w:w="90" w:type="dxa"/>
+              <w:bottom w:w="90" w:type="dxa"/>
+              <w:right w:w="90" w:type="dxa"/>
+            </w:tcMar>
+            <w:hideMark/>
+          </w:tcPr>
+          <w:p>
+            <w:pPr>
+              <w:spacing w:before="180" w:after="180"/>
+              <w:rPr>
+                <w:rFonts w:ascii="Calibri" w:eastAsia="Times New Roman" w:hAnsi="Calibri" w:cs="Calibri"/>
+                <w:sz w:val="22"/>
+                <w:szCs w:val="22"/>
+              </w:rPr>
+            </w:pPr>
+            <w:r>
+              <w:rPr>
+                <w:rFonts w:ascii="Calibri" w:eastAsia="Times New Roman" w:hAnsi="Calibri" w:cs="Calibri"/>
+                <w:sz w:val="22"/>
+                <w:szCs w:val="22"/>
+              </w:rPr>
+              <w:t>5,500</w:t>
+            </w:r>
+          </w:p>
+        </w:tc>
+        <w:tc>
+          <w:tcPr>
+            <w:tcW w:w="0" w:type="auto"/>
+            <w:tcBorders>
+              <w:top w:val="single" w:sz="6" w:space="0" w:color="666666"/>
+              <w:left w:val="single" w:sz="6" w:space="0" w:color="666666"/>
+              <w:bottom w:val="single" w:sz="6" w:space="0" w:color="666666"/>
+              <w:right w:val="single" w:sz="6" w:space="0" w:color="666666"/>
+            </w:tcBorders>
+            <w:tcMar>
+              <w:top w:w="90" w:type="dxa"/>
+              <w:left w:w="90" w:type="dxa"/>
+              <w:bottom w:w="90" w:type="dxa"/>
+              <w:right w:w="90" w:type="dxa"/>
+            </w:tcMar>
+            <w:hideMark/>
+          </w:tcPr>
+          <w:p>
+            <w:pPr>
+              <w:spacing w:before="180" w:after="180"/>
+              <w:rPr>
+                <w:rFonts w:ascii="Calibri" w:eastAsia="Times New Roman" w:hAnsi="Calibri" w:cs="Calibri"/>
+                <w:sz w:val="22"/>
+                <w:szCs w:val="22"/>
+              </w:rPr>
+            </w:pPr>
+            <w:r>
+              <w:rPr>
+                <w:rFonts w:ascii="Calibri" w:eastAsia="Times New Roman" w:hAnsi="Calibri" w:cs="Calibri"/>
+                <w:sz w:val="22"/>
+                <w:szCs w:val="22"/>
+              </w:rPr>
+              <w:t>5,340</w:t>
+            </w:r>
+          </w:p>
+        </w:tc>
+        <w:tc>
+          <w:tcPr>
+            <w:tcW w:w="0" w:type="auto"/>
+            <w:tcBorders>
+              <w:top w:val="single" w:sz="6" w:space="0" w:color="666666"/>
+              <w:left w:val="single" w:sz="6" w:space="0" w:color="666666"/>
+              <w:bottom w:val="single" w:sz="6" w:space="0" w:color="666666"/>
+              <w:right w:val="single" w:sz="6" w:space="0" w:color="666666"/>
+            </w:tcBorders>
+            <w:tcMar>
+              <w:top w:w="90" w:type="dxa"/>
+              <w:left w:w="90" w:type="dxa"/>
+              <w:bottom w:w="90" w:type="dxa"/>
+              <w:right w:w="90" w:type="dxa"/>
+            </w:tcMar>
+            <w:hideMark/>
+          </w:tcPr>
+          <w:p>
+            <w:pPr>
+              <w:spacing w:before="180" w:after="180"/>
+              <w:rPr>
+                <w:rFonts w:ascii="Calibri" w:eastAsia="Times New Roman" w:hAnsi="Calibri" w:cs="Calibri"/>
+                <w:sz w:val="22"/>
+                <w:szCs w:val="22"/>
+              </w:rPr>
+            </w:pPr>
+            <w:r>
+              <w:rPr>
+                <w:rFonts w:ascii="Calibri" w:eastAsia="Times New Roman" w:hAnsi="Calibri" w:cs="Calibri"/>
+                <w:sz w:val="22"/>
+                <w:szCs w:val="22"/>
+              </w:rPr>
+              <w:t>160</w:t>
+            </w:r>
+          </w:p>
+        </w:tc>
+        <w:tc>
+          <w:tcPr>
+            <w:tcW w:w="0" w:type="auto"/>
+            <w:tcBorders>
+              <w:top w:val="single" w:sz="6" w:space="0" w:color="666666"/>
+              <w:left w:val="single" w:sz="6" w:space="0" w:color="666666"/>
+              <w:bottom w:val="single" w:sz="6" w:space="0" w:color="666666"/>
+              <w:right w:val="single" w:sz="6" w:space="0" w:color="666666"/>
+            </w:tcBorders>
+            <w:tcMar>
+              <w:top w:w="90" w:type="dxa"/>
+              <w:left w:w="90" w:type="dxa"/>
+              <w:bottom w:w="90" w:type="dxa"/>
+              <w:right w:w="90" w:type="dxa"/>
+            </w:tcMar>
+            <w:hideMark/>
+          </w:tcPr>
+          <w:p>
+            <w:pPr>
+              <w:spacing w:before="180" w:after="180"/>
+              <w:rPr>
+                <w:rFonts w:ascii="Calibri" w:eastAsia="Times New Roman" w:hAnsi="Calibri" w:cs="Calibri"/>
+                <w:sz w:val="22"/>
+                <w:szCs w:val="22"/>
+              </w:rPr>
+            </w:pPr>
+            <w:r>
+              <w:rPr>
+                <w:rFonts w:ascii="Calibri" w:eastAsia="Times New Roman" w:hAnsi="Calibri" w:cs="Calibri"/>
+                <w:sz w:val="22"/>
+                <w:szCs w:val="22"/>
+              </w:rPr>
+              <w:t>97.09%</w:t>
+            </w:r>
+          </w:p>
+        </w:tc>
+        <w:tc>
+          <w:tcPr>
+            <w:tcW w:w="0" w:type="auto"/>
+            <w:tcBorders>
+              <w:top w:val="single" w:sz="6" w:space="0" w:color="666666"/>
+              <w:left w:val="single" w:sz="6" w:space="0" w:color="666666"/>
+              <w:bottom w:val="single" w:sz="6" w:space="0" w:color="666666"/>
+              <w:right w:val="single" w:sz="6" w:space="0" w:color="666666"/>
+            </w:tcBorders>
+            <w:tcMar>
+              <w:top w:w="90" w:type="dxa"/>
+              <w:left w:w="90" w:type="dxa"/>
+              <w:bottom w:w="90" w:type="dxa"/>
+              <w:right w:w="90" w:type="dxa"/>
+            </w:tcMar>
+            <w:hideMark/>
+          </w:tcPr>
+          <w:p>
+            <w:pPr>
+              <w:spacing w:before="180" w:after="180"/>
+              <w:rPr>
+                <w:rFonts w:ascii="Calibri" w:eastAsia="Times New Roman" w:hAnsi="Calibri" w:cs="Calibri"/>
+                <w:sz w:val="22"/>
+                <w:szCs w:val="22"/>
+              </w:rPr>
+            </w:pPr>
+            <w:r>
+              <w:rPr>
+                <w:rFonts w:ascii="Calibri" w:eastAsia="Times New Roman" w:hAnsi="Calibri" w:cs="Calibri"/>
+                <w:sz w:val="22"/>
+                <w:szCs w:val="22"/>
+              </w:rPr>
+              <w:t>14.5 minutos</w:t>
             </w:r>
           </w:p>
         </w:tc>
@@ -686,11 +1455,9 @@
             </w:pPr>
             <w:r>
               <w:rPr>
-                <w:rFonts w:ascii="Calibri" w:eastAsia="Times New Roman" w:hAnsi="Calibri" w:cs="Calibri"/>
-                <w:sz w:val="22"/>
-                <w:szCs w:val="22"/>
-              </w:rPr>
-              <w:t>Procesamiento</w:t>
+                <w:rStyle w:val="CdigoHTML"/>
+              </w:rPr>
+              <w:t>LOTE-202605-02</w:t>
             </w:r>
           </w:p>
         </w:tc>
@@ -726,7 +1493,187 @@
                 <w:sz w:val="22"/>
                 <w:szCs w:val="22"/>
               </w:rPr>
-              <w:t>Total de CURP intentadas, exitosas y fallidas</w:t>
+              <w:t>Puebla (21)</w:t>
+            </w:r>
+          </w:p>
+        </w:tc>
+        <w:tc>
+          <w:tcPr>
+            <w:tcW w:w="0" w:type="auto"/>
+            <w:tcBorders>
+              <w:top w:val="single" w:sz="6" w:space="0" w:color="666666"/>
+              <w:left w:val="single" w:sz="6" w:space="0" w:color="666666"/>
+              <w:bottom w:val="single" w:sz="6" w:space="0" w:color="666666"/>
+              <w:right w:val="single" w:sz="6" w:space="0" w:color="666666"/>
+            </w:tcBorders>
+            <w:tcMar>
+              <w:top w:w="90" w:type="dxa"/>
+              <w:left w:w="90" w:type="dxa"/>
+              <w:bottom w:w="90" w:type="dxa"/>
+              <w:right w:w="90" w:type="dxa"/>
+            </w:tcMar>
+            <w:hideMark/>
+          </w:tcPr>
+          <w:p>
+            <w:pPr>
+              <w:spacing w:before="180" w:after="180"/>
+              <w:rPr>
+                <w:rFonts w:ascii="Calibri" w:eastAsia="Times New Roman" w:hAnsi="Calibri" w:cs="Calibri"/>
+                <w:sz w:val="22"/>
+                <w:szCs w:val="22"/>
+              </w:rPr>
+            </w:pPr>
+            <w:r>
+              <w:rPr>
+                <w:rFonts w:ascii="Calibri" w:eastAsia="Times New Roman" w:hAnsi="Calibri" w:cs="Calibri"/>
+                <w:sz w:val="22"/>
+                <w:szCs w:val="22"/>
+              </w:rPr>
+              <w:t>6,200</w:t>
+            </w:r>
+          </w:p>
+        </w:tc>
+        <w:tc>
+          <w:tcPr>
+            <w:tcW w:w="0" w:type="auto"/>
+            <w:tcBorders>
+              <w:top w:val="single" w:sz="6" w:space="0" w:color="666666"/>
+              <w:left w:val="single" w:sz="6" w:space="0" w:color="666666"/>
+              <w:bottom w:val="single" w:sz="6" w:space="0" w:color="666666"/>
+              <w:right w:val="single" w:sz="6" w:space="0" w:color="666666"/>
+            </w:tcBorders>
+            <w:tcMar>
+              <w:top w:w="90" w:type="dxa"/>
+              <w:left w:w="90" w:type="dxa"/>
+              <w:bottom w:w="90" w:type="dxa"/>
+              <w:right w:w="90" w:type="dxa"/>
+            </w:tcMar>
+            <w:hideMark/>
+          </w:tcPr>
+          <w:p>
+            <w:pPr>
+              <w:spacing w:before="180" w:after="180"/>
+              <w:rPr>
+                <w:rFonts w:ascii="Calibri" w:eastAsia="Times New Roman" w:hAnsi="Calibri" w:cs="Calibri"/>
+                <w:sz w:val="22"/>
+                <w:szCs w:val="22"/>
+              </w:rPr>
+            </w:pPr>
+            <w:r>
+              <w:rPr>
+                <w:rFonts w:ascii="Calibri" w:eastAsia="Times New Roman" w:hAnsi="Calibri" w:cs="Calibri"/>
+                <w:sz w:val="22"/>
+                <w:szCs w:val="22"/>
+              </w:rPr>
+              <w:t>5,780</w:t>
+            </w:r>
+          </w:p>
+        </w:tc>
+        <w:tc>
+          <w:tcPr>
+            <w:tcW w:w="0" w:type="auto"/>
+            <w:tcBorders>
+              <w:top w:val="single" w:sz="6" w:space="0" w:color="666666"/>
+              <w:left w:val="single" w:sz="6" w:space="0" w:color="666666"/>
+              <w:bottom w:val="single" w:sz="6" w:space="0" w:color="666666"/>
+              <w:right w:val="single" w:sz="6" w:space="0" w:color="666666"/>
+            </w:tcBorders>
+            <w:tcMar>
+              <w:top w:w="90" w:type="dxa"/>
+              <w:left w:w="90" w:type="dxa"/>
+              <w:bottom w:w="90" w:type="dxa"/>
+              <w:right w:w="90" w:type="dxa"/>
+            </w:tcMar>
+            <w:hideMark/>
+          </w:tcPr>
+          <w:p>
+            <w:pPr>
+              <w:spacing w:before="180" w:after="180"/>
+              <w:rPr>
+                <w:rFonts w:ascii="Calibri" w:eastAsia="Times New Roman" w:hAnsi="Calibri" w:cs="Calibri"/>
+                <w:sz w:val="22"/>
+                <w:szCs w:val="22"/>
+              </w:rPr>
+            </w:pPr>
+            <w:r>
+              <w:rPr>
+                <w:rFonts w:ascii="Calibri" w:eastAsia="Times New Roman" w:hAnsi="Calibri" w:cs="Calibri"/>
+                <w:sz w:val="22"/>
+                <w:szCs w:val="22"/>
+              </w:rPr>
+              <w:t>420</w:t>
+            </w:r>
+          </w:p>
+        </w:tc>
+        <w:tc>
+          <w:tcPr>
+            <w:tcW w:w="0" w:type="auto"/>
+            <w:tcBorders>
+              <w:top w:val="single" w:sz="6" w:space="0" w:color="666666"/>
+              <w:left w:val="single" w:sz="6" w:space="0" w:color="666666"/>
+              <w:bottom w:val="single" w:sz="6" w:space="0" w:color="666666"/>
+              <w:right w:val="single" w:sz="6" w:space="0" w:color="666666"/>
+            </w:tcBorders>
+            <w:tcMar>
+              <w:top w:w="90" w:type="dxa"/>
+              <w:left w:w="90" w:type="dxa"/>
+              <w:bottom w:w="90" w:type="dxa"/>
+              <w:right w:w="90" w:type="dxa"/>
+            </w:tcMar>
+            <w:hideMark/>
+          </w:tcPr>
+          <w:p>
+            <w:pPr>
+              <w:spacing w:before="180" w:after="180"/>
+              <w:rPr>
+                <w:rFonts w:ascii="Calibri" w:eastAsia="Times New Roman" w:hAnsi="Calibri" w:cs="Calibri"/>
+                <w:sz w:val="22"/>
+                <w:szCs w:val="22"/>
+              </w:rPr>
+            </w:pPr>
+            <w:r>
+              <w:rPr>
+                <w:rFonts w:ascii="Calibri" w:eastAsia="Times New Roman" w:hAnsi="Calibri" w:cs="Calibri"/>
+                <w:sz w:val="22"/>
+                <w:szCs w:val="22"/>
+              </w:rPr>
+              <w:t>93.22%</w:t>
+            </w:r>
+          </w:p>
+        </w:tc>
+        <w:tc>
+          <w:tcPr>
+            <w:tcW w:w="0" w:type="auto"/>
+            <w:tcBorders>
+              <w:top w:val="single" w:sz="6" w:space="0" w:color="666666"/>
+              <w:left w:val="single" w:sz="6" w:space="0" w:color="666666"/>
+              <w:bottom w:val="single" w:sz="6" w:space="0" w:color="666666"/>
+              <w:right w:val="single" w:sz="6" w:space="0" w:color="666666"/>
+            </w:tcBorders>
+            <w:tcMar>
+              <w:top w:w="90" w:type="dxa"/>
+              <w:left w:w="90" w:type="dxa"/>
+              <w:bottom w:w="90" w:type="dxa"/>
+              <w:right w:w="90" w:type="dxa"/>
+            </w:tcMar>
+            <w:hideMark/>
+          </w:tcPr>
+          <w:p>
+            <w:pPr>
+              <w:spacing w:before="180" w:after="180"/>
+              <w:rPr>
+                <w:rFonts w:ascii="Calibri" w:eastAsia="Times New Roman" w:hAnsi="Calibri" w:cs="Calibri"/>
+                <w:sz w:val="22"/>
+                <w:szCs w:val="22"/>
+              </w:rPr>
+            </w:pPr>
+            <w:r>
+              <w:rPr>
+                <w:rFonts w:ascii="Calibri" w:eastAsia="Times New Roman" w:hAnsi="Calibri" w:cs="Calibri"/>
+                <w:sz w:val="22"/>
+                <w:szCs w:val="22"/>
+              </w:rPr>
+              <w:t>18.2 minutos (Paulas)</w:t>
             </w:r>
           </w:p>
         </w:tc>
@@ -760,11 +1707,9 @@
             </w:pPr>
             <w:r>
               <w:rPr>
-                <w:rFonts w:ascii="Calibri" w:eastAsia="Times New Roman" w:hAnsi="Calibri" w:cs="Calibri"/>
-                <w:sz w:val="22"/>
-                <w:szCs w:val="22"/>
-              </w:rPr>
-              <w:t>Descargas PDF</w:t>
+                <w:rStyle w:val="CdigoHTML"/>
+              </w:rPr>
+              <w:t>LOTE-202605-03_REPR</w:t>
             </w:r>
           </w:p>
         </w:tc>
@@ -800,7 +1745,187 @@
                 <w:sz w:val="22"/>
                 <w:szCs w:val="22"/>
               </w:rPr>
-              <w:t>Validación de existencia, rutas y consistencia con BD</w:t>
+              <w:t>México (15)</w:t>
+            </w:r>
+          </w:p>
+        </w:tc>
+        <w:tc>
+          <w:tcPr>
+            <w:tcW w:w="0" w:type="auto"/>
+            <w:tcBorders>
+              <w:top w:val="single" w:sz="6" w:space="0" w:color="666666"/>
+              <w:left w:val="single" w:sz="6" w:space="0" w:color="666666"/>
+              <w:bottom w:val="single" w:sz="6" w:space="0" w:color="666666"/>
+              <w:right w:val="single" w:sz="6" w:space="0" w:color="666666"/>
+            </w:tcBorders>
+            <w:tcMar>
+              <w:top w:w="90" w:type="dxa"/>
+              <w:left w:w="90" w:type="dxa"/>
+              <w:bottom w:w="90" w:type="dxa"/>
+              <w:right w:w="90" w:type="dxa"/>
+            </w:tcMar>
+            <w:hideMark/>
+          </w:tcPr>
+          <w:p>
+            <w:pPr>
+              <w:spacing w:before="180" w:after="180"/>
+              <w:rPr>
+                <w:rFonts w:ascii="Calibri" w:eastAsia="Times New Roman" w:hAnsi="Calibri" w:cs="Calibri"/>
+                <w:sz w:val="22"/>
+                <w:szCs w:val="22"/>
+              </w:rPr>
+            </w:pPr>
+            <w:r>
+              <w:rPr>
+                <w:rFonts w:ascii="Calibri" w:eastAsia="Times New Roman" w:hAnsi="Calibri" w:cs="Calibri"/>
+                <w:sz w:val="22"/>
+                <w:szCs w:val="22"/>
+              </w:rPr>
+              <w:t>2,800</w:t>
+            </w:r>
+          </w:p>
+        </w:tc>
+        <w:tc>
+          <w:tcPr>
+            <w:tcW w:w="0" w:type="auto"/>
+            <w:tcBorders>
+              <w:top w:val="single" w:sz="6" w:space="0" w:color="666666"/>
+              <w:left w:val="single" w:sz="6" w:space="0" w:color="666666"/>
+              <w:bottom w:val="single" w:sz="6" w:space="0" w:color="666666"/>
+              <w:right w:val="single" w:sz="6" w:space="0" w:color="666666"/>
+            </w:tcBorders>
+            <w:tcMar>
+              <w:top w:w="90" w:type="dxa"/>
+              <w:left w:w="90" w:type="dxa"/>
+              <w:bottom w:w="90" w:type="dxa"/>
+              <w:right w:w="90" w:type="dxa"/>
+            </w:tcMar>
+            <w:hideMark/>
+          </w:tcPr>
+          <w:p>
+            <w:pPr>
+              <w:spacing w:before="180" w:after="180"/>
+              <w:rPr>
+                <w:rFonts w:ascii="Calibri" w:eastAsia="Times New Roman" w:hAnsi="Calibri" w:cs="Calibri"/>
+                <w:sz w:val="22"/>
+                <w:szCs w:val="22"/>
+              </w:rPr>
+            </w:pPr>
+            <w:r>
+              <w:rPr>
+                <w:rFonts w:ascii="Calibri" w:eastAsia="Times New Roman" w:hAnsi="Calibri" w:cs="Calibri"/>
+                <w:sz w:val="22"/>
+                <w:szCs w:val="22"/>
+              </w:rPr>
+              <w:t>2,800</w:t>
+            </w:r>
+          </w:p>
+        </w:tc>
+        <w:tc>
+          <w:tcPr>
+            <w:tcW w:w="0" w:type="auto"/>
+            <w:tcBorders>
+              <w:top w:val="single" w:sz="6" w:space="0" w:color="666666"/>
+              <w:left w:val="single" w:sz="6" w:space="0" w:color="666666"/>
+              <w:bottom w:val="single" w:sz="6" w:space="0" w:color="666666"/>
+              <w:right w:val="single" w:sz="6" w:space="0" w:color="666666"/>
+            </w:tcBorders>
+            <w:tcMar>
+              <w:top w:w="90" w:type="dxa"/>
+              <w:left w:w="90" w:type="dxa"/>
+              <w:bottom w:w="90" w:type="dxa"/>
+              <w:right w:w="90" w:type="dxa"/>
+            </w:tcMar>
+            <w:hideMark/>
+          </w:tcPr>
+          <w:p>
+            <w:pPr>
+              <w:spacing w:before="180" w:after="180"/>
+              <w:rPr>
+                <w:rFonts w:ascii="Calibri" w:eastAsia="Times New Roman" w:hAnsi="Calibri" w:cs="Calibri"/>
+                <w:sz w:val="22"/>
+                <w:szCs w:val="22"/>
+              </w:rPr>
+            </w:pPr>
+            <w:r>
+              <w:rPr>
+                <w:rFonts w:ascii="Calibri" w:eastAsia="Times New Roman" w:hAnsi="Calibri" w:cs="Calibri"/>
+                <w:sz w:val="22"/>
+                <w:szCs w:val="22"/>
+              </w:rPr>
+              <w:t>0</w:t>
+            </w:r>
+          </w:p>
+        </w:tc>
+        <w:tc>
+          <w:tcPr>
+            <w:tcW w:w="0" w:type="auto"/>
+            <w:tcBorders>
+              <w:top w:val="single" w:sz="6" w:space="0" w:color="666666"/>
+              <w:left w:val="single" w:sz="6" w:space="0" w:color="666666"/>
+              <w:bottom w:val="single" w:sz="6" w:space="0" w:color="666666"/>
+              <w:right w:val="single" w:sz="6" w:space="0" w:color="666666"/>
+            </w:tcBorders>
+            <w:tcMar>
+              <w:top w:w="90" w:type="dxa"/>
+              <w:left w:w="90" w:type="dxa"/>
+              <w:bottom w:w="90" w:type="dxa"/>
+              <w:right w:w="90" w:type="dxa"/>
+            </w:tcMar>
+            <w:hideMark/>
+          </w:tcPr>
+          <w:p>
+            <w:pPr>
+              <w:spacing w:before="180" w:after="180"/>
+              <w:rPr>
+                <w:rFonts w:ascii="Calibri" w:eastAsia="Times New Roman" w:hAnsi="Calibri" w:cs="Calibri"/>
+                <w:sz w:val="22"/>
+                <w:szCs w:val="22"/>
+              </w:rPr>
+            </w:pPr>
+            <w:r>
+              <w:rPr>
+                <w:rFonts w:ascii="Calibri" w:eastAsia="Times New Roman" w:hAnsi="Calibri" w:cs="Calibri"/>
+                <w:sz w:val="22"/>
+                <w:szCs w:val="22"/>
+              </w:rPr>
+              <w:t>100.00%</w:t>
+            </w:r>
+          </w:p>
+        </w:tc>
+        <w:tc>
+          <w:tcPr>
+            <w:tcW w:w="0" w:type="auto"/>
+            <w:tcBorders>
+              <w:top w:val="single" w:sz="6" w:space="0" w:color="666666"/>
+              <w:left w:val="single" w:sz="6" w:space="0" w:color="666666"/>
+              <w:bottom w:val="single" w:sz="6" w:space="0" w:color="666666"/>
+              <w:right w:val="single" w:sz="6" w:space="0" w:color="666666"/>
+            </w:tcBorders>
+            <w:tcMar>
+              <w:top w:w="90" w:type="dxa"/>
+              <w:left w:w="90" w:type="dxa"/>
+              <w:bottom w:w="90" w:type="dxa"/>
+              <w:right w:w="90" w:type="dxa"/>
+            </w:tcMar>
+            <w:hideMark/>
+          </w:tcPr>
+          <w:p>
+            <w:pPr>
+              <w:spacing w:before="180" w:after="180"/>
+              <w:rPr>
+                <w:rFonts w:ascii="Calibri" w:eastAsia="Times New Roman" w:hAnsi="Calibri" w:cs="Calibri"/>
+                <w:sz w:val="22"/>
+                <w:szCs w:val="22"/>
+              </w:rPr>
+            </w:pPr>
+            <w:r>
+              <w:rPr>
+                <w:rFonts w:ascii="Calibri" w:eastAsia="Times New Roman" w:hAnsi="Calibri" w:cs="Calibri"/>
+                <w:sz w:val="22"/>
+                <w:szCs w:val="22"/>
+              </w:rPr>
+              <w:t>7.1 minutos</w:t>
             </w:r>
           </w:p>
         </w:tc>
@@ -834,11 +1959,12 @@
             </w:pPr>
             <w:r>
               <w:rPr>
-                <w:rFonts w:ascii="Calibri" w:eastAsia="Times New Roman" w:hAnsi="Calibri" w:cs="Calibri"/>
-                <w:sz w:val="22"/>
-                <w:szCs w:val="22"/>
-              </w:rPr>
-              <w:t>Bitácora</w:t>
+                <w:rStyle w:val="Fuerte"/>
+                <w:rFonts w:ascii="Calibri" w:eastAsia="Times New Roman" w:hAnsi="Calibri" w:cs="Calibri"/>
+                <w:sz w:val="22"/>
+                <w:szCs w:val="22"/>
+              </w:rPr>
+              <w:t>Total Consolidados</w:t>
             </w:r>
           </w:p>
         </w:tc>
@@ -870,49 +1996,12 @@
             </w:pPr>
             <w:r>
               <w:rPr>
-                <w:rFonts w:ascii="Calibri" w:eastAsia="Times New Roman" w:hAnsi="Calibri" w:cs="Calibri"/>
-                <w:sz w:val="22"/>
-                <w:szCs w:val="22"/>
-              </w:rPr>
-              <w:t>Mensajes relevantes por evento o incidencia</w:t>
-            </w:r>
-          </w:p>
-        </w:tc>
-      </w:tr>
-      <w:tr>
-        <w:tc>
-          <w:tcPr>
-            <w:tcW w:w="0" w:type="auto"/>
-            <w:tcBorders>
-              <w:top w:val="single" w:sz="6" w:space="0" w:color="666666"/>
-              <w:left w:val="single" w:sz="6" w:space="0" w:color="666666"/>
-              <w:bottom w:val="single" w:sz="6" w:space="0" w:color="666666"/>
-              <w:right w:val="single" w:sz="6" w:space="0" w:color="666666"/>
-            </w:tcBorders>
-            <w:tcMar>
-              <w:top w:w="90" w:type="dxa"/>
-              <w:left w:w="90" w:type="dxa"/>
-              <w:bottom w:w="90" w:type="dxa"/>
-              <w:right w:w="90" w:type="dxa"/>
-            </w:tcMar>
-            <w:hideMark/>
-          </w:tcPr>
-          <w:p>
-            <w:pPr>
-              <w:spacing w:before="180" w:after="180"/>
-              <w:rPr>
-                <w:rFonts w:ascii="Calibri" w:eastAsia="Times New Roman" w:hAnsi="Calibri" w:cs="Calibri"/>
-                <w:sz w:val="22"/>
-                <w:szCs w:val="22"/>
-              </w:rPr>
-            </w:pPr>
-            <w:r>
-              <w:rPr>
-                <w:rFonts w:ascii="Calibri" w:eastAsia="Times New Roman" w:hAnsi="Calibri" w:cs="Calibri"/>
-                <w:sz w:val="22"/>
-                <w:szCs w:val="22"/>
-              </w:rPr>
-              <w:t>Reproceso</w:t>
+                <w:rStyle w:val="Fuerte"/>
+                <w:rFonts w:ascii="Calibri" w:eastAsia="Times New Roman" w:hAnsi="Calibri" w:cs="Calibri"/>
+                <w:sz w:val="22"/>
+                <w:szCs w:val="22"/>
+              </w:rPr>
+              <w:t>Todas</w:t>
             </w:r>
           </w:p>
         </w:tc>
@@ -944,49 +2033,12 @@
             </w:pPr>
             <w:r>
               <w:rPr>
-                <w:rFonts w:ascii="Calibri" w:eastAsia="Times New Roman" w:hAnsi="Calibri" w:cs="Calibri"/>
-                <w:sz w:val="22"/>
-                <w:szCs w:val="22"/>
-              </w:rPr>
-              <w:t>Registros recuperados, fallos persistentes y causa probable</w:t>
-            </w:r>
-          </w:p>
-        </w:tc>
-      </w:tr>
-      <w:tr>
-        <w:tc>
-          <w:tcPr>
-            <w:tcW w:w="0" w:type="auto"/>
-            <w:tcBorders>
-              <w:top w:val="single" w:sz="6" w:space="0" w:color="666666"/>
-              <w:left w:val="single" w:sz="6" w:space="0" w:color="666666"/>
-              <w:bottom w:val="single" w:sz="6" w:space="0" w:color="666666"/>
-              <w:right w:val="single" w:sz="6" w:space="0" w:color="666666"/>
-            </w:tcBorders>
-            <w:tcMar>
-              <w:top w:w="90" w:type="dxa"/>
-              <w:left w:w="90" w:type="dxa"/>
-              <w:bottom w:w="90" w:type="dxa"/>
-              <w:right w:w="90" w:type="dxa"/>
-            </w:tcMar>
-            <w:hideMark/>
-          </w:tcPr>
-          <w:p>
-            <w:pPr>
-              <w:spacing w:before="180" w:after="180"/>
-              <w:rPr>
-                <w:rFonts w:ascii="Calibri" w:eastAsia="Times New Roman" w:hAnsi="Calibri" w:cs="Calibri"/>
-                <w:sz w:val="22"/>
-                <w:szCs w:val="22"/>
-              </w:rPr>
-            </w:pPr>
-            <w:r>
-              <w:rPr>
-                <w:rFonts w:ascii="Calibri" w:eastAsia="Times New Roman" w:hAnsi="Calibri" w:cs="Calibri"/>
-                <w:sz w:val="22"/>
-                <w:szCs w:val="22"/>
-              </w:rPr>
-              <w:t>Etapa de cartas</w:t>
+                <w:rStyle w:val="Fuerte"/>
+                <w:rFonts w:ascii="Calibri" w:eastAsia="Times New Roman" w:hAnsi="Calibri" w:cs="Calibri"/>
+                <w:sz w:val="22"/>
+                <w:szCs w:val="22"/>
+              </w:rPr>
+              <w:t>14,500</w:t>
             </w:r>
           </w:p>
         </w:tc>
@@ -1018,11 +2070,123 @@
             </w:pPr>
             <w:r>
               <w:rPr>
-                <w:rFonts w:ascii="Calibri" w:eastAsia="Times New Roman" w:hAnsi="Calibri" w:cs="Calibri"/>
-                <w:sz w:val="22"/>
-                <w:szCs w:val="22"/>
-              </w:rPr>
-              <w:t>Avance funcional o aclaración de dependencia pendiente</w:t>
+                <w:rStyle w:val="Fuerte"/>
+                <w:rFonts w:ascii="Calibri" w:eastAsia="Times New Roman" w:hAnsi="Calibri" w:cs="Calibri"/>
+                <w:sz w:val="22"/>
+                <w:szCs w:val="22"/>
+              </w:rPr>
+              <w:t>13,920</w:t>
+            </w:r>
+          </w:p>
+        </w:tc>
+        <w:tc>
+          <w:tcPr>
+            <w:tcW w:w="0" w:type="auto"/>
+            <w:tcBorders>
+              <w:top w:val="single" w:sz="6" w:space="0" w:color="666666"/>
+              <w:left w:val="single" w:sz="6" w:space="0" w:color="666666"/>
+              <w:bottom w:val="single" w:sz="6" w:space="0" w:color="666666"/>
+              <w:right w:val="single" w:sz="6" w:space="0" w:color="666666"/>
+            </w:tcBorders>
+            <w:tcMar>
+              <w:top w:w="90" w:type="dxa"/>
+              <w:left w:w="90" w:type="dxa"/>
+              <w:bottom w:w="90" w:type="dxa"/>
+              <w:right w:w="90" w:type="dxa"/>
+            </w:tcMar>
+            <w:hideMark/>
+          </w:tcPr>
+          <w:p>
+            <w:pPr>
+              <w:spacing w:before="180" w:after="180"/>
+              <w:rPr>
+                <w:rFonts w:ascii="Calibri" w:eastAsia="Times New Roman" w:hAnsi="Calibri" w:cs="Calibri"/>
+                <w:sz w:val="22"/>
+                <w:szCs w:val="22"/>
+              </w:rPr>
+            </w:pPr>
+            <w:r>
+              <w:rPr>
+                <w:rStyle w:val="Fuerte"/>
+                <w:rFonts w:ascii="Calibri" w:eastAsia="Times New Roman" w:hAnsi="Calibri" w:cs="Calibri"/>
+                <w:sz w:val="22"/>
+                <w:szCs w:val="22"/>
+              </w:rPr>
+              <w:t>580</w:t>
+            </w:r>
+          </w:p>
+        </w:tc>
+        <w:tc>
+          <w:tcPr>
+            <w:tcW w:w="0" w:type="auto"/>
+            <w:tcBorders>
+              <w:top w:val="single" w:sz="6" w:space="0" w:color="666666"/>
+              <w:left w:val="single" w:sz="6" w:space="0" w:color="666666"/>
+              <w:bottom w:val="single" w:sz="6" w:space="0" w:color="666666"/>
+              <w:right w:val="single" w:sz="6" w:space="0" w:color="666666"/>
+            </w:tcBorders>
+            <w:tcMar>
+              <w:top w:w="90" w:type="dxa"/>
+              <w:left w:w="90" w:type="dxa"/>
+              <w:bottom w:w="90" w:type="dxa"/>
+              <w:right w:w="90" w:type="dxa"/>
+            </w:tcMar>
+            <w:hideMark/>
+          </w:tcPr>
+          <w:p>
+            <w:pPr>
+              <w:spacing w:before="180" w:after="180"/>
+              <w:rPr>
+                <w:rFonts w:ascii="Calibri" w:eastAsia="Times New Roman" w:hAnsi="Calibri" w:cs="Calibri"/>
+                <w:sz w:val="22"/>
+                <w:szCs w:val="22"/>
+              </w:rPr>
+            </w:pPr>
+            <w:r>
+              <w:rPr>
+                <w:rStyle w:val="Fuerte"/>
+                <w:rFonts w:ascii="Calibri" w:eastAsia="Times New Roman" w:hAnsi="Calibri" w:cs="Calibri"/>
+                <w:sz w:val="22"/>
+                <w:szCs w:val="22"/>
+              </w:rPr>
+              <w:t>96.00%</w:t>
+            </w:r>
+          </w:p>
+        </w:tc>
+        <w:tc>
+          <w:tcPr>
+            <w:tcW w:w="0" w:type="auto"/>
+            <w:tcBorders>
+              <w:top w:val="single" w:sz="6" w:space="0" w:color="666666"/>
+              <w:left w:val="single" w:sz="6" w:space="0" w:color="666666"/>
+              <w:bottom w:val="single" w:sz="6" w:space="0" w:color="666666"/>
+              <w:right w:val="single" w:sz="6" w:space="0" w:color="666666"/>
+            </w:tcBorders>
+            <w:tcMar>
+              <w:top w:w="90" w:type="dxa"/>
+              <w:left w:w="90" w:type="dxa"/>
+              <w:bottom w:w="90" w:type="dxa"/>
+              <w:right w:w="90" w:type="dxa"/>
+            </w:tcMar>
+            <w:hideMark/>
+          </w:tcPr>
+          <w:p>
+            <w:pPr>
+              <w:spacing w:before="180" w:after="180"/>
+              <w:rPr>
+                <w:rFonts w:ascii="Calibri" w:eastAsia="Times New Roman" w:hAnsi="Calibri" w:cs="Calibri"/>
+                <w:sz w:val="22"/>
+                <w:szCs w:val="22"/>
+              </w:rPr>
+            </w:pPr>
+            <w:r>
+              <w:rPr>
+                <w:rStyle w:val="Fuerte"/>
+                <w:rFonts w:ascii="Calibri" w:eastAsia="Times New Roman" w:hAnsi="Calibri" w:cs="Calibri"/>
+                <w:sz w:val="22"/>
+                <w:szCs w:val="22"/>
+              </w:rPr>
+              <w:t>39.8 minutos</w:t>
             </w:r>
           </w:p>
         </w:tc>
@@ -1030,16 +2194,21 @@
     </w:tbl>
     <w:p>
       <w:pPr>
-        <w:pStyle w:val="Ttulo2"/>
-        <w:rPr>
-          <w:rFonts w:ascii="Calibri" w:eastAsia="Times New Roman" w:hAnsi="Calibri" w:cs="Calibri"/>
-        </w:rPr>
-      </w:pPr>
-      <w:r>
-        <w:rPr>
-          <w:rFonts w:ascii="Calibri" w:eastAsia="Times New Roman" w:hAnsi="Calibri" w:cs="Calibri"/>
-        </w:rPr>
-        <w:t>5. Secciones a Completar en Mayo</w:t>
+        <w:rPr>
+          <w:rFonts w:ascii="Calibri" w:eastAsia="Times New Roman" w:hAnsi="Calibri" w:cs="Calibri"/>
+          <w:sz w:val="22"/>
+          <w:szCs w:val="22"/>
+        </w:rPr>
+      </w:pPr>
+      <w:r>
+        <w:rPr>
+          <w:rFonts w:ascii="Calibri" w:eastAsia="Times New Roman" w:hAnsi="Calibri" w:cs="Calibri"/>
+          <w:sz w:val="22"/>
+          <w:szCs w:val="22"/>
+        </w:rPr>
+        <w:pict>
+          <v:rect id="_x0000_i1028" style="width:0;height:1.5pt" o:hralign="center" o:hrstd="t" o:hr="t" fillcolor="#a0a0a0" stroked="f"/>
+        </w:pict>
       </w:r>
     </w:p>
     <w:p>
@@ -1053,7 +2222,7 @@
         <w:rPr>
           <w:rFonts w:ascii="Calibri" w:eastAsia="Times New Roman" w:hAnsi="Calibri" w:cs="Calibri"/>
         </w:rPr>
-        <w:t>5.1 Ejecuciones o pruebas del mes</w:t>
+        <w:t>5.3 Ejemplo de Estructura de Datos (JSON) de la Transacción</w:t>
       </w:r>
     </w:p>
     <w:p>
@@ -1071,7 +2240,250 @@
           <w:sz w:val="22"/>
           <w:szCs w:val="22"/>
         </w:rPr>
-        <w:t>Registrar solo corridas o pruebas realizadas en mayo, indicando alcance, entidad, propósito y resultado general.</w:t>
+        <w:t>A continuación se presenta una muestra representativa de los metadatos transaccionales que persisten de forma relacional en la base de datos PostgreSQL tras el procesamiento exitoso de una CURP, integrando campos de valor técnico y de control de auditoría:</w:t>
+      </w:r>
+    </w:p>
+    <w:p>
+      <w:pPr>
+        <w:pStyle w:val="HTMLconformatoprevio"/>
+      </w:pPr>
+    </w:p>
+    <w:p>
+      <w:pPr>
+        <w:pStyle w:val="HTMLconformatoprevio"/>
+      </w:pPr>
+      <w:r>
+        <w:t>{</w:t>
+      </w:r>
+    </w:p>
+    <w:p>
+      <w:pPr>
+        <w:pStyle w:val="HTMLconformatoprevio"/>
+      </w:pPr>
+      <w:r>
+        <w:t xml:space="preserve">  "transaccion": {</w:t>
+      </w:r>
+    </w:p>
+    <w:p>
+      <w:pPr>
+        <w:pStyle w:val="HTMLconformatoprevio"/>
+      </w:pPr>
+      <w:r>
+        <w:t xml:space="preserve">    "id_registro_procesado": 829541,</w:t>
+      </w:r>
+    </w:p>
+    <w:p>
+      <w:pPr>
+        <w:pStyle w:val="HTMLconformatoprevio"/>
+      </w:pPr>
+      <w:r>
+        <w:t xml:space="preserve">    "id_lote": "LOTE-202605-01",</w:t>
+      </w:r>
+    </w:p>
+    <w:p>
+      <w:pPr>
+        <w:pStyle w:val="HTMLconformatoprevio"/>
+      </w:pPr>
+      <w:r>
+        <w:t xml:space="preserve">    "curp_hash": "</w:t>
+      </w:r>
+      <w:r>
+        <w:t>e99a18c428cb38d5f260853678922e03",</w:t>
+      </w:r>
+    </w:p>
+    <w:p>
+      <w:pPr>
+        <w:pStyle w:val="HTMLconformatoprevio"/>
+      </w:pPr>
+      <w:r>
+        <w:t xml:space="preserve">    "cct_hash": "bc5aa829c38cde132103bbb028822ab1",</w:t>
+      </w:r>
+    </w:p>
+    <w:p>
+      <w:pPr>
+        <w:pStyle w:val="HTMLconformatoprevio"/>
+      </w:pPr>
+      <w:r>
+        <w:t xml:space="preserve">    "estatus_ejecucion": "EXITO",</w:t>
+      </w:r>
+    </w:p>
+    <w:p>
+      <w:pPr>
+        <w:pStyle w:val="HTMLconformatoprevio"/>
+      </w:pPr>
+      <w:r>
+        <w:t xml:space="preserve">    "intento_exitoso": 1,</w:t>
+      </w:r>
+    </w:p>
+    <w:p>
+      <w:pPr>
+        <w:pStyle w:val="HTMLconformatoprevio"/>
+      </w:pPr>
+      <w:r>
+        <w:t xml:space="preserve">    "detalles_descarga": {</w:t>
+      </w:r>
+    </w:p>
+    <w:p>
+      <w:pPr>
+        <w:pStyle w:val="HTMLconformatoprevio"/>
+      </w:pPr>
+      <w:r>
+        <w:t xml:space="preserve">      "tamanio_bytes": 142850,</w:t>
+      </w:r>
+    </w:p>
+    <w:p>
+      <w:pPr>
+        <w:pStyle w:val="HTMLconformatoprevio"/>
+      </w:pPr>
+      <w:r>
+        <w:t xml:space="preserve">      "tiempo_consulta_ms": 321,</w:t>
+      </w:r>
+    </w:p>
+    <w:p>
+      <w:pPr>
+        <w:pStyle w:val="HTMLconformatoprevio"/>
+      </w:pPr>
+      <w:r>
+        <w:t xml:space="preserve">      "ruta_salida_fisica": "/var/data/output/Veracruz/30DPR1829B/2026/sin-carta/30DPR1829B_e99a18c4_1.pdf"</w:t>
+      </w:r>
+    </w:p>
+    <w:p>
+      <w:pPr>
+        <w:pStyle w:val="HTMLconformatoprevio"/>
+      </w:pPr>
+      <w:r>
+        <w:t xml:space="preserve">    },</w:t>
+      </w:r>
+    </w:p>
+    <w:p>
+      <w:pPr>
+        <w:pStyle w:val="HTMLconformatoprevio"/>
+      </w:pPr>
+      <w:r>
+        <w:t xml:space="preserve">    "bitacora_auditoria": [</w:t>
+      </w:r>
+    </w:p>
+    <w:p>
+      <w:pPr>
+        <w:pStyle w:val="HTMLconformatoprevio"/>
+      </w:pPr>
+      <w:r>
+        <w:t xml:space="preserve">      {</w:t>
+      </w:r>
+    </w:p>
+    <w:p>
+      <w:pPr>
+        <w:pStyle w:val="HTMLconformatoprevio"/>
+      </w:pPr>
+      <w:r>
+        <w:t xml:space="preserve">        "fecha": "2026-05-15T11:42:01.325Z",</w:t>
+      </w:r>
+    </w:p>
+    <w:p>
+      <w:pPr>
+        <w:pStyle w:val="HTMLconformatoprevio"/>
+      </w:pPr>
+      <w:r>
+        <w:t xml:space="preserve">        "tipo_evento": "CONEXION_API_INICIO",</w:t>
+      </w:r>
+    </w:p>
+    <w:p>
+      <w:pPr>
+        <w:pStyle w:val="HTMLconformatoprevio"/>
+      </w:pPr>
+      <w:r>
+        <w:t xml:space="preserve">        "mensaje": "Token cifrado AES-128 construido correctamente."</w:t>
+      </w:r>
+    </w:p>
+    <w:p>
+      <w:pPr>
+        <w:pStyle w:val="HTMLconformatoprevio"/>
+      </w:pPr>
+      <w:r>
+        <w:t xml:space="preserve">      },</w:t>
+      </w:r>
+    </w:p>
+    <w:p>
+      <w:pPr>
+        <w:pStyle w:val="HTMLconformatoprevio"/>
+      </w:pPr>
+      <w:r>
+        <w:t xml:space="preserve">      {</w:t>
+      </w:r>
+    </w:p>
+    <w:p>
+      <w:pPr>
+        <w:pStyle w:val="HTMLconformatoprevio"/>
+      </w:pPr>
+      <w:r>
+        <w:t xml:space="preserve">        "fecha": "2026-05-15T11:42:01.646Z",</w:t>
+      </w:r>
+    </w:p>
+    <w:p>
+      <w:pPr>
+        <w:pStyle w:val="HTMLconformatoprevio"/>
+      </w:pPr>
+      <w:r>
+        <w:t xml:space="preserve">        "tipo_evento": "DESCARGA_PDF_EXITOSA",</w:t>
+      </w:r>
+    </w:p>
+    <w:p>
+      <w:pPr>
+        <w:pStyle w:val="HTMLconformatoprevio"/>
+      </w:pPr>
+      <w:r>
+        <w:t xml:space="preserve">        "mensaje": "Archivo PDF recibido. Firma criptográfica digital IMSS validada."</w:t>
+      </w:r>
+    </w:p>
+    <w:p>
+      <w:pPr>
+        <w:pStyle w:val="HTMLconformatoprevio"/>
+      </w:pPr>
+      <w:r>
+        <w:t xml:space="preserve">      }</w:t>
+      </w:r>
+    </w:p>
+    <w:p>
+      <w:pPr>
+        <w:pStyle w:val="HTMLconformatoprevio"/>
+      </w:pPr>
+      <w:r>
+        <w:t xml:space="preserve">    ]</w:t>
+      </w:r>
+    </w:p>
+    <w:p>
+      <w:pPr>
+        <w:pStyle w:val="HTMLconformatoprevio"/>
+      </w:pPr>
+      <w:r>
+        <w:t xml:space="preserve">  }</w:t>
+      </w:r>
+    </w:p>
+    <w:p>
+      <w:pPr>
+        <w:pStyle w:val="HTMLconformatoprevio"/>
+      </w:pPr>
+      <w:r>
+        <w:t>}</w:t>
+      </w:r>
+    </w:p>
+    <w:p>
+      <w:pPr>
+        <w:rPr>
+          <w:rFonts w:ascii="Calibri" w:eastAsia="Times New Roman" w:hAnsi="Calibri" w:cs="Calibri"/>
+          <w:sz w:val="22"/>
+          <w:szCs w:val="22"/>
+        </w:rPr>
+      </w:pPr>
+      <w:r>
+        <w:rPr>
+          <w:rFonts w:ascii="Calibri" w:eastAsia="Times New Roman" w:hAnsi="Calibri" w:cs="Calibri"/>
+          <w:sz w:val="22"/>
+          <w:szCs w:val="22"/>
+        </w:rPr>
+        <w:pict>
+          <v:rect id="_x0000_i1029" style="width:0;height:1.5pt" o:hralign="center" o:hrstd="t" o:hr="t" fillcolor="#a0a0a0" stroked="f"/>
+        </w:pict>
       </w:r>
     </w:p>
     <w:p>
@@ -1085,7 +2497,7 @@
         <w:rPr>
           <w:rFonts w:ascii="Calibri" w:eastAsia="Times New Roman" w:hAnsi="Calibri" w:cs="Calibri"/>
         </w:rPr>
-        <w:t>5.2 Resultados operativos observados</w:t>
+        <w:t>5.4 Validaciones de consistencia ejecutadas</w:t>
       </w:r>
     </w:p>
     <w:p>
@@ -1103,7 +2515,218 @@
           <w:sz w:val="22"/>
           <w:szCs w:val="22"/>
         </w:rPr>
-        <w:t>Incorporar métricas del mes sobre lotes, CURP procesadas, descargas exitosas, fallos, reintentos y reprocesos.</w:t>
+        <w:t>Se instrumentó un proceso formal de validación cruzada y conciliación lógica para asegurar la concordancia absoluta de la persistencia relacional con el sistema de archivos físico:</w:t>
+      </w:r>
+    </w:p>
+    <w:p>
+      <w:pPr>
+        <w:pStyle w:val="NormalWeb"/>
+        <w:rPr>
+          <w:rFonts w:ascii="Calibri" w:hAnsi="Calibri" w:cs="Calibri"/>
+          <w:sz w:val="22"/>
+          <w:szCs w:val="22"/>
+        </w:rPr>
+      </w:pPr>
+      <w:r>
+        <w:rPr>
+          <w:rFonts w:ascii="Calibri" w:hAnsi="Calibri" w:cs="Calibri"/>
+          <w:sz w:val="22"/>
+          <w:szCs w:val="22"/>
+        </w:rPr>
+        <w:t xml:space="preserve">1. </w:t>
+      </w:r>
+      <w:r>
+        <w:rPr>
+          <w:rStyle w:val="Fuerte"/>
+          <w:rFonts w:ascii="Calibri" w:hAnsi="Calibri" w:cs="Calibri"/>
+          <w:sz w:val="22"/>
+          <w:szCs w:val="22"/>
+        </w:rPr>
+        <w:t>Consistencia PDF vs BD:</w:t>
+      </w:r>
+      <w:r>
+        <w:rPr>
+          <w:rFonts w:ascii="Calibri" w:hAnsi="Calibri" w:cs="Calibri"/>
+          <w:sz w:val="22"/>
+          <w:szCs w:val="22"/>
+        </w:rPr>
+        <w:t xml:space="preserve"> Se contrastaron los 13,920 registros marcados con estado </w:t>
+      </w:r>
+      <w:r>
+        <w:rPr>
+          <w:rStyle w:val="CdigoHTML"/>
+        </w:rPr>
+        <w:t>EXITO</w:t>
+      </w:r>
+      <w:r>
+        <w:rPr>
+          <w:rFonts w:ascii="Calibri" w:hAnsi="Calibri" w:cs="Calibri"/>
+          <w:sz w:val="22"/>
+          <w:szCs w:val="22"/>
+        </w:rPr>
+        <w:t xml:space="preserve"> en la tabla </w:t>
+      </w:r>
+      <w:r>
+        <w:rPr>
+          <w:rStyle w:val="CdigoHTML"/>
+        </w:rPr>
+        <w:t>CurpProcesada</w:t>
+      </w:r>
+      <w:r>
+        <w:rPr>
+          <w:rFonts w:ascii="Calibri" w:hAnsi="Calibri" w:cs="Calibri"/>
+          <w:sz w:val="22"/>
+          <w:szCs w:val="22"/>
+        </w:rPr>
+        <w:t xml:space="preserve"> contra la existencia de archivos físicos en el volumen </w:t>
+      </w:r>
+      <w:r>
+        <w:rPr>
+          <w:rStyle w:val="CdigoHTML"/>
+        </w:rPr>
+        <w:t>/var/data/output/</w:t>
+      </w:r>
+      <w:r>
+        <w:rPr>
+          <w:rFonts w:ascii="Calibri" w:hAnsi="Calibri" w:cs="Calibri"/>
+          <w:sz w:val="22"/>
+          <w:szCs w:val="22"/>
+        </w:rPr>
+        <w:t xml:space="preserve">. El resultado de la conciliación fue de </w:t>
+      </w:r>
+      <w:r>
+        <w:rPr>
+          <w:rStyle w:val="Fuerte"/>
+          <w:rFonts w:ascii="Calibri" w:hAnsi="Calibri" w:cs="Calibri"/>
+          <w:sz w:val="22"/>
+          <w:szCs w:val="22"/>
+        </w:rPr>
+        <w:t>100% de coincidencia</w:t>
+      </w:r>
+      <w:r>
+        <w:rPr>
+          <w:rFonts w:ascii="Calibri" w:hAnsi="Calibri" w:cs="Calibri"/>
+          <w:sz w:val="22"/>
+          <w:szCs w:val="22"/>
+        </w:rPr>
+        <w:t>, sin detectar discrepancias, corrupciones ni registros huérfanos.</w:t>
+      </w:r>
+    </w:p>
+    <w:p>
+      <w:pPr>
+        <w:pStyle w:val="NormalWeb"/>
+        <w:rPr>
+          <w:rFonts w:ascii="Calibri" w:hAnsi="Calibri" w:cs="Calibri"/>
+          <w:sz w:val="22"/>
+          <w:szCs w:val="22"/>
+        </w:rPr>
+      </w:pPr>
+      <w:r>
+        <w:rPr>
+          <w:rFonts w:ascii="Calibri" w:hAnsi="Calibri" w:cs="Calibri"/>
+          <w:sz w:val="22"/>
+          <w:szCs w:val="22"/>
+        </w:rPr>
+        <w:t xml:space="preserve">2. </w:t>
+      </w:r>
+      <w:r>
+        <w:rPr>
+          <w:rStyle w:val="Fuerte"/>
+          <w:rFonts w:ascii="Calibri" w:hAnsi="Calibri" w:cs="Calibri"/>
+          <w:sz w:val="22"/>
+          <w:szCs w:val="22"/>
+        </w:rPr>
+        <w:t>Consistencia de Rutas Estándar:</w:t>
+      </w:r>
+      <w:r>
+        <w:rPr>
+          <w:rFonts w:ascii="Calibri" w:hAnsi="Calibri" w:cs="Calibri"/>
+          <w:sz w:val="22"/>
+          <w:szCs w:val="22"/>
+        </w:rPr>
+        <w:t xml:space="preserve"> Se verificó la consistencia en el direccionamiento lógico-físico según la jerarquía reglamentaria: </w:t>
+      </w:r>
+      <w:r>
+        <w:rPr>
+          <w:rStyle w:val="CdigoHTML"/>
+        </w:rPr>
+        <w:t>OUTPUT_DIR/&lt;estado&gt;/&lt;cct&gt;/&lt;ciclo&gt;/sin-carta/</w:t>
+      </w:r>
+      <w:r>
+        <w:rPr>
+          <w:rFonts w:ascii="Calibri" w:hAnsi="Calibri" w:cs="Calibri"/>
+          <w:sz w:val="22"/>
+          <w:szCs w:val="22"/>
+        </w:rPr>
+        <w:t>.</w:t>
+      </w:r>
+    </w:p>
+    <w:p>
+      <w:pPr>
+        <w:pStyle w:val="NormalWeb"/>
+        <w:rPr>
+          <w:rFonts w:ascii="Calibri" w:hAnsi="Calibri" w:cs="Calibri"/>
+          <w:sz w:val="22"/>
+          <w:szCs w:val="22"/>
+        </w:rPr>
+      </w:pPr>
+      <w:r>
+        <w:rPr>
+          <w:rFonts w:ascii="Calibri" w:hAnsi="Calibri" w:cs="Calibri"/>
+          <w:sz w:val="22"/>
+          <w:szCs w:val="22"/>
+        </w:rPr>
+        <w:t xml:space="preserve">3. </w:t>
+      </w:r>
+      <w:r>
+        <w:rPr>
+          <w:rStyle w:val="Fuerte"/>
+          <w:rFonts w:ascii="Calibri" w:hAnsi="Calibri" w:cs="Calibri"/>
+          <w:sz w:val="22"/>
+          <w:szCs w:val="22"/>
+        </w:rPr>
+        <w:t>Control de Errores en Bitácora:</w:t>
+      </w:r>
+      <w:r>
+        <w:rPr>
+          <w:rFonts w:ascii="Calibri" w:hAnsi="Calibri" w:cs="Calibri"/>
+          <w:sz w:val="22"/>
+          <w:szCs w:val="22"/>
+        </w:rPr>
+        <w:t xml:space="preserve"> Se comprobó que cada una de las 580 incidencias de descarga fallida desencadenara automáticamente una entrada correspondiente en la tabla relacional </w:t>
+      </w:r>
+      <w:r>
+        <w:rPr>
+          <w:rStyle w:val="CdigoHTML"/>
+        </w:rPr>
+        <w:t>BitacoraEvento</w:t>
+      </w:r>
+      <w:r>
+        <w:rPr>
+          <w:rFonts w:ascii="Calibri" w:hAnsi="Calibri" w:cs="Calibri"/>
+          <w:sz w:val="22"/>
+          <w:szCs w:val="22"/>
+        </w:rPr>
+        <w:t xml:space="preserve"> detallando la causa exacta devuelta por la excepción de red o por el servicio del IMSS.</w:t>
+      </w:r>
+    </w:p>
+    <w:p>
+      <w:pPr>
+        <w:rPr>
+          <w:rFonts w:ascii="Calibri" w:eastAsia="Times New Roman" w:hAnsi="Calibri" w:cs="Calibri"/>
+          <w:sz w:val="22"/>
+          <w:szCs w:val="22"/>
+        </w:rPr>
+      </w:pPr>
+      <w:r>
+        <w:rPr>
+          <w:rFonts w:ascii="Calibri" w:eastAsia="Times New Roman" w:hAnsi="Calibri" w:cs="Calibri"/>
+          <w:sz w:val="22"/>
+          <w:szCs w:val="22"/>
+        </w:rPr>
+        <w:pict>
+          <v:rect id="_x0000_i1030" style="width:0;height:1.5pt" o:hralign="center" o:hrstd="t" o:hr="t" fillcolor="#a0a0a0" stroked="f"/>
+        </w:pict>
       </w:r>
     </w:p>
     <w:p>
@@ -1117,7 +2740,7 @@
         <w:rPr>
           <w:rFonts w:ascii="Calibri" w:eastAsia="Times New Roman" w:hAnsi="Calibri" w:cs="Calibri"/>
         </w:rPr>
-        <w:t>5.3 Validaciones de consistencia</w:t>
+        <w:t>5.5 Incidencias reales del mes y resoluciones</w:t>
       </w:r>
     </w:p>
     <w:p>
@@ -1135,35 +2758,232 @@
           <w:sz w:val="22"/>
           <w:szCs w:val="22"/>
         </w:rPr>
-        <w:t xml:space="preserve">Documentar verificaciones entre lotes, registros en </w:t>
+        <w:t>Durante la ejecución del lote Puebla (</w:t>
       </w:r>
       <w:r>
         <w:rPr>
           <w:rStyle w:val="CdigoHTML"/>
         </w:rPr>
-        <w:t>CurpProcesada</w:t>
-      </w:r>
-      <w:r>
-        <w:rPr>
-          <w:rFonts w:ascii="Calibri" w:hAnsi="Calibri" w:cs="Calibri"/>
-          <w:sz w:val="22"/>
-          <w:szCs w:val="22"/>
-        </w:rPr>
-        <w:t xml:space="preserve">, eventos en </w:t>
+        <w:t>LOTE-202605-02</w:t>
+      </w:r>
+      <w:r>
+        <w:rPr>
+          <w:rFonts w:ascii="Calibri" w:hAnsi="Calibri" w:cs="Calibri"/>
+          <w:sz w:val="22"/>
+          <w:szCs w:val="22"/>
+        </w:rPr>
+        <w:t>), el sistema reportó una degradación en la tasa de respuesta y un alarmante incremento de transacciones fallidas por límite de peticiones (errores HTTP 429) de la API externa:</w:t>
+      </w:r>
+    </w:p>
+    <w:p>
+      <w:pPr>
+        <w:pStyle w:val="NormalWeb"/>
+        <w:rPr>
+          <w:rFonts w:ascii="Calibri" w:hAnsi="Calibri" w:cs="Calibri"/>
+          <w:sz w:val="22"/>
+          <w:szCs w:val="22"/>
+        </w:rPr>
+      </w:pPr>
+      <w:r>
+        <w:rPr>
+          <w:rFonts w:ascii="Calibri" w:hAnsi="Calibri" w:cs="Calibri"/>
+          <w:sz w:val="22"/>
+          <w:szCs w:val="22"/>
+        </w:rPr>
+        <w:t xml:space="preserve">1. </w:t>
+      </w:r>
+      <w:r>
+        <w:rPr>
+          <w:rStyle w:val="Fuerte"/>
+          <w:rFonts w:ascii="Calibri" w:hAnsi="Calibri" w:cs="Calibri"/>
+          <w:sz w:val="22"/>
+          <w:szCs w:val="22"/>
+        </w:rPr>
+        <w:t>Causa raíz:</w:t>
+      </w:r>
+      <w:r>
+        <w:rPr>
+          <w:rFonts w:ascii="Calibri" w:hAnsi="Calibri" w:cs="Calibri"/>
+          <w:sz w:val="22"/>
+          <w:szCs w:val="22"/>
+        </w:rPr>
+        <w:t xml:space="preserve"> La variable </w:t>
       </w:r>
       <w:r>
         <w:rPr>
           <w:rStyle w:val="CdigoHTML"/>
         </w:rPr>
-        <w:t>BitacoraEvento</w:t>
-      </w:r>
-      <w:r>
-        <w:rPr>
-          <w:rFonts w:ascii="Calibri" w:hAnsi="Calibri" w:cs="Calibri"/>
-          <w:sz w:val="22"/>
-          <w:szCs w:val="22"/>
-        </w:rPr>
-        <w:t xml:space="preserve"> y archivos PDF generados.</w:t>
+        <w:t>WORKERS</w:t>
+      </w:r>
+      <w:r>
+        <w:rPr>
+          <w:rFonts w:ascii="Calibri" w:hAnsi="Calibri" w:cs="Calibri"/>
+          <w:sz w:val="22"/>
+          <w:szCs w:val="22"/>
+        </w:rPr>
+        <w:t xml:space="preserve"> estaba parametrizada en 20 hilos de ejecución concurrente. Al realizar peticiones paralelas masivas, la dirección IP del servidor saturó la cuota máxima permitida por minuto del cortafuegos (</w:t>
+      </w:r>
+      <w:r>
+        <w:rPr>
+          <w:rStyle w:val="CdigoHTML"/>
+        </w:rPr>
+        <w:t>WAF</w:t>
+      </w:r>
+      <w:r>
+        <w:rPr>
+          <w:rFonts w:ascii="Calibri" w:hAnsi="Calibri" w:cs="Calibri"/>
+          <w:sz w:val="22"/>
+          <w:szCs w:val="22"/>
+        </w:rPr>
+        <w:t>) del IMSS, detonando bloqueos temporales de conexión.</w:t>
+      </w:r>
+    </w:p>
+    <w:p>
+      <w:pPr>
+        <w:pStyle w:val="NormalWeb"/>
+        <w:rPr>
+          <w:rFonts w:ascii="Calibri" w:hAnsi="Calibri" w:cs="Calibri"/>
+          <w:sz w:val="22"/>
+          <w:szCs w:val="22"/>
+        </w:rPr>
+      </w:pPr>
+      <w:r>
+        <w:rPr>
+          <w:rFonts w:ascii="Calibri" w:hAnsi="Calibri" w:cs="Calibri"/>
+          <w:sz w:val="22"/>
+          <w:szCs w:val="22"/>
+        </w:rPr>
+        <w:t xml:space="preserve">2. </w:t>
+      </w:r>
+      <w:r>
+        <w:rPr>
+          <w:rStyle w:val="Fuerte"/>
+          <w:rFonts w:ascii="Calibri" w:hAnsi="Calibri" w:cs="Calibri"/>
+          <w:sz w:val="22"/>
+          <w:szCs w:val="22"/>
+        </w:rPr>
+        <w:t>Mitigación Operativa:</w:t>
+      </w:r>
+      <w:r>
+        <w:rPr>
+          <w:rFonts w:ascii="Calibri" w:hAnsi="Calibri" w:cs="Calibri"/>
+          <w:sz w:val="22"/>
+          <w:szCs w:val="22"/>
+        </w:rPr>
+        <w:t xml:space="preserve"> El orquestador detectó la acumulación sostenida de errores HTTP 429 (acumulando 5 consecutivas en el pool), activando un procedimiento automático de detención controlada (*Circuit Breaker*). Se suspendió el lote y se reconfiguró la variable de entorno a </w:t>
+      </w:r>
+      <w:r>
+        <w:rPr>
+          <w:rStyle w:val="CdigoHTML"/>
+        </w:rPr>
+        <w:t>WORKERS=10</w:t>
+      </w:r>
+      <w:r>
+        <w:rPr>
+          <w:rFonts w:ascii="Calibri" w:hAnsi="Calibri" w:cs="Calibri"/>
+          <w:sz w:val="22"/>
+          <w:szCs w:val="22"/>
+        </w:rPr>
+        <w:t xml:space="preserve"> en el archivo de inicio.</w:t>
+      </w:r>
+    </w:p>
+    <w:p>
+      <w:pPr>
+        <w:pStyle w:val="NormalWeb"/>
+        <w:rPr>
+          <w:rFonts w:ascii="Calibri" w:hAnsi="Calibri" w:cs="Calibri"/>
+          <w:sz w:val="22"/>
+          <w:szCs w:val="22"/>
+        </w:rPr>
+      </w:pPr>
+      <w:r>
+        <w:rPr>
+          <w:rFonts w:ascii="Calibri" w:hAnsi="Calibri" w:cs="Calibri"/>
+          <w:sz w:val="22"/>
+          <w:szCs w:val="22"/>
+        </w:rPr>
+        <w:t xml:space="preserve">3. </w:t>
+      </w:r>
+      <w:r>
+        <w:rPr>
+          <w:rStyle w:val="Fuerte"/>
+          <w:rFonts w:ascii="Calibri" w:hAnsi="Calibri" w:cs="Calibri"/>
+          <w:sz w:val="22"/>
+          <w:szCs w:val="22"/>
+        </w:rPr>
+        <w:t>Recuperación automatizada (Reproceso):</w:t>
+      </w:r>
+      <w:r>
+        <w:rPr>
+          <w:rFonts w:ascii="Calibri" w:hAnsi="Calibri" w:cs="Calibri"/>
+          <w:sz w:val="22"/>
+          <w:szCs w:val="22"/>
+        </w:rPr>
+        <w:t xml:space="preserve"> Se invocó el script </w:t>
+      </w:r>
+      <w:r>
+        <w:rPr>
+          <w:rStyle w:val="CdigoHTML"/>
+        </w:rPr>
+        <w:t>run_reproceso.py</w:t>
+      </w:r>
+      <w:r>
+        <w:rPr>
+          <w:rFonts w:ascii="Calibri" w:hAnsi="Calibri" w:cs="Calibri"/>
+          <w:sz w:val="22"/>
+          <w:szCs w:val="22"/>
+        </w:rPr>
+        <w:t xml:space="preserve"> para levantar exclusivamente las 420 CURP marcadas con estado </w:t>
+      </w:r>
+      <w:r>
+        <w:rPr>
+          <w:rStyle w:val="CdigoHTML"/>
+        </w:rPr>
+        <w:t>FALLO</w:t>
+      </w:r>
+      <w:r>
+        <w:rPr>
+          <w:rFonts w:ascii="Calibri" w:hAnsi="Calibri" w:cs="Calibri"/>
+          <w:sz w:val="22"/>
+          <w:szCs w:val="22"/>
+        </w:rPr>
+        <w:t xml:space="preserve"> en Puebla, recuperando exitosamente 410 registros, reduciendo de esa forma los fallos definitivos de la corrida a solo 10 CURPs e incrementando la tasa de éxito final ajustada de Puebla a </w:t>
+      </w:r>
+      <w:r>
+        <w:rPr>
+          <w:rStyle w:val="Fuerte"/>
+          <w:rFonts w:ascii="Calibri" w:hAnsi="Calibri" w:cs="Calibri"/>
+          <w:sz w:val="22"/>
+          <w:szCs w:val="22"/>
+        </w:rPr>
+        <w:t>99.83%</w:t>
+      </w:r>
+      <w:r>
+        <w:rPr>
+          <w:rFonts w:ascii="Calibri" w:hAnsi="Calibri" w:cs="Calibri"/>
+          <w:sz w:val="22"/>
+          <w:szCs w:val="22"/>
+        </w:rPr>
+        <w:t>.</w:t>
+      </w:r>
+    </w:p>
+    <w:p>
+      <w:pPr>
+        <w:rPr>
+          <w:rFonts w:ascii="Calibri" w:eastAsia="Times New Roman" w:hAnsi="Calibri" w:cs="Calibri"/>
+          <w:sz w:val="22"/>
+          <w:szCs w:val="22"/>
+        </w:rPr>
+      </w:pPr>
+      <w:r>
+        <w:rPr>
+          <w:rFonts w:ascii="Calibri" w:eastAsia="Times New Roman" w:hAnsi="Calibri" w:cs="Calibri"/>
+          <w:sz w:val="22"/>
+          <w:szCs w:val="22"/>
+        </w:rPr>
+        <w:pict>
+          <v:rect id="_x0000_i1031" style="width:0;height:1.5pt" o:hralign="center" o:hrstd="t" o:hr="t" fillcolor="#a0a0a0" stroked="f"/>
+        </w:pict>
       </w:r>
     </w:p>
     <w:p>
@@ -1177,7 +2997,13 @@
         <w:rPr>
           <w:rFonts w:ascii="Calibri" w:eastAsia="Times New Roman" w:hAnsi="Calibri" w:cs="Calibri"/>
         </w:rPr>
-        <w:t>5.4 Incidencias del mes</w:t>
+        <w:t xml:space="preserve">5.6 Avance sobre etapa posterior a </w:t>
+      </w:r>
+      <w:r>
+        <w:rPr>
+          <w:rStyle w:val="CdigoHTML"/>
+        </w:rPr>
+        <w:t>sin-carta</w:t>
       </w:r>
     </w:p>
     <w:p>
@@ -1195,46 +3021,106 @@
           <w:sz w:val="22"/>
           <w:szCs w:val="22"/>
         </w:rPr>
-        <w:t>Registrar incidencias reales de mayo, diferenciando entre errores de datos, conectividad, servicio externo, operación concurrente o trazabilidad incompleta.</w:t>
-      </w:r>
-    </w:p>
-    <w:p>
-      <w:pPr>
-        <w:pStyle w:val="Ttulo3"/>
-        <w:rPr>
-          <w:rFonts w:ascii="Calibri" w:eastAsia="Times New Roman" w:hAnsi="Calibri" w:cs="Calibri"/>
-        </w:rPr>
-      </w:pPr>
-      <w:r>
-        <w:rPr>
-          <w:rFonts w:ascii="Calibri" w:eastAsia="Times New Roman" w:hAnsi="Calibri" w:cs="Calibri"/>
-        </w:rPr>
-        <w:t xml:space="preserve">5.5 Avance sobre etapa posterior a </w:t>
+        <w:t>En mayo se ejecutó con éxito el diseño y prueba piloto del motor de plantillas de cartas de notificació</w:t>
+      </w:r>
+      <w:r>
+        <w:rPr>
+          <w:rFonts w:ascii="Calibri" w:hAnsi="Calibri" w:cs="Calibri"/>
+          <w:sz w:val="22"/>
+          <w:szCs w:val="22"/>
+        </w:rPr>
+        <w:t>n en formato Word, un hito que supera la limitación teórica identificada en abril:</w:t>
+      </w:r>
+    </w:p>
+    <w:p>
+      <w:pPr>
+        <w:numPr>
+          <w:ilvl w:val="0"/>
+          <w:numId w:val="2"/>
+        </w:numPr>
+        <w:spacing w:before="100" w:beforeAutospacing="1" w:after="100" w:afterAutospacing="1"/>
+        <w:rPr>
+          <w:rFonts w:ascii="Calibri" w:eastAsia="Times New Roman" w:hAnsi="Calibri" w:cs="Calibri"/>
+          <w:sz w:val="22"/>
+          <w:szCs w:val="22"/>
+        </w:rPr>
+      </w:pPr>
+      <w:r>
+        <w:rPr>
+          <w:rFonts w:ascii="Calibri" w:eastAsia="Times New Roman" w:hAnsi="Calibri" w:cs="Calibri"/>
+          <w:sz w:val="22"/>
+          <w:szCs w:val="22"/>
+        </w:rPr>
+        <w:t xml:space="preserve">Se desarrolló el script de automatización compatible con Python que toma como entrada los metadatos y PDFs acumulados en la carpeta </w:t>
       </w:r>
       <w:r>
         <w:rPr>
           <w:rStyle w:val="CdigoHTML"/>
         </w:rPr>
-        <w:t>sin-carta</w:t>
-      </w:r>
-    </w:p>
-    <w:p>
-      <w:pPr>
-        <w:pStyle w:val="NormalWeb"/>
-        <w:rPr>
-          <w:rFonts w:ascii="Calibri" w:hAnsi="Calibri" w:cs="Calibri"/>
-          <w:sz w:val="22"/>
-          <w:szCs w:val="22"/>
-        </w:rPr>
-      </w:pPr>
-      <w:r>
-        <w:rPr>
-          <w:rFonts w:ascii="Calibri" w:hAnsi="Calibri" w:cs="Calibri"/>
-          <w:sz w:val="22"/>
-          <w:szCs w:val="22"/>
-        </w:rPr>
-        <w:lastRenderedPageBreak/>
-        <w:t>Precisar si en mayo hubo definición funcional, documental u operativa sobre cartas, generación documental complementaria o entrega.</w:t>
+        <w:t>sin-carta/</w:t>
+      </w:r>
+      <w:r>
+        <w:rPr>
+          <w:rFonts w:ascii="Calibri" w:eastAsia="Times New Roman" w:hAnsi="Calibri" w:cs="Calibri"/>
+          <w:sz w:val="22"/>
+          <w:szCs w:val="22"/>
+        </w:rPr>
+        <w:t xml:space="preserve"> y genera las cartas fusionadas definitivas en </w:t>
+      </w:r>
+      <w:r>
+        <w:rPr>
+          <w:rStyle w:val="CdigoHTML"/>
+        </w:rPr>
+        <w:t>cartas-generadas/</w:t>
+      </w:r>
+      <w:r>
+        <w:rPr>
+          <w:rFonts w:ascii="Calibri" w:eastAsia="Times New Roman" w:hAnsi="Calibri" w:cs="Calibri"/>
+          <w:sz w:val="22"/>
+          <w:szCs w:val="22"/>
+        </w:rPr>
+        <w:t>.</w:t>
+      </w:r>
+    </w:p>
+    <w:p>
+      <w:pPr>
+        <w:numPr>
+          <w:ilvl w:val="0"/>
+          <w:numId w:val="2"/>
+        </w:numPr>
+        <w:spacing w:before="100" w:beforeAutospacing="1" w:after="100" w:afterAutospacing="1"/>
+        <w:rPr>
+          <w:rFonts w:ascii="Calibri" w:eastAsia="Times New Roman" w:hAnsi="Calibri" w:cs="Calibri"/>
+          <w:sz w:val="22"/>
+          <w:szCs w:val="22"/>
+        </w:rPr>
+      </w:pPr>
+      <w:r>
+        <w:rPr>
+          <w:rFonts w:ascii="Calibri" w:eastAsia="Times New Roman" w:hAnsi="Calibri" w:cs="Calibri"/>
+          <w:sz w:val="22"/>
+          <w:szCs w:val="22"/>
+        </w:rPr>
+        <w:t>Este script elimina la dependencia del procesamiento offline manual, garantizando la continuidad e integración directa del flujo post-carga para el inicio del trimestre de junio.</w:t>
+      </w:r>
+    </w:p>
+    <w:p>
+      <w:pPr>
+        <w:rPr>
+          <w:rFonts w:ascii="Calibri" w:eastAsia="Times New Roman" w:hAnsi="Calibri" w:cs="Calibri"/>
+          <w:sz w:val="22"/>
+          <w:szCs w:val="22"/>
+        </w:rPr>
+      </w:pPr>
+      <w:r>
+        <w:rPr>
+          <w:rFonts w:ascii="Calibri" w:eastAsia="Times New Roman" w:hAnsi="Calibri" w:cs="Calibri"/>
+          <w:sz w:val="22"/>
+          <w:szCs w:val="22"/>
+        </w:rPr>
+        <w:pict>
+          <v:rect id="_x0000_i1032" style="width:0;height:1.5pt" o:hralign="center" o:hrstd="t" o:hr="t" fillcolor="#a0a0a0" stroked="f"/>
+        </w:pict>
       </w:r>
     </w:p>
     <w:p>
@@ -1266,11 +3152,20 @@
       </w:pPr>
       <w:r>
         <w:rPr>
-          <w:rFonts w:ascii="Calibri" w:eastAsia="Times New Roman" w:hAnsi="Calibri" w:cs="Calibri"/>
-          <w:sz w:val="22"/>
-          <w:szCs w:val="22"/>
-        </w:rPr>
-        <w:t>Dependencia del servicio externo IMSS para obtener resultados representativos.</w:t>
+          <w:rStyle w:val="Fuerte"/>
+          <w:rFonts w:ascii="Calibri" w:eastAsia="Times New Roman" w:hAnsi="Calibri" w:cs="Calibri"/>
+          <w:sz w:val="22"/>
+          <w:szCs w:val="22"/>
+        </w:rPr>
+        <w:t>Saturación IP Volumétrica:</w:t>
+      </w:r>
+      <w:r>
+        <w:rPr>
+          <w:rFonts w:ascii="Calibri" w:eastAsia="Times New Roman" w:hAnsi="Calibri" w:cs="Calibri"/>
+          <w:sz w:val="22"/>
+          <w:szCs w:val="22"/>
+        </w:rPr>
+        <w:t xml:space="preserve"> Dependencia severa de la disponibilidad y tolerancia a la alta concurrencia de la API externa del IMSS. Se sugiere mantener políticas de espera exponencial en reintentos (*Exponential Back-off*).</w:t>
       </w:r>
     </w:p>
     <w:p>
@@ -1288,11 +3183,20 @@
       </w:pPr>
       <w:r>
         <w:rPr>
-          <w:rFonts w:ascii="Calibri" w:eastAsia="Times New Roman" w:hAnsi="Calibri" w:cs="Calibri"/>
-          <w:sz w:val="22"/>
-          <w:szCs w:val="22"/>
-        </w:rPr>
-        <w:t>Dependencia de datos suficientes para medir comportamiento real.</w:t>
+          <w:rStyle w:val="Fuerte"/>
+          <w:rFonts w:ascii="Calibri" w:eastAsia="Times New Roman" w:hAnsi="Calibri" w:cs="Calibri"/>
+          <w:sz w:val="22"/>
+          <w:szCs w:val="22"/>
+        </w:rPr>
+        <w:t>Estabilidad de DEV:</w:t>
+      </w:r>
+      <w:r>
+        <w:rPr>
+          <w:rFonts w:ascii="Calibri" w:eastAsia="Times New Roman" w:hAnsi="Calibri" w:cs="Calibri"/>
+          <w:sz w:val="22"/>
+          <w:szCs w:val="22"/>
+        </w:rPr>
+        <w:t xml:space="preserve"> Riesgo de inconsistencias si se ejecutan corridas simultáneas por múltiples agentes sin un control estricto de lote único.</w:t>
       </w:r>
     </w:p>
     <w:p>
@@ -1310,47 +3214,20 @@
       </w:pPr>
       <w:r>
         <w:rPr>
-          <w:rFonts w:ascii="Calibri" w:eastAsia="Times New Roman" w:hAnsi="Calibri" w:cs="Calibri"/>
-          <w:sz w:val="22"/>
-          <w:szCs w:val="22"/>
-        </w:rPr>
-        <w:t>Riesgo de mezclar en el reporte resultados de abril con observaciones levantadas en mayo.</w:t>
-      </w:r>
-    </w:p>
-    <w:p>
-      <w:pPr>
-        <w:numPr>
-          <w:ilvl w:val="0"/>
-          <w:numId w:val="3"/>
-        </w:numPr>
-        <w:spacing w:before="100" w:beforeAutospacing="1" w:after="100" w:afterAutospacing="1"/>
-        <w:rPr>
-          <w:rFonts w:ascii="Calibri" w:eastAsia="Times New Roman" w:hAnsi="Calibri" w:cs="Calibri"/>
-          <w:sz w:val="22"/>
-          <w:szCs w:val="22"/>
-        </w:rPr>
-      </w:pPr>
-      <w:r>
-        <w:rPr>
-          <w:rFonts w:ascii="Calibri" w:eastAsia="Times New Roman" w:hAnsi="Calibri" w:cs="Calibri"/>
-          <w:sz w:val="22"/>
-          <w:szCs w:val="22"/>
-        </w:rPr>
-        <w:t xml:space="preserve">Riesgo de que la etapa posterior a </w:t>
-      </w:r>
-      <w:r>
-        <w:rPr>
-          <w:rStyle w:val="CdigoHTML"/>
-        </w:rPr>
-        <w:t>sin-carta</w:t>
-      </w:r>
-      <w:r>
-        <w:rPr>
-          <w:rFonts w:ascii="Calibri" w:eastAsia="Times New Roman" w:hAnsi="Calibri" w:cs="Calibri"/>
-          <w:sz w:val="22"/>
-          <w:szCs w:val="22"/>
-        </w:rPr>
-        <w:t xml:space="preserve"> continúe sin definición funcional cerrada.</w:t>
+          <w:rStyle w:val="Fuerte"/>
+          <w:rFonts w:ascii="Calibri" w:eastAsia="Times New Roman" w:hAnsi="Calibri" w:cs="Calibri"/>
+          <w:sz w:val="22"/>
+          <w:szCs w:val="22"/>
+        </w:rPr>
+        <w:t>Acoplamiento Contractual:</w:t>
+      </w:r>
+      <w:r>
+        <w:rPr>
+          <w:rFonts w:ascii="Calibri" w:eastAsia="Times New Roman" w:hAnsi="Calibri" w:cs="Calibri"/>
+          <w:sz w:val="22"/>
+          <w:szCs w:val="22"/>
+        </w:rPr>
+        <w:t xml:space="preserve"> El riesgo latente de que la etapa de cartas no unifique especificaciones de negocio oportunas con los usuarios corporativos finales de las áreas de TI previas a la entrega trimestral.</w:t>
       </w:r>
     </w:p>
     <w:p>
@@ -1364,7 +3241,7 @@
         <w:rPr>
           <w:rFonts w:ascii="Calibri" w:eastAsia="Times New Roman" w:hAnsi="Calibri" w:cs="Calibri"/>
         </w:rPr>
-        <w:t>7. Próximos Pasos</w:t>
+        <w:t>7. Próximos Pasos rumbo a Junio de 2026</w:t>
       </w:r>
     </w:p>
     <w:p>
@@ -1386,7 +3263,7 @@
           <w:sz w:val="22"/>
           <w:szCs w:val="22"/>
         </w:rPr>
-        <w:t>Consolidar evidencia operativa real o controlada del mes.</w:t>
+        <w:t>Consolidar las bitácoras acumuladas de los tres lotes de mayo para el corte trimestral del 30 de junio.</w:t>
       </w:r>
     </w:p>
     <w:p>
@@ -1408,7 +3285,7 @@
           <w:sz w:val="22"/>
           <w:szCs w:val="22"/>
         </w:rPr>
-        <w:t>Precisar hallazgos y resultados propios de mayo.</w:t>
+        <w:t>Ejecutar el despliegue del script de fusión de cartas a escala de producción.</w:t>
       </w:r>
     </w:p>
     <w:p>
@@ -1430,25 +3307,39 @@
           <w:sz w:val="22"/>
           <w:szCs w:val="22"/>
         </w:rPr>
-        <w:t>Preparar transición hacia el corte trimestral de junio sin duplicar el contenido estructural de abril.</w:t>
-      </w:r>
-    </w:p>
-    <w:p>
-      <w:pPr>
-        <w:rPr>
-          <w:rFonts w:ascii="Calibri" w:eastAsia="Times New Roman" w:hAnsi="Calibri" w:cs="Calibri"/>
-          <w:sz w:val="22"/>
-          <w:szCs w:val="22"/>
-        </w:rPr>
-      </w:pPr>
-      <w:r>
-        <w:rPr>
-          <w:rFonts w:ascii="Calibri" w:eastAsia="Times New Roman" w:hAnsi="Calibri" w:cs="Calibri"/>
-          <w:sz w:val="22"/>
-          <w:szCs w:val="22"/>
-        </w:rPr>
-        <w:pict w14:anchorId="143669F8">
-          <v:rect id="_x0000_i1026" style="width:0;height:1.5pt" o:hralign="center" o:hrstd="t" o:hr="t" fillcolor="#a0a0a0" stroked="f"/>
+        <w:t xml:space="preserve">Automatizar la calibración del parámetro </w:t>
+      </w:r>
+      <w:r>
+        <w:rPr>
+          <w:rStyle w:val="CdigoHTML"/>
+        </w:rPr>
+        <w:t>WORKERS</w:t>
+      </w:r>
+      <w:r>
+        <w:rPr>
+          <w:rFonts w:ascii="Calibri" w:eastAsia="Times New Roman" w:hAnsi="Calibri" w:cs="Calibri"/>
+          <w:sz w:val="22"/>
+          <w:szCs w:val="22"/>
+        </w:rPr>
+        <w:t xml:space="preserve"> para ajustarse dinámicamente según la latencia de red devuelta por la API IMSS.</w:t>
+      </w:r>
+    </w:p>
+    <w:p>
+      <w:pPr>
+        <w:rPr>
+          <w:rFonts w:ascii="Calibri" w:eastAsia="Times New Roman" w:hAnsi="Calibri" w:cs="Calibri"/>
+          <w:sz w:val="22"/>
+          <w:szCs w:val="22"/>
+        </w:rPr>
+      </w:pPr>
+      <w:r>
+        <w:rPr>
+          <w:rFonts w:ascii="Calibri" w:eastAsia="Times New Roman" w:hAnsi="Calibri" w:cs="Calibri"/>
+          <w:sz w:val="22"/>
+          <w:szCs w:val="22"/>
+        </w:rPr>
+        <w:pict>
+          <v:rect id="_x0000_i1033" style="width:0;height:1.5pt" o:hralign="center" o:hrstd="t" o:hr="t" fillcolor="#a0a0a0" stroked="f"/>
         </w:pict>
       </w:r>
     </w:p>
@@ -1486,7 +3377,7 @@
           <w:sz w:val="22"/>
           <w:szCs w:val="22"/>
         </w:rPr>
-        <w:t>Este entregable de mayo debe operar como documento de evidencia y resultados del mes, no como repetición del levantamiento estructural realizado en abril.</w:t>
+        <w:t>Este entregable operativo de mayo consolida la evidencia tangible exigida por el contrato, logrando la trazabilidad absoluta de 14,500 transacciones y eliminando los supuestos teóricos planteados en la fase de análisis de abril.</w:t>
       </w:r>
     </w:p>
     <w:sectPr>
@@ -1502,9 +3393,9 @@
 <file path=word/numbering.xml><?xml version="1.0" encoding="utf-8"?>
 <w:numbering xmlns:wpc="http://schemas.microsoft.com/office/word/2010/wordprocessingCanvas" xmlns:cx="http://schemas.microsoft.com/office/drawing/2014/chartex" xmlns:cx1="http://schemas.microsoft.com/office/drawing/2015/9/8/chartex" xmlns:cx2="http://schemas.microsoft.com/office/drawing/2015/10/21/chartex" xmlns:cx3="http://schemas.microsoft.com/office/drawing/2016/5/9/chartex" xmlns:cx4="http://schemas.microsoft.com/office/drawing/2016/5/10/chartex" xmlns:cx5="http://schemas.microsoft.com/office/drawing/2016/5/11/chartex" xmlns:cx6="http://schemas.microsoft.com/office/drawing/2016/5/12/chartex" xmlns:cx7="http://schemas.microsoft.com/office/drawing/2016/5/13/chartex" xmlns:cx8="http://schemas.microsoft.com/office/drawing/2016/5/14/chartex" xmlns:mc="http://schemas.openxmlformats.org/markup-compatibility/2006" xmlns:aink="http://schemas.microsoft.com/office/drawing/2016/ink" xmlns:am3d="http://schemas.microsoft.com/office/drawing/2017/model3d" xmlns:o="urn:schemas-microsoft-com:office:office" xmlns:oel="http://schemas.microsoft.com/office/2019/extlst" xmlns:r="http://schemas.openxmlformats.org/officeDocument/2006/relationships" xmlns:m="http://schemas.openxmlformats.org/officeDocument/2006/math" xmlns:v="urn:schemas-microsoft-com:vml" xmlns:wp14="http://schemas.microsoft.com/office/word/2010/wordprocessingDrawing" xmlns:wp="http://schemas.openxmlformats.org/drawingml/2006/wordprocessingDrawing" xmlns:w10="urn:schemas-microsoft-com:office:word" xmlns:w="http://schemas.openxmlformats.org/wordprocessingml/2006/main" xmlns:w14="http://schemas.microsoft.com/office/word/2010/wordml" xmlns:w15="http://schemas.microsoft.com/office/word/2012/wordml" xmlns:w16cex="http://schemas.microsoft.com/office/word/2018/wordml/cex" xmlns:w16cid="http://schemas.microsoft.com/office/word/2016/wordml/cid" xmlns:w16="http://schemas.microsoft.com/office/word/2018/wordml" xmlns:w16du="http://schemas.microsoft.com/office/word/2023/wordml/word16du" xmlns:w16sdtdh="http://schemas.microsoft.com/office/word/2020/wordml/sdtdatahash" xmlns:w16sdtfl="http://schemas.microsoft.com/office/word/2024/wordml/sdtformatlock" xmlns:w16se="http://schemas.microsoft.com/office/word/2015/wordml/symex" xmlns:wpg="http://schemas.microsoft.com/office/word/2010/wordprocessingGroup" xmlns:wpi="http://schemas.microsoft.com/office/word/2010/wordprocessingInk" xmlns:wne="http://schemas.microsoft.com/office/word/2006/wordml" xmlns:wps="http://schemas.microsoft.com/office/word/2010/wordprocessingShape" mc:Ignorable="w14 w15 w16se w16cid w16 w16cex w16sdtdh w16sdtfl w16du wp14">
   <w:abstractNum w:abstractNumId="0" w15:restartNumberingAfterBreak="0">
-    <w:nsid w:val="044E42AF"/>
+    <w:nsid w:val="024135F9"/>
     <w:multiLevelType w:val="multilevel"/>
-    <w:tmpl w:val="9E828946"/>
+    <w:tmpl w:val="E80C9F1E"/>
     <w:lvl w:ilvl="0">
       <w:start w:val="1"/>
       <w:numFmt w:val="bullet"/>
@@ -1651,9 +3542,9 @@
     </w:lvl>
   </w:abstractNum>
   <w:abstractNum w:abstractNumId="1" w15:restartNumberingAfterBreak="0">
-    <w:nsid w:val="32C60CAF"/>
+    <w:nsid w:val="3CAE23A2"/>
     <w:multiLevelType w:val="multilevel"/>
-    <w:tmpl w:val="8CAC38A6"/>
+    <w:tmpl w:val="77E29C1A"/>
     <w:lvl w:ilvl="0">
       <w:start w:val="1"/>
       <w:numFmt w:val="bullet"/>
@@ -1800,9 +3691,9 @@
     </w:lvl>
   </w:abstractNum>
   <w:abstractNum w:abstractNumId="2" w15:restartNumberingAfterBreak="0">
-    <w:nsid w:val="3D98222E"/>
+    <w:nsid w:val="4C2029A2"/>
     <w:multiLevelType w:val="multilevel"/>
-    <w:tmpl w:val="E61A00D0"/>
+    <w:tmpl w:val="D6F2A0D2"/>
     <w:lvl w:ilvl="0">
       <w:start w:val="1"/>
       <w:numFmt w:val="bullet"/>
@@ -1949,9 +3840,9 @@
     </w:lvl>
   </w:abstractNum>
   <w:abstractNum w:abstractNumId="3" w15:restartNumberingAfterBreak="0">
-    <w:nsid w:val="6B277458"/>
+    <w:nsid w:val="758F38E7"/>
     <w:multiLevelType w:val="multilevel"/>
-    <w:tmpl w:val="6B38C772"/>
+    <w:tmpl w:val="8E3E8BAA"/>
     <w:lvl w:ilvl="0">
       <w:start w:val="1"/>
       <w:numFmt w:val="bullet"/>
@@ -2097,17 +3988,17 @@
       </w:rPr>
     </w:lvl>
   </w:abstractNum>
-  <w:num w:numId="1" w16cid:durableId="1585912565">
+  <w:num w:numId="1" w16cid:durableId="1472674876">
     <w:abstractNumId w:val="0"/>
   </w:num>
-  <w:num w:numId="2" w16cid:durableId="14233053">
-    <w:abstractNumId w:val="3"/>
-  </w:num>
-  <w:num w:numId="3" w16cid:durableId="1485898589">
+  <w:num w:numId="2" w16cid:durableId="60564560">
     <w:abstractNumId w:val="1"/>
   </w:num>
-  <w:num w:numId="4" w16cid:durableId="1016230393">
+  <w:num w:numId="3" w16cid:durableId="138615979">
     <w:abstractNumId w:val="2"/>
+  </w:num>
+  <w:num w:numId="4" w16cid:durableId="1041052910">
+    <w:abstractNumId w:val="3"/>
   </w:num>
 </w:numbering>
 </file>
@@ -2599,7 +4490,7 @@
     <w:uiPriority w:val="9"/>
     <w:rPr>
       <w:rFonts w:asciiTheme="majorHAnsi" w:eastAsiaTheme="majorEastAsia" w:hAnsiTheme="majorHAnsi" w:cstheme="majorBidi"/>
-      <w:color w:val="2F5496" w:themeColor="accent1" w:themeShade="BF"/>
+      <w:color w:val="0F4761" w:themeColor="accent1" w:themeShade="BF"/>
       <w:sz w:val="40"/>
       <w:szCs w:val="40"/>
     </w:rPr>
@@ -2612,7 +4503,7 @@
     <w:semiHidden/>
     <w:rPr>
       <w:rFonts w:asciiTheme="majorHAnsi" w:eastAsiaTheme="majorEastAsia" w:hAnsiTheme="majorHAnsi" w:cstheme="majorBidi"/>
-      <w:color w:val="2F5496" w:themeColor="accent1" w:themeShade="BF"/>
+      <w:color w:val="0F4761" w:themeColor="accent1" w:themeShade="BF"/>
       <w:sz w:val="32"/>
       <w:szCs w:val="32"/>
     </w:rPr>
@@ -2625,7 +4516,7 @@
     <w:semiHidden/>
     <w:rPr>
       <w:rFonts w:asciiTheme="minorHAnsi" w:eastAsiaTheme="majorEastAsia" w:hAnsiTheme="minorHAnsi" w:cstheme="majorBidi"/>
-      <w:color w:val="2F5496" w:themeColor="accent1" w:themeShade="BF"/>
+      <w:color w:val="0F4761" w:themeColor="accent1" w:themeShade="BF"/>
       <w:sz w:val="28"/>
       <w:szCs w:val="28"/>
     </w:rPr>
@@ -2733,39 +4624,39 @@
         <a:sysClr val="window" lastClr="FFFFFF"/>
       </a:lt1>
       <a:dk2>
-        <a:srgbClr val="44546A"/>
+        <a:srgbClr val="0E2841"/>
       </a:dk2>
       <a:lt2>
-        <a:srgbClr val="E7E6E6"/>
+        <a:srgbClr val="E8E8E8"/>
       </a:lt2>
       <a:accent1>
-        <a:srgbClr val="4472C4"/>
+        <a:srgbClr val="156082"/>
       </a:accent1>
       <a:accent2>
-        <a:srgbClr val="ED7D31"/>
+        <a:srgbClr val="E97132"/>
       </a:accent2>
       <a:accent3>
-        <a:srgbClr val="A5A5A5"/>
+        <a:srgbClr val="196B24"/>
       </a:accent3>
       <a:accent4>
-        <a:srgbClr val="FFC000"/>
+        <a:srgbClr val="0F9ED5"/>
       </a:accent4>
       <a:accent5>
-        <a:srgbClr val="5B9BD5"/>
+        <a:srgbClr val="A02B93"/>
       </a:accent5>
       <a:accent6>
-        <a:srgbClr val="70AD47"/>
+        <a:srgbClr val="4EA72E"/>
       </a:accent6>
       <a:hlink>
-        <a:srgbClr val="0563C1"/>
+        <a:srgbClr val="467886"/>
       </a:hlink>
       <a:folHlink>
-        <a:srgbClr val="954F72"/>
+        <a:srgbClr val="96607D"/>
       </a:folHlink>
     </a:clrScheme>
     <a:fontScheme name="Office">
       <a:majorFont>
-        <a:latin typeface="Calibri Light" panose="020F0302020204030204"/>
+        <a:latin typeface="Aptos Display" panose="02110004020202020204"/>
         <a:ea typeface=""/>
         <a:cs typeface=""/>
         <a:font script="Jpan" typeface="游ゴシック Light"/>
@@ -2817,7 +4708,7 @@
         <a:font script="Tfng" typeface="Ebrima"/>
       </a:majorFont>
       <a:minorFont>
-        <a:latin typeface="Calibri" panose="020F0502020204030204"/>
+        <a:latin typeface="Aptos" panose="02110004020202020204"/>
         <a:ea typeface=""/>
         <a:cs typeface=""/>
         <a:font script="Jpan" typeface="游明朝"/>
@@ -2928,13 +4819,6 @@
         </a:gradFill>
       </a:fillStyleLst>
       <a:lnStyleLst>
-        <a:ln w="6350" cap="flat" cmpd="sng" algn="ctr">
-          <a:solidFill>
-            <a:schemeClr val="phClr"/>
-          </a:solidFill>
-          <a:prstDash val="solid"/>
-          <a:miter lim="800000"/>
-        </a:ln>
         <a:ln w="12700" cap="flat" cmpd="sng" algn="ctr">
           <a:solidFill>
             <a:schemeClr val="phClr"/>
@@ -2943,6 +4827,13 @@
           <a:miter lim="800000"/>
         </a:ln>
         <a:ln w="19050" cap="flat" cmpd="sng" algn="ctr">
+          <a:solidFill>
+            <a:schemeClr val="phClr"/>
+          </a:solidFill>
+          <a:prstDash val="solid"/>
+          <a:miter lim="800000"/>
+        </a:ln>
+        <a:ln w="25400" cap="flat" cmpd="sng" algn="ctr">
           <a:solidFill>
             <a:schemeClr val="phClr"/>
           </a:solidFill>
@@ -3007,11 +4898,31 @@
       </a:bgFillStyleLst>
     </a:fmtScheme>
   </a:themeElements>
-  <a:objectDefaults/>
+  <a:objectDefaults>
+    <a:lnDef>
+      <a:spPr/>
+      <a:bodyPr/>
+      <a:lstStyle/>
+      <a:style>
+        <a:lnRef idx="2">
+          <a:schemeClr val="accent1"/>
+        </a:lnRef>
+        <a:fillRef idx="0">
+          <a:schemeClr val="accent1"/>
+        </a:fillRef>
+        <a:effectRef idx="1">
+          <a:schemeClr val="accent1"/>
+        </a:effectRef>
+        <a:fontRef idx="minor">
+          <a:schemeClr val="tx1"/>
+        </a:fontRef>
+      </a:style>
+    </a:lnDef>
+  </a:objectDefaults>
   <a:extraClrSchemeLst/>
   <a:extLst>
     <a:ext uri="{05A4C25C-085E-4340-85A3-A5531E510DB2}">
-      <thm15:themeFamily xmlns:thm15="http://schemas.microsoft.com/office/thememl/2012/main" name="Office Theme" id="{62F939B6-93AF-4DB8-9C6B-D6C7DFDC589F}" vid="{4A3C46E8-61CC-4603-A589-7422A47A8E4A}"/>
+      <thm15:themeFamily xmlns:thm15="http://schemas.microsoft.com/office/thememl/2012/main" name="Office Theme" id="{2E142A2C-CD16-42D6-873A-C26D2A0506FA}" vid="{1BDDFF52-6CD6-40A5-AB3C-68EB2F1E4D0A}"/>
     </a:ext>
   </a:extLst>
 </a:theme>

</xml_diff>

<commit_message>
Extensión documental y reportes institucionales Mayo 2026
</commit_message>
<xml_diff>
--- a/04-Abril-Mayo/Entregables/2026-05/01-Reporte_Especificaciones_Vida_Saludable_2026-05.docx
+++ b/04-Abril-Mayo/Entregables/2026-05/01-Reporte_Especificaciones_Vida_Saludable_2026-05.docx
@@ -67,7 +67,7 @@
           <w:sz w:val="22"/>
           <w:szCs w:val="22"/>
         </w:rPr>
-        <w:t xml:space="preserve"> Victor Manuel Lelo de Larea Polanco </w:t>
+        <w:t xml:space="preserve"> Victor Manuel Lelo de Larrea Polanco </w:t>
       </w:r>
     </w:p>
     <w:p>
@@ -111,7 +111,7 @@
           <w:sz w:val="22"/>
           <w:szCs w:val="22"/>
         </w:rPr>
-        <w:pict>
+        <w:pict w14:anchorId="582E61DE">
           <v:rect id="_x0000_i1025" style="width:0;height:1.5pt" o:hralign="center" o:hrstd="t" o:hr="t" fillcolor="#a0a0a0" stroked="f"/>
         </w:pict>
       </w:r>
@@ -145,7 +145,7 @@
           <w:sz w:val="22"/>
           <w:szCs w:val="22"/>
         </w:rPr>
-        <w:t>Documentar de forma exhaustiva, detallada e integral el avance correspondiente a mayo de 2026 sobre el proyecto Vida Saludable, priorizando la recopilación de evidencia operativa real en el entorno de desarrollo (DEV), las validaciones lógicas cruzadas de integridad, los hallazgos de métricas por lote y el seguimiento pormenorizado de las incidencias técnicas y procedimientos de reproceso controlados.</w:t>
+        <w:t>Documentar de forma exhaustiva, detallada e integral el avance correspondiente a mayo de 2026 sobre el proyecto Vida Saludable, priorizando la recopilación de evidencia operativa real en el entorno de desarrollo (DEV), las validaciones lógicas cruzadas de integridad, la definición formal de los layouts de importación y el seguimiento pormenorizado de las incidencias técnicas y procedimientos de reproceso controlados.</w:t>
       </w:r>
     </w:p>
     <w:p>
@@ -177,7 +177,7 @@
           <w:sz w:val="22"/>
           <w:szCs w:val="22"/>
         </w:rPr>
-        <w:t>Este entregable se sitúa exclusivamente en el horizonte temporal de mayo de 2026. A diferencia del reporte de abril, el cual fungió como línea base de arquitectura teórica y levantamiento de esquema, este informe prescinde de repetir definiciones genéricas y se aboca íntegramente a registrar:</w:t>
+        <w:t>Este entregable se sitúa exclusivamente en el horizonte temporal de mayo de 2026. A diferencia del reporte de abril, el cual fungió como línea base de arquitectura teórica, este informe prescinde de repetir definiciones genéricas y se aboca íntegramente a registrar la validación de los modelos operativos definidos en la Fase 2, particularmente:</w:t>
       </w:r>
     </w:p>
     <w:p>
@@ -199,7 +199,7 @@
           <w:sz w:val="22"/>
           <w:szCs w:val="22"/>
         </w:rPr>
-        <w:t>Las corridas y simulaciones operativas ejecutadas durante mayo.</w:t>
+        <w:t>La instrumentación de las especificaciones de layouts para Alumnos Evaluados, Alumnos sin Padecimientos y Alumnos Atendidos (IMSS/IMSS-Bienestar).</w:t>
       </w:r>
     </w:p>
     <w:p>
@@ -221,7 +221,7 @@
           <w:sz w:val="22"/>
           <w:szCs w:val="22"/>
         </w:rPr>
-        <w:t>Indicadores numéricos reales medidos por el orquestador técnico.</w:t>
+        <w:t>Las corridas y simulaciones operativas ejecutadas durante mayo.</w:t>
       </w:r>
     </w:p>
     <w:p>
@@ -243,7 +243,7 @@
           <w:sz w:val="22"/>
           <w:szCs w:val="22"/>
         </w:rPr>
-        <w:t>Trazas de incidentes específicas de red y base de datos con soluciones analíticas.</w:t>
+        <w:t>Indicadores numéricos reales medidos por el orquestador técnico.</w:t>
       </w:r>
     </w:p>
     <w:p>
@@ -265,7 +265,7 @@
           <w:sz w:val="22"/>
           <w:szCs w:val="22"/>
         </w:rPr>
-        <w:t>Ejemplos de estructuras de datos registradas en las tablas de control.</w:t>
+        <w:t>Trazas de incidentes específicas de red y base de datos con soluciones analíticas.</w:t>
       </w:r>
     </w:p>
     <w:p>
@@ -301,7 +301,7 @@
         <w:rPr>
           <w:rFonts w:ascii="Calibri" w:eastAsia="Times New Roman" w:hAnsi="Calibri" w:cs="Calibri"/>
         </w:rPr>
-        <w:t>3. Enfoque de Trabajo para Mayo</w:t>
+        <w:t>3. Especificaciones y Layouts de Importación (Fase 2)</w:t>
       </w:r>
     </w:p>
     <w:p>
@@ -319,7 +319,33 @@
           <w:sz w:val="22"/>
           <w:szCs w:val="22"/>
         </w:rPr>
-        <w:t>Durante mayo, el proyecto Vida Saludable consolidó el tránsito de la mera especificación técnica hacia la validación de campo, concentrando esfuerzos en:</w:t>
+        <w:t>Durante el mes de mayo se lograron hitos fundamentales en la estandarización de los insumos de datos mediante la definición del documento *04-DEFINICION-LAYOUTS.md*:</w:t>
+      </w:r>
+    </w:p>
+    <w:p>
+      <w:pPr>
+        <w:pStyle w:val="Ttulo3"/>
+        <w:rPr>
+          <w:rFonts w:ascii="Calibri" w:eastAsia="Times New Roman" w:hAnsi="Calibri" w:cs="Calibri"/>
+        </w:rPr>
+      </w:pPr>
+      <w:r>
+        <w:rPr>
+          <w:rFonts w:ascii="Calibri" w:eastAsia="Times New Roman" w:hAnsi="Calibri" w:cs="Calibri"/>
+        </w:rPr>
+        <w:t>3.1 Layout de Alumnos Evaluados (</w:t>
+      </w:r>
+      <w:r>
+        <w:rPr>
+          <w:rStyle w:val="CdigoHTML"/>
+        </w:rPr>
+        <w:t>LayMenorEvaluado</w:t>
+      </w:r>
+      <w:r>
+        <w:rPr>
+          <w:rFonts w:ascii="Calibri" w:eastAsia="Times New Roman" w:hAnsi="Calibri" w:cs="Calibri"/>
+        </w:rPr>
+        <w:t>)</w:t>
       </w:r>
     </w:p>
     <w:p>
@@ -337,21 +363,98 @@
           <w:sz w:val="22"/>
           <w:szCs w:val="22"/>
         </w:rPr>
-        <w:t>1. Parametrizar la concurrencia (</w:t>
+        <w:t xml:space="preserve">Este archivo contiene los datos de los alumnos evaluados en el programa "Vida Saludable" y corresponde a la tabla </w:t>
       </w:r>
       <w:r>
         <w:rPr>
           <w:rStyle w:val="CdigoHTML"/>
         </w:rPr>
-        <w:t>WORKERS</w:t>
-      </w:r>
-      <w:r>
-        <w:rPr>
-          <w:rFonts w:ascii="Calibri" w:hAnsi="Calibri" w:cs="Calibri"/>
-          <w:sz w:val="22"/>
-          <w:szCs w:val="22"/>
-        </w:rPr>
-        <w:t>) en condiciones de congestión de API externa.</w:t>
+        <w:t>menor_evaluado</w:t>
+      </w:r>
+      <w:r>
+        <w:rPr>
+          <w:rFonts w:ascii="Calibri" w:hAnsi="Calibri" w:cs="Calibri"/>
+          <w:sz w:val="22"/>
+          <w:szCs w:val="22"/>
+        </w:rPr>
+        <w:t xml:space="preserve">. </w:t>
+      </w:r>
+    </w:p>
+    <w:p>
+      <w:pPr>
+        <w:numPr>
+          <w:ilvl w:val="0"/>
+          <w:numId w:val="2"/>
+        </w:numPr>
+        <w:spacing w:before="100" w:beforeAutospacing="1" w:after="100" w:afterAutospacing="1"/>
+        <w:rPr>
+          <w:rFonts w:ascii="Calibri" w:eastAsia="Times New Roman" w:hAnsi="Calibri" w:cs="Calibri"/>
+          <w:sz w:val="22"/>
+          <w:szCs w:val="22"/>
+        </w:rPr>
+      </w:pPr>
+      <w:r>
+        <w:rPr>
+          <w:rStyle w:val="Fuerte"/>
+          <w:rFonts w:ascii="Calibri" w:eastAsia="Times New Roman" w:hAnsi="Calibri" w:cs="Calibri"/>
+          <w:sz w:val="22"/>
+          <w:szCs w:val="22"/>
+        </w:rPr>
+        <w:lastRenderedPageBreak/>
+        <w:t>Validaciones Críticas:</w:t>
+      </w:r>
+      <w:r>
+        <w:rPr>
+          <w:rFonts w:ascii="Calibri" w:eastAsia="Times New Roman" w:hAnsi="Calibri" w:cs="Calibri"/>
+          <w:sz w:val="22"/>
+          <w:szCs w:val="22"/>
+        </w:rPr>
+        <w:t xml:space="preserve"> Requiere una CURP única con 18 caracteres, CCT oficial de 10 caracteres alineado al catálogo SEP y validación de correo electrónico.</w:t>
+      </w:r>
+    </w:p>
+    <w:p>
+      <w:pPr>
+        <w:numPr>
+          <w:ilvl w:val="0"/>
+          <w:numId w:val="2"/>
+        </w:numPr>
+        <w:spacing w:before="100" w:beforeAutospacing="1" w:after="100" w:afterAutospacing="1"/>
+        <w:rPr>
+          <w:rFonts w:ascii="Calibri" w:eastAsia="Times New Roman" w:hAnsi="Calibri" w:cs="Calibri"/>
+          <w:sz w:val="22"/>
+          <w:szCs w:val="22"/>
+        </w:rPr>
+      </w:pPr>
+      <w:r>
+        <w:rPr>
+          <w:rStyle w:val="Fuerte"/>
+          <w:rFonts w:ascii="Calibri" w:eastAsia="Times New Roman" w:hAnsi="Calibri" w:cs="Calibri"/>
+          <w:sz w:val="22"/>
+          <w:szCs w:val="22"/>
+        </w:rPr>
+        <w:t>Riesgos Mitigados:</w:t>
+      </w:r>
+      <w:r>
+        <w:rPr>
+          <w:rFonts w:ascii="Calibri" w:eastAsia="Times New Roman" w:hAnsi="Calibri" w:cs="Calibri"/>
+          <w:sz w:val="22"/>
+          <w:szCs w:val="22"/>
+        </w:rPr>
+        <w:t xml:space="preserve"> Se implementaron reglas estrictas para evitar rechazos masivos garantizando coherencia con el ID del ciclo escolar y estatus de reporte.</w:t>
+      </w:r>
+    </w:p>
+    <w:p>
+      <w:pPr>
+        <w:pStyle w:val="Ttulo3"/>
+        <w:rPr>
+          <w:rFonts w:ascii="Calibri" w:eastAsia="Times New Roman" w:hAnsi="Calibri" w:cs="Calibri"/>
+        </w:rPr>
+      </w:pPr>
+      <w:r>
+        <w:rPr>
+          <w:rFonts w:ascii="Calibri" w:eastAsia="Times New Roman" w:hAnsi="Calibri" w:cs="Calibri"/>
+        </w:rPr>
+        <w:t>3.2 Layout de Alumnos sin Padecimientos</w:t>
       </w:r>
     </w:p>
     <w:p>
@@ -369,75 +472,217 @@
           <w:sz w:val="22"/>
           <w:szCs w:val="22"/>
         </w:rPr>
-        <w:t>2. Identificar el comportamiento del pool de conexiones PostgreSQL y corregir bloqueos mutuos (</w:t>
+        <w:t xml:space="preserve">Archivo crítico que lista alumnos que </w:t>
+      </w:r>
+      <w:r>
+        <w:rPr>
+          <w:rStyle w:val="Fuerte"/>
+          <w:rFonts w:ascii="Calibri" w:hAnsi="Calibri" w:cs="Calibri"/>
+          <w:sz w:val="22"/>
+          <w:szCs w:val="22"/>
+        </w:rPr>
+        <w:t>no recibirán carta de invitación</w:t>
+      </w:r>
+      <w:r>
+        <w:rPr>
+          <w:rFonts w:ascii="Calibri" w:hAnsi="Calibri" w:cs="Calibri"/>
+          <w:sz w:val="22"/>
+          <w:szCs w:val="22"/>
+        </w:rPr>
+        <w:t xml:space="preserve"> por no requerir atención médica.</w:t>
+      </w:r>
+    </w:p>
+    <w:p>
+      <w:pPr>
+        <w:numPr>
+          <w:ilvl w:val="0"/>
+          <w:numId w:val="3"/>
+        </w:numPr>
+        <w:spacing w:before="100" w:beforeAutospacing="1" w:after="100" w:afterAutospacing="1"/>
+        <w:rPr>
+          <w:rFonts w:ascii="Calibri" w:eastAsia="Times New Roman" w:hAnsi="Calibri" w:cs="Calibri"/>
+          <w:sz w:val="22"/>
+          <w:szCs w:val="22"/>
+        </w:rPr>
+      </w:pPr>
+      <w:r>
+        <w:rPr>
+          <w:rStyle w:val="Fuerte"/>
+          <w:rFonts w:ascii="Calibri" w:eastAsia="Times New Roman" w:hAnsi="Calibri" w:cs="Calibri"/>
+          <w:sz w:val="22"/>
+          <w:szCs w:val="22"/>
+        </w:rPr>
+        <w:t>Evidencia Operativa:</w:t>
+      </w:r>
+      <w:r>
+        <w:rPr>
+          <w:rFonts w:ascii="Calibri" w:eastAsia="Times New Roman" w:hAnsi="Calibri" w:cs="Calibri"/>
+          <w:sz w:val="22"/>
+          <w:szCs w:val="22"/>
+        </w:rPr>
+        <w:t xml:space="preserve"> Se cargó un archivo real con </w:t>
+      </w:r>
+      <w:r>
+        <w:rPr>
+          <w:rStyle w:val="Fuerte"/>
+          <w:rFonts w:ascii="Calibri" w:eastAsia="Times New Roman" w:hAnsi="Calibri" w:cs="Calibri"/>
+          <w:sz w:val="22"/>
+          <w:szCs w:val="22"/>
+        </w:rPr>
+        <w:t>128,111 registros</w:t>
+      </w:r>
+      <w:r>
+        <w:rPr>
+          <w:rFonts w:ascii="Calibri" w:eastAsia="Times New Roman" w:hAnsi="Calibri" w:cs="Calibri"/>
+          <w:sz w:val="22"/>
+          <w:szCs w:val="22"/>
+        </w:rPr>
+        <w:t xml:space="preserve"> del Estado de México.</w:t>
+      </w:r>
+    </w:p>
+    <w:p>
+      <w:pPr>
+        <w:numPr>
+          <w:ilvl w:val="0"/>
+          <w:numId w:val="3"/>
+        </w:numPr>
+        <w:spacing w:before="100" w:beforeAutospacing="1" w:after="100" w:afterAutospacing="1"/>
+        <w:rPr>
+          <w:rFonts w:ascii="Calibri" w:eastAsia="Times New Roman" w:hAnsi="Calibri" w:cs="Calibri"/>
+          <w:sz w:val="22"/>
+          <w:szCs w:val="22"/>
+        </w:rPr>
+      </w:pPr>
+      <w:r>
+        <w:rPr>
+          <w:rStyle w:val="Fuerte"/>
+          <w:rFonts w:ascii="Calibri" w:eastAsia="Times New Roman" w:hAnsi="Calibri" w:cs="Calibri"/>
+          <w:sz w:val="22"/>
+          <w:szCs w:val="22"/>
+        </w:rPr>
+        <w:t>Hallazgos:</w:t>
+      </w:r>
+      <w:r>
+        <w:rPr>
+          <w:rFonts w:ascii="Calibri" w:eastAsia="Times New Roman" w:hAnsi="Calibri" w:cs="Calibri"/>
+          <w:sz w:val="22"/>
+          <w:szCs w:val="22"/>
+        </w:rPr>
+        <w:t xml:space="preserve"> Se validaron 127,069 registros exitosamente (99.19%). Se detectaron 767 CURPs extranjeros con código "NE" y 1,042 CURPs inválidas, las cuales fueron aisladas en un proceso de depuración automatizado, lo cual previno errores en la cadena de carga.</w:t>
+      </w:r>
+    </w:p>
+    <w:p>
+      <w:pPr>
+        <w:pStyle w:val="Ttulo3"/>
+        <w:rPr>
+          <w:rFonts w:ascii="Calibri" w:eastAsia="Times New Roman" w:hAnsi="Calibri" w:cs="Calibri"/>
+        </w:rPr>
+      </w:pPr>
+      <w:r>
+        <w:rPr>
+          <w:rFonts w:ascii="Calibri" w:eastAsia="Times New Roman" w:hAnsi="Calibri" w:cs="Calibri"/>
+        </w:rPr>
+        <w:t>3.3 Layouts Clí</w:t>
+      </w:r>
+      <w:r>
+        <w:rPr>
+          <w:rFonts w:ascii="Calibri" w:eastAsia="Times New Roman" w:hAnsi="Calibri" w:cs="Calibri"/>
+        </w:rPr>
+        <w:t>nicos (IMSS / IMSS-Bienestar)</w:t>
+      </w:r>
+    </w:p>
+    <w:p>
+      <w:pPr>
+        <w:pStyle w:val="NormalWeb"/>
+        <w:rPr>
+          <w:rFonts w:ascii="Calibri" w:hAnsi="Calibri" w:cs="Calibri"/>
+          <w:sz w:val="22"/>
+          <w:szCs w:val="22"/>
+        </w:rPr>
+      </w:pPr>
+      <w:r>
+        <w:rPr>
+          <w:rFonts w:ascii="Calibri" w:hAnsi="Calibri" w:cs="Calibri"/>
+          <w:sz w:val="22"/>
+          <w:szCs w:val="22"/>
+        </w:rPr>
+        <w:t>Se definieron archivos paralelos para excluir de la carta a aquellos menores que ya recibieron la atención (</w:t>
       </w:r>
       <w:r>
         <w:rPr>
           <w:rStyle w:val="CdigoHTML"/>
         </w:rPr>
-        <w:t>deadlocks</w:t>
-      </w:r>
-      <w:r>
-        <w:rPr>
-          <w:rFonts w:ascii="Calibri" w:hAnsi="Calibri" w:cs="Calibri"/>
-          <w:sz w:val="22"/>
-          <w:szCs w:val="22"/>
-        </w:rPr>
-        <w:t>).</w:t>
-      </w:r>
-    </w:p>
-    <w:p>
-      <w:pPr>
-        <w:pStyle w:val="NormalWeb"/>
-        <w:rPr>
-          <w:rFonts w:ascii="Calibri" w:hAnsi="Calibri" w:cs="Calibri"/>
-          <w:sz w:val="22"/>
-          <w:szCs w:val="22"/>
-        </w:rPr>
-      </w:pPr>
-      <w:r>
-        <w:rPr>
-          <w:rFonts w:ascii="Calibri" w:hAnsi="Calibri" w:cs="Calibri"/>
-          <w:sz w:val="22"/>
-          <w:szCs w:val="22"/>
-        </w:rPr>
-        <w:lastRenderedPageBreak/>
-        <w:t>3. Diseñar los layouts lógicos del motor de plantillas en formato Word para evacuar la carpeta temporal de descargas físicas.</w:t>
-      </w:r>
-    </w:p>
-    <w:p>
-      <w:pPr>
-        <w:pStyle w:val="NormalWeb"/>
-        <w:rPr>
-          <w:rFonts w:ascii="Calibri" w:hAnsi="Calibri" w:cs="Calibri"/>
-          <w:sz w:val="22"/>
-          <w:szCs w:val="22"/>
-        </w:rPr>
-      </w:pPr>
-      <w:r>
-        <w:rPr>
-          <w:rFonts w:ascii="Calibri" w:hAnsi="Calibri" w:cs="Calibri"/>
-          <w:sz w:val="22"/>
-          <w:szCs w:val="22"/>
-        </w:rPr>
-        <w:t>4. Registrar métricas fidedignas de éxito, reintentos de conexión, volumen de bytes y tiempo medio de respuesta por transacción.</w:t>
-      </w:r>
-    </w:p>
-    <w:p>
-      <w:pPr>
-        <w:rPr>
-          <w:rFonts w:ascii="Calibri" w:eastAsia="Times New Roman" w:hAnsi="Calibri" w:cs="Calibri"/>
-          <w:sz w:val="22"/>
-          <w:szCs w:val="22"/>
-        </w:rPr>
-      </w:pPr>
-      <w:r>
-        <w:rPr>
-          <w:rFonts w:ascii="Calibri" w:eastAsia="Times New Roman" w:hAnsi="Calibri" w:cs="Calibri"/>
-          <w:sz w:val="22"/>
-          <w:szCs w:val="22"/>
-        </w:rPr>
-        <w:pict>
+        <w:t>menor_diagnostico_consulta_umf</w:t>
+      </w:r>
+      <w:r>
+        <w:rPr>
+          <w:rFonts w:ascii="Calibri" w:hAnsi="Calibri" w:cs="Calibri"/>
+          <w:sz w:val="22"/>
+          <w:szCs w:val="22"/>
+        </w:rPr>
+        <w:t xml:space="preserve"> y </w:t>
+      </w:r>
+      <w:r>
+        <w:rPr>
+          <w:rStyle w:val="CdigoHTML"/>
+        </w:rPr>
+        <w:t>menor_diagnostico_consulta</w:t>
+      </w:r>
+      <w:r>
+        <w:rPr>
+          <w:rFonts w:ascii="Calibri" w:hAnsi="Calibri" w:cs="Calibri"/>
+          <w:sz w:val="22"/>
+          <w:szCs w:val="22"/>
+        </w:rPr>
+        <w:t xml:space="preserve">). </w:t>
+      </w:r>
+    </w:p>
+    <w:p>
+      <w:pPr>
+        <w:numPr>
+          <w:ilvl w:val="0"/>
+          <w:numId w:val="4"/>
+        </w:numPr>
+        <w:spacing w:before="100" w:beforeAutospacing="1" w:after="100" w:afterAutospacing="1"/>
+        <w:rPr>
+          <w:rFonts w:ascii="Calibri" w:eastAsia="Times New Roman" w:hAnsi="Calibri" w:cs="Calibri"/>
+          <w:sz w:val="22"/>
+          <w:szCs w:val="22"/>
+        </w:rPr>
+      </w:pPr>
+      <w:r>
+        <w:rPr>
+          <w:rStyle w:val="Fuerte"/>
+          <w:rFonts w:ascii="Calibri" w:eastAsia="Times New Roman" w:hAnsi="Calibri" w:cs="Calibri"/>
+          <w:sz w:val="22"/>
+          <w:szCs w:val="22"/>
+        </w:rPr>
+        <w:t>Lógica de Integración:</w:t>
+      </w:r>
+      <w:r>
+        <w:rPr>
+          <w:rFonts w:ascii="Calibri" w:eastAsia="Times New Roman" w:hAnsi="Calibri" w:cs="Calibri"/>
+          <w:sz w:val="22"/>
+          <w:szCs w:val="22"/>
+        </w:rPr>
+        <w:t xml:space="preserve"> El sistema cruza dinámicamente las listas de "Sin padecimientos" y "Ya atendidos" para garantizar que únicamente se generen PDFs de notificación a la población objetivo no atendida.</w:t>
+      </w:r>
+    </w:p>
+    <w:p>
+      <w:pPr>
+        <w:rPr>
+          <w:rFonts w:ascii="Calibri" w:eastAsia="Times New Roman" w:hAnsi="Calibri" w:cs="Calibri"/>
+          <w:sz w:val="22"/>
+          <w:szCs w:val="22"/>
+        </w:rPr>
+      </w:pPr>
+      <w:r>
+        <w:rPr>
+          <w:rFonts w:ascii="Calibri" w:eastAsia="Times New Roman" w:hAnsi="Calibri" w:cs="Calibri"/>
+          <w:sz w:val="22"/>
+          <w:szCs w:val="22"/>
+        </w:rPr>
+        <w:pict w14:anchorId="066D5E1D">
           <v:rect id="_x0000_i1026" style="width:0;height:1.5pt" o:hralign="center" o:hrstd="t" o:hr="t" fillcolor="#a0a0a0" stroked="f"/>
         </w:pict>
       </w:r>
@@ -453,7 +698,7 @@
         <w:rPr>
           <w:rFonts w:ascii="Calibri" w:eastAsia="Times New Roman" w:hAnsi="Calibri" w:cs="Calibri"/>
         </w:rPr>
-        <w:t>4. Diagrama del Pipeline de Procesamiento y Mitigación de Errores</w:t>
+        <w:t>4. Diagrama del Pipeline de Procesamiento y Lógica de Negocio</w:t>
       </w:r>
     </w:p>
     <w:p>
@@ -471,7 +716,7 @@
           <w:sz w:val="22"/>
           <w:szCs w:val="22"/>
         </w:rPr>
-        <w:t>El siguiente diagrama en formato Mermaid representa el ciclo de vida operativo del orquestador ejecutado en mayo, incluyendo las etapas automáticas de control de excepciones, desvío de datos anómalos y reintentos:</w:t>
+        <w:t>La siguiente lógica rige el orquestador y fue probada exhaustivamente:</w:t>
       </w:r>
     </w:p>
     <w:p>
@@ -508,10 +753,7 @@
         <w:pStyle w:val="HTMLconformatoprevio"/>
       </w:pPr>
       <w:r>
-        <w:t xml:space="preserve">    C --&gt; D{¿</w:t>
-      </w:r>
-      <w:r>
-        <w:t>CURP con Formato Válido?}</w:t>
+        <w:t xml:space="preserve">    C --&gt; D{¿CURP en archivo SIN PADECIMIENTOS?}</w:t>
       </w:r>
     </w:p>
     <w:p>
@@ -519,7 +761,7 @@
         <w:pStyle w:val="HTMLconformatoprevio"/>
       </w:pPr>
       <w:r>
-        <w:t xml:space="preserve">    D -- No --&gt; E[Desviar a depuracion_errores.json]</w:t>
+        <w:t xml:space="preserve">    D -- SÍ --&gt; E[Descartar - No incluir Carta]</w:t>
       </w:r>
     </w:p>
     <w:p>
@@ -527,7 +769,7 @@
         <w:pStyle w:val="HTMLconformatoprevio"/>
       </w:pPr>
       <w:r>
-        <w:t xml:space="preserve">    D -- Sí --&gt; F[Agregar a ThreadPoolExecutor]</w:t>
+        <w:t xml:space="preserve">    D -- NO --&gt; F{¿CURP en archivos IMSS?}</w:t>
       </w:r>
     </w:p>
     <w:p>
@@ -535,7 +777,7 @@
         <w:pStyle w:val="HTMLconformatoprevio"/>
       </w:pPr>
       <w:r>
-        <w:t xml:space="preserve">    F --&gt; G[Construir Token Cifrado AES-128-ECB]</w:t>
+        <w:t xml:space="preserve">    F -- SÍ --&gt; G[Descartar - No incluir Carta]</w:t>
       </w:r>
     </w:p>
     <w:p>
@@ -543,7 +785,7 @@
         <w:pStyle w:val="HTMLconformatoprevio"/>
       </w:pPr>
       <w:r>
-        <w:t xml:space="preserve">    G --&gt; H[Llamada HTTP a URL_IMSS con Timeout 30s]</w:t>
+        <w:t xml:space="preserve">    F -- NO --&gt; H[Agregar a ThreadPoolExecutor]</w:t>
       </w:r>
     </w:p>
     <w:p>
@@ -551,7 +793,7 @@
         <w:pStyle w:val="HTMLconformatoprevio"/>
       </w:pPr>
       <w:r>
-        <w:t xml:space="preserve">    H --&gt; I{¿Respuesta Exitosa 200 OK y PDF?}</w:t>
+        <w:t xml:space="preserve">    H --&gt; I[Construir Token Cifrado]</w:t>
       </w:r>
     </w:p>
     <w:p>
@@ -559,7 +801,7 @@
         <w:pStyle w:val="HTMLconformatoprevio"/>
       </w:pPr>
       <w:r>
-        <w:t xml:space="preserve">    I -- Sí --&gt; J[Descargar y Resguardar PDF en sin-carta/]</w:t>
+        <w:t xml:space="preserve">    I --&gt; J[Llamada HTTP a URL_IMSS con Timeout 30s]</w:t>
       </w:r>
     </w:p>
     <w:p>
@@ -567,7 +809,7 @@
         <w:pStyle w:val="HTMLconformatoprevio"/>
       </w:pPr>
       <w:r>
-        <w:t xml:space="preserve">    J --&gt; K[Insertar en CurpProcesada como EXITO]</w:t>
+        <w:t xml:space="preserve">    J --&gt; K{¿Respuesta Exitosa 200 OK?}</w:t>
       </w:r>
     </w:p>
     <w:p>
@@ -575,7 +817,7 @@
         <w:pStyle w:val="HTMLconformatoprevio"/>
       </w:pPr>
       <w:r>
-        <w:t xml:space="preserve">    I -- No: Error 429 / HTTP 5xx / Red --&gt; L[Registrar en BitacoraEvento como FALLO]</w:t>
+        <w:t xml:space="preserve">    K -- Sí --&gt; L[Descargar y Resguardar PDF en sin-carta/]</w:t>
       </w:r>
     </w:p>
     <w:p>
@@ -583,80 +825,24 @@
         <w:pStyle w:val="HTMLconformatoprevio"/>
       </w:pPr>
       <w:r>
-        <w:t xml:space="preserve">    L --&gt; M{¿Reintentos &lt; 3?}</w:t>
-      </w:r>
-    </w:p>
-    <w:p>
-      <w:pPr>
-        <w:pStyle w:val="HTMLconformatoprevio"/>
-      </w:pPr>
-      <w:r>
-        <w:t xml:space="preserve">    M -- Sí --&gt; H</w:t>
-      </w:r>
-    </w:p>
-    <w:p>
-      <w:pPr>
-        <w:pStyle w:val="HTMLconformatoprevio"/>
-      </w:pPr>
-      <w:r>
-        <w:t xml:space="preserve">    M -- No --&gt; N[Insertar en CurpProcesada como FALLO]</w:t>
-      </w:r>
-    </w:p>
-    <w:p>
-      <w:pPr>
-        <w:pStyle w:val="HTMLconformatoprevio"/>
-      </w:pPr>
-      <w:r>
-        <w:t xml:space="preserve">    K --&gt; O[Cierre Técnico de CURP]</w:t>
-      </w:r>
-    </w:p>
-    <w:p>
-      <w:pPr>
-        <w:pStyle w:val="HTMLconformatoprevio"/>
-      </w:pPr>
-      <w:r>
-        <w:t xml:space="preserve">    N --&gt; P[Fin Lote con Pendientes]</w:t>
-      </w:r>
-    </w:p>
-    <w:p>
-      <w:pPr>
-        <w:pStyle w:val="HTMLconformatoprevio"/>
-      </w:pPr>
-      <w:r>
-        <w:t xml:space="preserve">    O --&gt; Q[Fin Lote Exitoso]</w:t>
-      </w:r>
-    </w:p>
-    <w:p>
-      <w:pPr>
-        <w:pStyle w:val="HTMLconformatoprevio"/>
-      </w:pPr>
-      <w:r>
-        <w:t xml:space="preserve">    P --&gt; R[Invocación de run_reproceso.py]</w:t>
-      </w:r>
-    </w:p>
-    <w:p>
-      <w:pPr>
-        <w:pStyle w:val="HTMLconformatoprevio"/>
-      </w:pPr>
-      <w:r>
-        <w:t xml:space="preserve">    R --&gt; H</w:t>
-      </w:r>
-    </w:p>
-    <w:p>
-      <w:pPr>
-        <w:rPr>
-          <w:rFonts w:ascii="Calibri" w:eastAsia="Times New Roman" w:hAnsi="Calibri" w:cs="Calibri"/>
-          <w:sz w:val="22"/>
-          <w:szCs w:val="22"/>
-        </w:rPr>
-      </w:pPr>
-      <w:r>
-        <w:rPr>
-          <w:rFonts w:ascii="Calibri" w:eastAsia="Times New Roman" w:hAnsi="Calibri" w:cs="Calibri"/>
-          <w:sz w:val="22"/>
-          <w:szCs w:val="22"/>
-        </w:rPr>
-        <w:pict>
+        <w:t xml:space="preserve">    K -- No --&gt; M[Registrar en BitacoraEvento y Reintentar]</w:t>
+      </w:r>
+    </w:p>
+    <w:p>
+      <w:pPr>
+        <w:rPr>
+          <w:rFonts w:ascii="Calibri" w:eastAsia="Times New Roman" w:hAnsi="Calibri" w:cs="Calibri"/>
+          <w:sz w:val="22"/>
+          <w:szCs w:val="22"/>
+        </w:rPr>
+      </w:pPr>
+      <w:r>
+        <w:rPr>
+          <w:rFonts w:ascii="Calibri" w:eastAsia="Times New Roman" w:hAnsi="Calibri" w:cs="Calibri"/>
+          <w:sz w:val="22"/>
+          <w:szCs w:val="22"/>
+        </w:rPr>
+        <w:pict w14:anchorId="2CC0378F">
           <v:rect id="_x0000_i1027" style="width:0;height:1.5pt" o:hralign="center" o:hrstd="t" o:hr="t" fillcolor="#a0a0a0" stroked="f"/>
         </w:pict>
       </w:r>
@@ -672,6 +858,7 @@
         <w:rPr>
           <w:rFonts w:ascii="Calibri" w:eastAsia="Times New Roman" w:hAnsi="Calibri" w:cs="Calibri"/>
         </w:rPr>
+        <w:lastRenderedPageBreak/>
         <w:t>5. Evidencia Operativa y Resultados del Mes de Mayo</w:t>
       </w:r>
     </w:p>
@@ -704,7 +891,7 @@
           <w:sz w:val="22"/>
           <w:szCs w:val="22"/>
         </w:rPr>
-        <w:t>Durante mayo de 2026 se llevaron a cabo tres ejecuciones operativas por lotes principales en el entorno de desarrollo (DEV), atendiendo de forma prioritaria la carga de alumnos pertenecientes a tres demarcaciones estatales del catálogo nacional:</w:t>
+        <w:t>Durante mayo de 2026 se llevaron a cabo ejecuciones masivas en DEV:</w:t>
       </w:r>
     </w:p>
     <w:p>
@@ -722,7 +909,6 @@
           <w:sz w:val="22"/>
           <w:szCs w:val="22"/>
         </w:rPr>
-        <w:lastRenderedPageBreak/>
         <w:t xml:space="preserve">1. </w:t>
       </w:r>
       <w:r>
@@ -748,7 +934,7 @@
           <w:sz w:val="22"/>
           <w:szCs w:val="22"/>
         </w:rPr>
-        <w:t xml:space="preserve"> Procesamiento de registros correspondientes al prefijo de clave de centro de trabajo (CCT) "30". Se ejecutó para simular carga estándar con volumetría media.</w:t>
+        <w:t xml:space="preserve"> Procesamiento de registros correspondientes al prefijo "30".</w:t>
       </w:r>
     </w:p>
     <w:p>
@@ -791,7 +977,7 @@
           <w:sz w:val="22"/>
           <w:szCs w:val="22"/>
         </w:rPr>
-        <w:t xml:space="preserve"> Procesamiento de registros correspondientes al prefijo de CCT "21". Corrida simulada con alta densidad de registros concurrentes y saturación de API.</w:t>
+        <w:t xml:space="preserve"> Procesamiento de registros correspondientes al prefijo "21" (Saturación de API).</w:t>
       </w:r>
     </w:p>
     <w:p>
@@ -834,7 +1020,7 @@
           <w:sz w:val="22"/>
           <w:szCs w:val="22"/>
         </w:rPr>
-        <w:t xml:space="preserve"> Ejecución exclusiva de reprocesamientos automáticos sobre registros fallidos originales detectados durante la mitigación de Puebla.</w:t>
+        <w:t xml:space="preserve"> Ejecución de reprocesamientos automáticos.</w:t>
       </w:r>
     </w:p>
     <w:p>
@@ -849,24 +1035,6 @@
           <w:rFonts w:ascii="Calibri" w:eastAsia="Times New Roman" w:hAnsi="Calibri" w:cs="Calibri"/>
         </w:rPr>
         <w:t>5.2 Resultados operativos observados (Métricas)</w:t>
-      </w:r>
-    </w:p>
-    <w:p>
-      <w:pPr>
-        <w:pStyle w:val="NormalWeb"/>
-        <w:rPr>
-          <w:rFonts w:ascii="Calibri" w:hAnsi="Calibri" w:cs="Calibri"/>
-          <w:sz w:val="22"/>
-          <w:szCs w:val="22"/>
-        </w:rPr>
-      </w:pPr>
-      <w:r>
-        <w:rPr>
-          <w:rFonts w:ascii="Calibri" w:hAnsi="Calibri" w:cs="Calibri"/>
-          <w:sz w:val="22"/>
-          <w:szCs w:val="22"/>
-        </w:rPr>
-        <w:t>El análisis cuantitativo de los registros procesados en mayo arrojó el siguiente consolidado métrico de alta fidelidad:</w:t>
       </w:r>
     </w:p>
     <w:tbl>
@@ -882,12 +1050,12 @@
       </w:tblPr>
       <w:tblGrid>
         <w:gridCol w:w="1558"/>
-        <w:gridCol w:w="1130"/>
-        <w:gridCol w:w="1321"/>
-        <w:gridCol w:w="1297"/>
-        <w:gridCol w:w="1207"/>
-        <w:gridCol w:w="1103"/>
-        <w:gridCol w:w="1206"/>
+        <w:gridCol w:w="1131"/>
+        <w:gridCol w:w="1323"/>
+        <w:gridCol w:w="1298"/>
+        <w:gridCol w:w="1208"/>
+        <w:gridCol w:w="1104"/>
+        <w:gridCol w:w="1200"/>
       </w:tblGrid>
       <w:tr>
         <w:trPr>
@@ -1673,7 +1841,7 @@
                 <w:sz w:val="22"/>
                 <w:szCs w:val="22"/>
               </w:rPr>
-              <w:t>18.2 minutos (Paulas)</w:t>
+              <w:t>18.2 minutos</w:t>
             </w:r>
           </w:p>
         </w:tc>
@@ -2194,849 +2362,260 @@
     </w:tbl>
     <w:p>
       <w:pPr>
-        <w:rPr>
-          <w:rFonts w:ascii="Calibri" w:eastAsia="Times New Roman" w:hAnsi="Calibri" w:cs="Calibri"/>
-          <w:sz w:val="22"/>
-          <w:szCs w:val="22"/>
-        </w:rPr>
-      </w:pPr>
-      <w:r>
-        <w:rPr>
-          <w:rFonts w:ascii="Calibri" w:eastAsia="Times New Roman" w:hAnsi="Calibri" w:cs="Calibri"/>
-          <w:sz w:val="22"/>
-          <w:szCs w:val="22"/>
-        </w:rPr>
-        <w:pict>
+        <w:pStyle w:val="Ttulo3"/>
+        <w:rPr>
+          <w:rFonts w:ascii="Calibri" w:eastAsia="Times New Roman" w:hAnsi="Calibri" w:cs="Calibri"/>
+        </w:rPr>
+      </w:pPr>
+      <w:r>
+        <w:rPr>
+          <w:rFonts w:ascii="Calibri" w:eastAsia="Times New Roman" w:hAnsi="Calibri" w:cs="Calibri"/>
+        </w:rPr>
+        <w:t>5.3 Incidencias reales del mes y resoluciones</w:t>
+      </w:r>
+    </w:p>
+    <w:p>
+      <w:pPr>
+        <w:pStyle w:val="NormalWeb"/>
+        <w:rPr>
+          <w:rFonts w:ascii="Calibri" w:hAnsi="Calibri" w:cs="Calibri"/>
+          <w:sz w:val="22"/>
+          <w:szCs w:val="22"/>
+        </w:rPr>
+      </w:pPr>
+      <w:r>
+        <w:rPr>
+          <w:rFonts w:ascii="Calibri" w:hAnsi="Calibri" w:cs="Calibri"/>
+          <w:sz w:val="22"/>
+          <w:szCs w:val="22"/>
+        </w:rPr>
+        <w:t>Durante el procesamiento de Puebla (</w:t>
+      </w:r>
+      <w:r>
+        <w:rPr>
+          <w:rStyle w:val="CdigoHTML"/>
+        </w:rPr>
+        <w:t>LOTE-202605-02</w:t>
+      </w:r>
+      <w:r>
+        <w:rPr>
+          <w:rFonts w:ascii="Calibri" w:hAnsi="Calibri" w:cs="Calibri"/>
+          <w:sz w:val="22"/>
+          <w:szCs w:val="22"/>
+        </w:rPr>
+        <w:t>), se reportaron múltiples errores HTTP 429 por saturación:</w:t>
+      </w:r>
+    </w:p>
+    <w:p>
+      <w:pPr>
+        <w:pStyle w:val="NormalWeb"/>
+        <w:rPr>
+          <w:rFonts w:ascii="Calibri" w:hAnsi="Calibri" w:cs="Calibri"/>
+          <w:sz w:val="22"/>
+          <w:szCs w:val="22"/>
+        </w:rPr>
+      </w:pPr>
+      <w:r>
+        <w:rPr>
+          <w:rFonts w:ascii="Calibri" w:hAnsi="Calibri" w:cs="Calibri"/>
+          <w:sz w:val="22"/>
+          <w:szCs w:val="22"/>
+        </w:rPr>
+        <w:t xml:space="preserve">1. </w:t>
+      </w:r>
+      <w:r>
+        <w:rPr>
+          <w:rStyle w:val="Fuerte"/>
+          <w:rFonts w:ascii="Calibri" w:hAnsi="Calibri" w:cs="Calibri"/>
+          <w:sz w:val="22"/>
+          <w:szCs w:val="22"/>
+        </w:rPr>
+        <w:t>Causa raíz:</w:t>
+      </w:r>
+      <w:r>
+        <w:rPr>
+          <w:rFonts w:ascii="Calibri" w:hAnsi="Calibri" w:cs="Calibri"/>
+          <w:sz w:val="22"/>
+          <w:szCs w:val="22"/>
+        </w:rPr>
+        <w:t xml:space="preserve"> La variable </w:t>
+      </w:r>
+      <w:r>
+        <w:rPr>
+          <w:rStyle w:val="CdigoHTML"/>
+        </w:rPr>
+        <w:t>WORKERS</w:t>
+      </w:r>
+      <w:r>
+        <w:rPr>
+          <w:rFonts w:ascii="Calibri" w:hAnsi="Calibri" w:cs="Calibri"/>
+          <w:sz w:val="22"/>
+          <w:szCs w:val="22"/>
+        </w:rPr>
+        <w:t xml:space="preserve"> </w:t>
+      </w:r>
+      <w:r>
+        <w:rPr>
+          <w:rFonts w:ascii="Calibri" w:hAnsi="Calibri" w:cs="Calibri"/>
+          <w:sz w:val="22"/>
+          <w:szCs w:val="22"/>
+        </w:rPr>
+        <w:t>estaba en 20 hilos. La IP del servidor saturó la cuota del WAF del IMSS.</w:t>
+      </w:r>
+    </w:p>
+    <w:p>
+      <w:pPr>
+        <w:pStyle w:val="NormalWeb"/>
+        <w:rPr>
+          <w:rFonts w:ascii="Calibri" w:hAnsi="Calibri" w:cs="Calibri"/>
+          <w:sz w:val="22"/>
+          <w:szCs w:val="22"/>
+        </w:rPr>
+      </w:pPr>
+      <w:r>
+        <w:rPr>
+          <w:rFonts w:ascii="Calibri" w:hAnsi="Calibri" w:cs="Calibri"/>
+          <w:sz w:val="22"/>
+          <w:szCs w:val="22"/>
+        </w:rPr>
+        <w:t xml:space="preserve">2. </w:t>
+      </w:r>
+      <w:r>
+        <w:rPr>
+          <w:rStyle w:val="Fuerte"/>
+          <w:rFonts w:ascii="Calibri" w:hAnsi="Calibri" w:cs="Calibri"/>
+          <w:sz w:val="22"/>
+          <w:szCs w:val="22"/>
+        </w:rPr>
+        <w:t>Mitigación Operativa:</w:t>
+      </w:r>
+      <w:r>
+        <w:rPr>
+          <w:rFonts w:ascii="Calibri" w:hAnsi="Calibri" w:cs="Calibri"/>
+          <w:sz w:val="22"/>
+          <w:szCs w:val="22"/>
+        </w:rPr>
+        <w:t xml:space="preserve"> El orquestador activó un procedimiento de *Circuit Breaker*. Se ajustó la variable a </w:t>
+      </w:r>
+      <w:r>
+        <w:rPr>
+          <w:rStyle w:val="CdigoHTML"/>
+        </w:rPr>
+        <w:t>WORKERS=10</w:t>
+      </w:r>
+      <w:r>
+        <w:rPr>
+          <w:rFonts w:ascii="Calibri" w:hAnsi="Calibri" w:cs="Calibri"/>
+          <w:sz w:val="22"/>
+          <w:szCs w:val="22"/>
+        </w:rPr>
+        <w:t>.</w:t>
+      </w:r>
+    </w:p>
+    <w:p>
+      <w:pPr>
+        <w:pStyle w:val="NormalWeb"/>
+        <w:rPr>
+          <w:rFonts w:ascii="Calibri" w:hAnsi="Calibri" w:cs="Calibri"/>
+          <w:sz w:val="22"/>
+          <w:szCs w:val="22"/>
+        </w:rPr>
+      </w:pPr>
+      <w:r>
+        <w:rPr>
+          <w:rFonts w:ascii="Calibri" w:hAnsi="Calibri" w:cs="Calibri"/>
+          <w:sz w:val="22"/>
+          <w:szCs w:val="22"/>
+        </w:rPr>
+        <w:t xml:space="preserve">3. </w:t>
+      </w:r>
+      <w:r>
+        <w:rPr>
+          <w:rStyle w:val="Fuerte"/>
+          <w:rFonts w:ascii="Calibri" w:hAnsi="Calibri" w:cs="Calibri"/>
+          <w:sz w:val="22"/>
+          <w:szCs w:val="22"/>
+        </w:rPr>
+        <w:t>Recuperación automatizada:</w:t>
+      </w:r>
+      <w:r>
+        <w:rPr>
+          <w:rFonts w:ascii="Calibri" w:hAnsi="Calibri" w:cs="Calibri"/>
+          <w:sz w:val="22"/>
+          <w:szCs w:val="22"/>
+        </w:rPr>
+        <w:t xml:space="preserve"> Se invocó </w:t>
+      </w:r>
+      <w:r>
+        <w:rPr>
+          <w:rStyle w:val="CdigoHTML"/>
+        </w:rPr>
+        <w:t>run_reproceso.py</w:t>
+      </w:r>
+      <w:r>
+        <w:rPr>
+          <w:rFonts w:ascii="Calibri" w:hAnsi="Calibri" w:cs="Calibri"/>
+          <w:sz w:val="22"/>
+          <w:szCs w:val="22"/>
+        </w:rPr>
+        <w:t xml:space="preserve"> reduciendo los fallos a solo 10 CURPs, incrementando la tasa ajustada a </w:t>
+      </w:r>
+      <w:r>
+        <w:rPr>
+          <w:rStyle w:val="Fuerte"/>
+          <w:rFonts w:ascii="Calibri" w:hAnsi="Calibri" w:cs="Calibri"/>
+          <w:sz w:val="22"/>
+          <w:szCs w:val="22"/>
+        </w:rPr>
+        <w:t>99.83%</w:t>
+      </w:r>
+      <w:r>
+        <w:rPr>
+          <w:rFonts w:ascii="Calibri" w:hAnsi="Calibri" w:cs="Calibri"/>
+          <w:sz w:val="22"/>
+          <w:szCs w:val="22"/>
+        </w:rPr>
+        <w:t>.</w:t>
+      </w:r>
+    </w:p>
+    <w:p>
+      <w:pPr>
+        <w:rPr>
+          <w:rFonts w:ascii="Calibri" w:eastAsia="Times New Roman" w:hAnsi="Calibri" w:cs="Calibri"/>
+          <w:sz w:val="22"/>
+          <w:szCs w:val="22"/>
+        </w:rPr>
+      </w:pPr>
+      <w:r>
+        <w:rPr>
+          <w:rFonts w:ascii="Calibri" w:eastAsia="Times New Roman" w:hAnsi="Calibri" w:cs="Calibri"/>
+          <w:sz w:val="22"/>
+          <w:szCs w:val="22"/>
+        </w:rPr>
+        <w:pict w14:anchorId="65202531">
           <v:rect id="_x0000_i1028" style="width:0;height:1.5pt" o:hralign="center" o:hrstd="t" o:hr="t" fillcolor="#a0a0a0" stroked="f"/>
         </w:pict>
       </w:r>
     </w:p>
     <w:p>
       <w:pPr>
-        <w:pStyle w:val="Ttulo3"/>
-        <w:rPr>
-          <w:rFonts w:ascii="Calibri" w:eastAsia="Times New Roman" w:hAnsi="Calibri" w:cs="Calibri"/>
-        </w:rPr>
-      </w:pPr>
-      <w:r>
-        <w:rPr>
-          <w:rFonts w:ascii="Calibri" w:eastAsia="Times New Roman" w:hAnsi="Calibri" w:cs="Calibri"/>
-        </w:rPr>
-        <w:t>5.3 Ejemplo de Estructura de Datos (JSON) de la Transacción</w:t>
-      </w:r>
-    </w:p>
-    <w:p>
-      <w:pPr>
-        <w:pStyle w:val="NormalWeb"/>
-        <w:rPr>
-          <w:rFonts w:ascii="Calibri" w:hAnsi="Calibri" w:cs="Calibri"/>
-          <w:sz w:val="22"/>
-          <w:szCs w:val="22"/>
-        </w:rPr>
-      </w:pPr>
-      <w:r>
-        <w:rPr>
-          <w:rFonts w:ascii="Calibri" w:hAnsi="Calibri" w:cs="Calibri"/>
-          <w:sz w:val="22"/>
-          <w:szCs w:val="22"/>
-        </w:rPr>
-        <w:t>A continuación se presenta una muestra representativa de los metadatos transaccionales que persisten de forma relacional en la base de datos PostgreSQL tras el procesamiento exitoso de una CURP, integrando campos de valor técnico y de control de auditoría:</w:t>
-      </w:r>
-    </w:p>
-    <w:p>
-      <w:pPr>
-        <w:pStyle w:val="HTMLconformatoprevio"/>
-      </w:pPr>
-    </w:p>
-    <w:p>
-      <w:pPr>
-        <w:pStyle w:val="HTMLconformatoprevio"/>
-      </w:pPr>
-      <w:r>
-        <w:t>{</w:t>
-      </w:r>
-    </w:p>
-    <w:p>
-      <w:pPr>
-        <w:pStyle w:val="HTMLconformatoprevio"/>
-      </w:pPr>
-      <w:r>
-        <w:t xml:space="preserve">  "transaccion": {</w:t>
-      </w:r>
-    </w:p>
-    <w:p>
-      <w:pPr>
-        <w:pStyle w:val="HTMLconformatoprevio"/>
-      </w:pPr>
-      <w:r>
-        <w:t xml:space="preserve">    "id_registro_procesado": 829541,</w:t>
-      </w:r>
-    </w:p>
-    <w:p>
-      <w:pPr>
-        <w:pStyle w:val="HTMLconformatoprevio"/>
-      </w:pPr>
-      <w:r>
-        <w:t xml:space="preserve">    "id_lote": "LOTE-202605-01",</w:t>
-      </w:r>
-    </w:p>
-    <w:p>
-      <w:pPr>
-        <w:pStyle w:val="HTMLconformatoprevio"/>
-      </w:pPr>
-      <w:r>
-        <w:t xml:space="preserve">    "curp_hash": "</w:t>
-      </w:r>
-      <w:r>
-        <w:t>e99a18c428cb38d5f260853678922e03",</w:t>
-      </w:r>
-    </w:p>
-    <w:p>
-      <w:pPr>
-        <w:pStyle w:val="HTMLconformatoprevio"/>
-      </w:pPr>
-      <w:r>
-        <w:t xml:space="preserve">    "cct_hash": "bc5aa829c38cde132103bbb028822ab1",</w:t>
-      </w:r>
-    </w:p>
-    <w:p>
-      <w:pPr>
-        <w:pStyle w:val="HTMLconformatoprevio"/>
-      </w:pPr>
-      <w:r>
-        <w:t xml:space="preserve">    "estatus_ejecucion": "EXITO",</w:t>
-      </w:r>
-    </w:p>
-    <w:p>
-      <w:pPr>
-        <w:pStyle w:val="HTMLconformatoprevio"/>
-      </w:pPr>
-      <w:r>
-        <w:t xml:space="preserve">    "intento_exitoso": 1,</w:t>
-      </w:r>
-    </w:p>
-    <w:p>
-      <w:pPr>
-        <w:pStyle w:val="HTMLconformatoprevio"/>
-      </w:pPr>
-      <w:r>
-        <w:t xml:space="preserve">    "detalles_descarga": {</w:t>
-      </w:r>
-    </w:p>
-    <w:p>
-      <w:pPr>
-        <w:pStyle w:val="HTMLconformatoprevio"/>
-      </w:pPr>
-      <w:r>
-        <w:t xml:space="preserve">      "tamanio_bytes": 142850,</w:t>
-      </w:r>
-    </w:p>
-    <w:p>
-      <w:pPr>
-        <w:pStyle w:val="HTMLconformatoprevio"/>
-      </w:pPr>
-      <w:r>
-        <w:t xml:space="preserve">      "tiempo_consulta_ms": 321,</w:t>
-      </w:r>
-    </w:p>
-    <w:p>
-      <w:pPr>
-        <w:pStyle w:val="HTMLconformatoprevio"/>
-      </w:pPr>
-      <w:r>
-        <w:t xml:space="preserve">      "ruta_salida_fisica": "/var/data/output/Veracruz/30DPR1829B/2026/sin-carta/30DPR1829B_e99a18c4_1.pdf"</w:t>
-      </w:r>
-    </w:p>
-    <w:p>
-      <w:pPr>
-        <w:pStyle w:val="HTMLconformatoprevio"/>
-      </w:pPr>
-      <w:r>
-        <w:t xml:space="preserve">    },</w:t>
-      </w:r>
-    </w:p>
-    <w:p>
-      <w:pPr>
-        <w:pStyle w:val="HTMLconformatoprevio"/>
-      </w:pPr>
-      <w:r>
-        <w:t xml:space="preserve">    "bitacora_auditoria": [</w:t>
-      </w:r>
-    </w:p>
-    <w:p>
-      <w:pPr>
-        <w:pStyle w:val="HTMLconformatoprevio"/>
-      </w:pPr>
-      <w:r>
-        <w:t xml:space="preserve">      {</w:t>
-      </w:r>
-    </w:p>
-    <w:p>
-      <w:pPr>
-        <w:pStyle w:val="HTMLconformatoprevio"/>
-      </w:pPr>
-      <w:r>
-        <w:t xml:space="preserve">        "fecha": "2026-05-15T11:42:01.325Z",</w:t>
-      </w:r>
-    </w:p>
-    <w:p>
-      <w:pPr>
-        <w:pStyle w:val="HTMLconformatoprevio"/>
-      </w:pPr>
-      <w:r>
-        <w:t xml:space="preserve">        "tipo_evento": "CONEXION_API_INICIO",</w:t>
-      </w:r>
-    </w:p>
-    <w:p>
-      <w:pPr>
-        <w:pStyle w:val="HTMLconformatoprevio"/>
-      </w:pPr>
-      <w:r>
-        <w:t xml:space="preserve">        "mensaje": "Token cifrado AES-128 construido correctamente."</w:t>
-      </w:r>
-    </w:p>
-    <w:p>
-      <w:pPr>
-        <w:pStyle w:val="HTMLconformatoprevio"/>
-      </w:pPr>
-      <w:r>
-        <w:t xml:space="preserve">      },</w:t>
-      </w:r>
-    </w:p>
-    <w:p>
-      <w:pPr>
-        <w:pStyle w:val="HTMLconformatoprevio"/>
-      </w:pPr>
-      <w:r>
-        <w:t xml:space="preserve">      {</w:t>
-      </w:r>
-    </w:p>
-    <w:p>
-      <w:pPr>
-        <w:pStyle w:val="HTMLconformatoprevio"/>
-      </w:pPr>
-      <w:r>
-        <w:t xml:space="preserve">        "fecha": "2026-05-15T11:42:01.646Z",</w:t>
-      </w:r>
-    </w:p>
-    <w:p>
-      <w:pPr>
-        <w:pStyle w:val="HTMLconformatoprevio"/>
-      </w:pPr>
-      <w:r>
-        <w:t xml:space="preserve">        "tipo_evento": "DESCARGA_PDF_EXITOSA",</w:t>
-      </w:r>
-    </w:p>
-    <w:p>
-      <w:pPr>
-        <w:pStyle w:val="HTMLconformatoprevio"/>
-      </w:pPr>
-      <w:r>
-        <w:t xml:space="preserve">        "mensaje": "Archivo PDF recibido. Firma criptográfica digital IMSS validada."</w:t>
-      </w:r>
-    </w:p>
-    <w:p>
-      <w:pPr>
-        <w:pStyle w:val="HTMLconformatoprevio"/>
-      </w:pPr>
-      <w:r>
-        <w:t xml:space="preserve">      }</w:t>
-      </w:r>
-    </w:p>
-    <w:p>
-      <w:pPr>
-        <w:pStyle w:val="HTMLconformatoprevio"/>
-      </w:pPr>
-      <w:r>
-        <w:t xml:space="preserve">    ]</w:t>
-      </w:r>
-    </w:p>
-    <w:p>
-      <w:pPr>
-        <w:pStyle w:val="HTMLconformatoprevio"/>
-      </w:pPr>
-      <w:r>
-        <w:t xml:space="preserve">  }</w:t>
-      </w:r>
-    </w:p>
-    <w:p>
-      <w:pPr>
-        <w:pStyle w:val="HTMLconformatoprevio"/>
-      </w:pPr>
-      <w:r>
-        <w:t>}</w:t>
-      </w:r>
-    </w:p>
-    <w:p>
-      <w:pPr>
-        <w:rPr>
-          <w:rFonts w:ascii="Calibri" w:eastAsia="Times New Roman" w:hAnsi="Calibri" w:cs="Calibri"/>
-          <w:sz w:val="22"/>
-          <w:szCs w:val="22"/>
-        </w:rPr>
-      </w:pPr>
-      <w:r>
-        <w:rPr>
-          <w:rFonts w:ascii="Calibri" w:eastAsia="Times New Roman" w:hAnsi="Calibri" w:cs="Calibri"/>
-          <w:sz w:val="22"/>
-          <w:szCs w:val="22"/>
-        </w:rPr>
-        <w:pict>
-          <v:rect id="_x0000_i1029" style="width:0;height:1.5pt" o:hralign="center" o:hrstd="t" o:hr="t" fillcolor="#a0a0a0" stroked="f"/>
-        </w:pict>
-      </w:r>
-    </w:p>
-    <w:p>
-      <w:pPr>
-        <w:pStyle w:val="Ttulo3"/>
-        <w:rPr>
-          <w:rFonts w:ascii="Calibri" w:eastAsia="Times New Roman" w:hAnsi="Calibri" w:cs="Calibri"/>
-        </w:rPr>
-      </w:pPr>
-      <w:r>
-        <w:rPr>
-          <w:rFonts w:ascii="Calibri" w:eastAsia="Times New Roman" w:hAnsi="Calibri" w:cs="Calibri"/>
-        </w:rPr>
-        <w:t>5.4 Validaciones de consistencia ejecutadas</w:t>
-      </w:r>
-    </w:p>
-    <w:p>
-      <w:pPr>
-        <w:pStyle w:val="NormalWeb"/>
-        <w:rPr>
-          <w:rFonts w:ascii="Calibri" w:hAnsi="Calibri" w:cs="Calibri"/>
-          <w:sz w:val="22"/>
-          <w:szCs w:val="22"/>
-        </w:rPr>
-      </w:pPr>
-      <w:r>
-        <w:rPr>
-          <w:rFonts w:ascii="Calibri" w:hAnsi="Calibri" w:cs="Calibri"/>
-          <w:sz w:val="22"/>
-          <w:szCs w:val="22"/>
-        </w:rPr>
-        <w:t>Se instrumentó un proceso formal de validación cruzada y conciliación lógica para asegurar la concordancia absoluta de la persistencia relacional con el sistema de archivos físico:</w:t>
-      </w:r>
-    </w:p>
-    <w:p>
-      <w:pPr>
-        <w:pStyle w:val="NormalWeb"/>
-        <w:rPr>
-          <w:rFonts w:ascii="Calibri" w:hAnsi="Calibri" w:cs="Calibri"/>
-          <w:sz w:val="22"/>
-          <w:szCs w:val="22"/>
-        </w:rPr>
-      </w:pPr>
-      <w:r>
-        <w:rPr>
-          <w:rFonts w:ascii="Calibri" w:hAnsi="Calibri" w:cs="Calibri"/>
-          <w:sz w:val="22"/>
-          <w:szCs w:val="22"/>
-        </w:rPr>
-        <w:t xml:space="preserve">1. </w:t>
-      </w:r>
-      <w:r>
-        <w:rPr>
-          <w:rStyle w:val="Fuerte"/>
-          <w:rFonts w:ascii="Calibri" w:hAnsi="Calibri" w:cs="Calibri"/>
-          <w:sz w:val="22"/>
-          <w:szCs w:val="22"/>
-        </w:rPr>
-        <w:t>Consistencia PDF vs BD:</w:t>
-      </w:r>
-      <w:r>
-        <w:rPr>
-          <w:rFonts w:ascii="Calibri" w:hAnsi="Calibri" w:cs="Calibri"/>
-          <w:sz w:val="22"/>
-          <w:szCs w:val="22"/>
-        </w:rPr>
-        <w:t xml:space="preserve"> Se contrastaron los 13,920 registros marcados con estado </w:t>
-      </w:r>
-      <w:r>
-        <w:rPr>
-          <w:rStyle w:val="CdigoHTML"/>
-        </w:rPr>
-        <w:t>EXITO</w:t>
-      </w:r>
-      <w:r>
-        <w:rPr>
-          <w:rFonts w:ascii="Calibri" w:hAnsi="Calibri" w:cs="Calibri"/>
-          <w:sz w:val="22"/>
-          <w:szCs w:val="22"/>
-        </w:rPr>
-        <w:t xml:space="preserve"> en la tabla </w:t>
-      </w:r>
-      <w:r>
-        <w:rPr>
-          <w:rStyle w:val="CdigoHTML"/>
-        </w:rPr>
-        <w:t>CurpProcesada</w:t>
-      </w:r>
-      <w:r>
-        <w:rPr>
-          <w:rFonts w:ascii="Calibri" w:hAnsi="Calibri" w:cs="Calibri"/>
-          <w:sz w:val="22"/>
-          <w:szCs w:val="22"/>
-        </w:rPr>
-        <w:t xml:space="preserve"> contra la existencia de archivos físicos en el volumen </w:t>
-      </w:r>
-      <w:r>
-        <w:rPr>
-          <w:rStyle w:val="CdigoHTML"/>
-        </w:rPr>
-        <w:t>/var/data/output/</w:t>
-      </w:r>
-      <w:r>
-        <w:rPr>
-          <w:rFonts w:ascii="Calibri" w:hAnsi="Calibri" w:cs="Calibri"/>
-          <w:sz w:val="22"/>
-          <w:szCs w:val="22"/>
-        </w:rPr>
-        <w:t xml:space="preserve">. El resultado de la conciliación fue de </w:t>
-      </w:r>
-      <w:r>
-        <w:rPr>
-          <w:rStyle w:val="Fuerte"/>
-          <w:rFonts w:ascii="Calibri" w:hAnsi="Calibri" w:cs="Calibri"/>
-          <w:sz w:val="22"/>
-          <w:szCs w:val="22"/>
-        </w:rPr>
-        <w:t>100% de coincidencia</w:t>
-      </w:r>
-      <w:r>
-        <w:rPr>
-          <w:rFonts w:ascii="Calibri" w:hAnsi="Calibri" w:cs="Calibri"/>
-          <w:sz w:val="22"/>
-          <w:szCs w:val="22"/>
-        </w:rPr>
-        <w:t>, sin detectar discrepancias, corrupciones ni registros huérfanos.</w:t>
-      </w:r>
-    </w:p>
-    <w:p>
-      <w:pPr>
-        <w:pStyle w:val="NormalWeb"/>
-        <w:rPr>
-          <w:rFonts w:ascii="Calibri" w:hAnsi="Calibri" w:cs="Calibri"/>
-          <w:sz w:val="22"/>
-          <w:szCs w:val="22"/>
-        </w:rPr>
-      </w:pPr>
-      <w:r>
-        <w:rPr>
-          <w:rFonts w:ascii="Calibri" w:hAnsi="Calibri" w:cs="Calibri"/>
-          <w:sz w:val="22"/>
-          <w:szCs w:val="22"/>
-        </w:rPr>
-        <w:t xml:space="preserve">2. </w:t>
-      </w:r>
-      <w:r>
-        <w:rPr>
-          <w:rStyle w:val="Fuerte"/>
-          <w:rFonts w:ascii="Calibri" w:hAnsi="Calibri" w:cs="Calibri"/>
-          <w:sz w:val="22"/>
-          <w:szCs w:val="22"/>
-        </w:rPr>
-        <w:t>Consistencia de Rutas Estándar:</w:t>
-      </w:r>
-      <w:r>
-        <w:rPr>
-          <w:rFonts w:ascii="Calibri" w:hAnsi="Calibri" w:cs="Calibri"/>
-          <w:sz w:val="22"/>
-          <w:szCs w:val="22"/>
-        </w:rPr>
-        <w:t xml:space="preserve"> Se verificó la consistencia en el direccionamiento lógico-físico según la jerarquía reglamentaria: </w:t>
-      </w:r>
-      <w:r>
-        <w:rPr>
-          <w:rStyle w:val="CdigoHTML"/>
-        </w:rPr>
-        <w:t>OUTPUT_DIR/&lt;estado&gt;/&lt;cct&gt;/&lt;ciclo&gt;/sin-carta/</w:t>
-      </w:r>
-      <w:r>
-        <w:rPr>
-          <w:rFonts w:ascii="Calibri" w:hAnsi="Calibri" w:cs="Calibri"/>
-          <w:sz w:val="22"/>
-          <w:szCs w:val="22"/>
-        </w:rPr>
-        <w:t>.</w:t>
-      </w:r>
-    </w:p>
-    <w:p>
-      <w:pPr>
-        <w:pStyle w:val="NormalWeb"/>
-        <w:rPr>
-          <w:rFonts w:ascii="Calibri" w:hAnsi="Calibri" w:cs="Calibri"/>
-          <w:sz w:val="22"/>
-          <w:szCs w:val="22"/>
-        </w:rPr>
-      </w:pPr>
-      <w:r>
-        <w:rPr>
-          <w:rFonts w:ascii="Calibri" w:hAnsi="Calibri" w:cs="Calibri"/>
-          <w:sz w:val="22"/>
-          <w:szCs w:val="22"/>
-        </w:rPr>
-        <w:t xml:space="preserve">3. </w:t>
-      </w:r>
-      <w:r>
-        <w:rPr>
-          <w:rStyle w:val="Fuerte"/>
-          <w:rFonts w:ascii="Calibri" w:hAnsi="Calibri" w:cs="Calibri"/>
-          <w:sz w:val="22"/>
-          <w:szCs w:val="22"/>
-        </w:rPr>
-        <w:t>Control de Errores en Bitácora:</w:t>
-      </w:r>
-      <w:r>
-        <w:rPr>
-          <w:rFonts w:ascii="Calibri" w:hAnsi="Calibri" w:cs="Calibri"/>
-          <w:sz w:val="22"/>
-          <w:szCs w:val="22"/>
-        </w:rPr>
-        <w:t xml:space="preserve"> Se comprobó que cada una de las 580 incidencias de descarga fallida desencadenara automáticamente una entrada correspondiente en la tabla relacional </w:t>
-      </w:r>
-      <w:r>
-        <w:rPr>
-          <w:rStyle w:val="CdigoHTML"/>
-        </w:rPr>
-        <w:t>BitacoraEvento</w:t>
-      </w:r>
-      <w:r>
-        <w:rPr>
-          <w:rFonts w:ascii="Calibri" w:hAnsi="Calibri" w:cs="Calibri"/>
-          <w:sz w:val="22"/>
-          <w:szCs w:val="22"/>
-        </w:rPr>
-        <w:t xml:space="preserve"> detallando la causa exacta devuelta por la excepción de red o por el servicio del IMSS.</w:t>
-      </w:r>
-    </w:p>
-    <w:p>
-      <w:pPr>
-        <w:rPr>
-          <w:rFonts w:ascii="Calibri" w:eastAsia="Times New Roman" w:hAnsi="Calibri" w:cs="Calibri"/>
-          <w:sz w:val="22"/>
-          <w:szCs w:val="22"/>
-        </w:rPr>
-      </w:pPr>
-      <w:r>
-        <w:rPr>
-          <w:rFonts w:ascii="Calibri" w:eastAsia="Times New Roman" w:hAnsi="Calibri" w:cs="Calibri"/>
-          <w:sz w:val="22"/>
-          <w:szCs w:val="22"/>
-        </w:rPr>
-        <w:pict>
-          <v:rect id="_x0000_i1030" style="width:0;height:1.5pt" o:hralign="center" o:hrstd="t" o:hr="t" fillcolor="#a0a0a0" stroked="f"/>
-        </w:pict>
-      </w:r>
-    </w:p>
-    <w:p>
-      <w:pPr>
-        <w:pStyle w:val="Ttulo3"/>
-        <w:rPr>
-          <w:rFonts w:ascii="Calibri" w:eastAsia="Times New Roman" w:hAnsi="Calibri" w:cs="Calibri"/>
-        </w:rPr>
-      </w:pPr>
-      <w:r>
-        <w:rPr>
-          <w:rFonts w:ascii="Calibri" w:eastAsia="Times New Roman" w:hAnsi="Calibri" w:cs="Calibri"/>
-        </w:rPr>
-        <w:t>5.5 Incidencias reales del mes y resoluciones</w:t>
-      </w:r>
-    </w:p>
-    <w:p>
-      <w:pPr>
-        <w:pStyle w:val="NormalWeb"/>
-        <w:rPr>
-          <w:rFonts w:ascii="Calibri" w:hAnsi="Calibri" w:cs="Calibri"/>
-          <w:sz w:val="22"/>
-          <w:szCs w:val="22"/>
-        </w:rPr>
-      </w:pPr>
-      <w:r>
-        <w:rPr>
-          <w:rFonts w:ascii="Calibri" w:hAnsi="Calibri" w:cs="Calibri"/>
-          <w:sz w:val="22"/>
-          <w:szCs w:val="22"/>
-        </w:rPr>
-        <w:t>Durante la ejecución del lote Puebla (</w:t>
-      </w:r>
-      <w:r>
-        <w:rPr>
-          <w:rStyle w:val="CdigoHTML"/>
-        </w:rPr>
-        <w:t>LOTE-202605-02</w:t>
-      </w:r>
-      <w:r>
-        <w:rPr>
-          <w:rFonts w:ascii="Calibri" w:hAnsi="Calibri" w:cs="Calibri"/>
-          <w:sz w:val="22"/>
-          <w:szCs w:val="22"/>
-        </w:rPr>
-        <w:t>), el sistema reportó una degradación en la tasa de respuesta y un alarmante incremento de transacciones fallidas por límite de peticiones (errores HTTP 429) de la API externa:</w:t>
-      </w:r>
-    </w:p>
-    <w:p>
-      <w:pPr>
-        <w:pStyle w:val="NormalWeb"/>
-        <w:rPr>
-          <w:rFonts w:ascii="Calibri" w:hAnsi="Calibri" w:cs="Calibri"/>
-          <w:sz w:val="22"/>
-          <w:szCs w:val="22"/>
-        </w:rPr>
-      </w:pPr>
-      <w:r>
-        <w:rPr>
-          <w:rFonts w:ascii="Calibri" w:hAnsi="Calibri" w:cs="Calibri"/>
-          <w:sz w:val="22"/>
-          <w:szCs w:val="22"/>
-        </w:rPr>
-        <w:t xml:space="preserve">1. </w:t>
-      </w:r>
-      <w:r>
-        <w:rPr>
-          <w:rStyle w:val="Fuerte"/>
-          <w:rFonts w:ascii="Calibri" w:hAnsi="Calibri" w:cs="Calibri"/>
-          <w:sz w:val="22"/>
-          <w:szCs w:val="22"/>
-        </w:rPr>
-        <w:t>Causa raíz:</w:t>
-      </w:r>
-      <w:r>
-        <w:rPr>
-          <w:rFonts w:ascii="Calibri" w:hAnsi="Calibri" w:cs="Calibri"/>
-          <w:sz w:val="22"/>
-          <w:szCs w:val="22"/>
-        </w:rPr>
-        <w:t xml:space="preserve"> La variable </w:t>
-      </w:r>
-      <w:r>
-        <w:rPr>
-          <w:rStyle w:val="CdigoHTML"/>
-        </w:rPr>
-        <w:t>WORKERS</w:t>
-      </w:r>
-      <w:r>
-        <w:rPr>
-          <w:rFonts w:ascii="Calibri" w:hAnsi="Calibri" w:cs="Calibri"/>
-          <w:sz w:val="22"/>
-          <w:szCs w:val="22"/>
-        </w:rPr>
-        <w:t xml:space="preserve"> estaba parametrizada en 20 hilos de ejecución concurrente. Al realizar peticiones paralelas masivas, la dirección IP del servidor saturó la cuota máxima permitida por minuto del cortafuegos (</w:t>
-      </w:r>
-      <w:r>
-        <w:rPr>
-          <w:rStyle w:val="CdigoHTML"/>
-        </w:rPr>
-        <w:t>WAF</w:t>
-      </w:r>
-      <w:r>
-        <w:rPr>
-          <w:rFonts w:ascii="Calibri" w:hAnsi="Calibri" w:cs="Calibri"/>
-          <w:sz w:val="22"/>
-          <w:szCs w:val="22"/>
-        </w:rPr>
-        <w:t>) del IMSS, detonando bloqueos temporales de conexión.</w:t>
-      </w:r>
-    </w:p>
-    <w:p>
-      <w:pPr>
-        <w:pStyle w:val="NormalWeb"/>
-        <w:rPr>
-          <w:rFonts w:ascii="Calibri" w:hAnsi="Calibri" w:cs="Calibri"/>
-          <w:sz w:val="22"/>
-          <w:szCs w:val="22"/>
-        </w:rPr>
-      </w:pPr>
-      <w:r>
-        <w:rPr>
-          <w:rFonts w:ascii="Calibri" w:hAnsi="Calibri" w:cs="Calibri"/>
-          <w:sz w:val="22"/>
-          <w:szCs w:val="22"/>
-        </w:rPr>
-        <w:t xml:space="preserve">2. </w:t>
-      </w:r>
-      <w:r>
-        <w:rPr>
-          <w:rStyle w:val="Fuerte"/>
-          <w:rFonts w:ascii="Calibri" w:hAnsi="Calibri" w:cs="Calibri"/>
-          <w:sz w:val="22"/>
-          <w:szCs w:val="22"/>
-        </w:rPr>
-        <w:t>Mitigación Operativa:</w:t>
-      </w:r>
-      <w:r>
-        <w:rPr>
-          <w:rFonts w:ascii="Calibri" w:hAnsi="Calibri" w:cs="Calibri"/>
-          <w:sz w:val="22"/>
-          <w:szCs w:val="22"/>
-        </w:rPr>
-        <w:t xml:space="preserve"> El orquestador detectó la acumulación sostenida de errores HTTP 429 (acumulando 5 consecutivas en el pool), activando un procedimiento automático de detención controlada (*Circuit Breaker*). Se suspendió el lote y se reconfiguró la variable de entorno a </w:t>
-      </w:r>
-      <w:r>
-        <w:rPr>
-          <w:rStyle w:val="CdigoHTML"/>
-        </w:rPr>
-        <w:t>WORKERS=10</w:t>
-      </w:r>
-      <w:r>
-        <w:rPr>
-          <w:rFonts w:ascii="Calibri" w:hAnsi="Calibri" w:cs="Calibri"/>
-          <w:sz w:val="22"/>
-          <w:szCs w:val="22"/>
-        </w:rPr>
-        <w:t xml:space="preserve"> en el archivo de inicio.</w:t>
-      </w:r>
-    </w:p>
-    <w:p>
-      <w:pPr>
-        <w:pStyle w:val="NormalWeb"/>
-        <w:rPr>
-          <w:rFonts w:ascii="Calibri" w:hAnsi="Calibri" w:cs="Calibri"/>
-          <w:sz w:val="22"/>
-          <w:szCs w:val="22"/>
-        </w:rPr>
-      </w:pPr>
-      <w:r>
-        <w:rPr>
-          <w:rFonts w:ascii="Calibri" w:hAnsi="Calibri" w:cs="Calibri"/>
-          <w:sz w:val="22"/>
-          <w:szCs w:val="22"/>
-        </w:rPr>
-        <w:t xml:space="preserve">3. </w:t>
-      </w:r>
-      <w:r>
-        <w:rPr>
-          <w:rStyle w:val="Fuerte"/>
-          <w:rFonts w:ascii="Calibri" w:hAnsi="Calibri" w:cs="Calibri"/>
-          <w:sz w:val="22"/>
-          <w:szCs w:val="22"/>
-        </w:rPr>
-        <w:t>Recuperación automatizada (Reproceso):</w:t>
-      </w:r>
-      <w:r>
-        <w:rPr>
-          <w:rFonts w:ascii="Calibri" w:hAnsi="Calibri" w:cs="Calibri"/>
-          <w:sz w:val="22"/>
-          <w:szCs w:val="22"/>
-        </w:rPr>
-        <w:t xml:space="preserve"> Se invocó el script </w:t>
-      </w:r>
-      <w:r>
-        <w:rPr>
-          <w:rStyle w:val="CdigoHTML"/>
-        </w:rPr>
-        <w:t>run_reproceso.py</w:t>
-      </w:r>
-      <w:r>
-        <w:rPr>
-          <w:rFonts w:ascii="Calibri" w:hAnsi="Calibri" w:cs="Calibri"/>
-          <w:sz w:val="22"/>
-          <w:szCs w:val="22"/>
-        </w:rPr>
-        <w:t xml:space="preserve"> para levantar exclusivamente las 420 CURP marcadas con estado </w:t>
-      </w:r>
-      <w:r>
-        <w:rPr>
-          <w:rStyle w:val="CdigoHTML"/>
-        </w:rPr>
-        <w:t>FALLO</w:t>
-      </w:r>
-      <w:r>
-        <w:rPr>
-          <w:rFonts w:ascii="Calibri" w:hAnsi="Calibri" w:cs="Calibri"/>
-          <w:sz w:val="22"/>
-          <w:szCs w:val="22"/>
-        </w:rPr>
-        <w:t xml:space="preserve"> en Puebla, recuperando exitosamente 410 registros, reduciendo de esa forma los fallos definitivos de la corrida a solo 10 CURPs e incrementando la tasa de éxito final ajustada de Puebla a </w:t>
-      </w:r>
-      <w:r>
-        <w:rPr>
-          <w:rStyle w:val="Fuerte"/>
-          <w:rFonts w:ascii="Calibri" w:hAnsi="Calibri" w:cs="Calibri"/>
-          <w:sz w:val="22"/>
-          <w:szCs w:val="22"/>
-        </w:rPr>
-        <w:t>99.83%</w:t>
-      </w:r>
-      <w:r>
-        <w:rPr>
-          <w:rFonts w:ascii="Calibri" w:hAnsi="Calibri" w:cs="Calibri"/>
-          <w:sz w:val="22"/>
-          <w:szCs w:val="22"/>
-        </w:rPr>
-        <w:t>.</w:t>
-      </w:r>
-    </w:p>
-    <w:p>
-      <w:pPr>
-        <w:rPr>
-          <w:rFonts w:ascii="Calibri" w:eastAsia="Times New Roman" w:hAnsi="Calibri" w:cs="Calibri"/>
-          <w:sz w:val="22"/>
-          <w:szCs w:val="22"/>
-        </w:rPr>
-      </w:pPr>
-      <w:r>
-        <w:rPr>
-          <w:rFonts w:ascii="Calibri" w:eastAsia="Times New Roman" w:hAnsi="Calibri" w:cs="Calibri"/>
-          <w:sz w:val="22"/>
-          <w:szCs w:val="22"/>
-        </w:rPr>
-        <w:pict>
-          <v:rect id="_x0000_i1031" style="width:0;height:1.5pt" o:hralign="center" o:hrstd="t" o:hr="t" fillcolor="#a0a0a0" stroked="f"/>
-        </w:pict>
-      </w:r>
-    </w:p>
-    <w:p>
-      <w:pPr>
-        <w:pStyle w:val="Ttulo3"/>
-        <w:rPr>
-          <w:rFonts w:ascii="Calibri" w:eastAsia="Times New Roman" w:hAnsi="Calibri" w:cs="Calibri"/>
-        </w:rPr>
-      </w:pPr>
-      <w:r>
-        <w:rPr>
-          <w:rFonts w:ascii="Calibri" w:eastAsia="Times New Roman" w:hAnsi="Calibri" w:cs="Calibri"/>
-        </w:rPr>
-        <w:t xml:space="preserve">5.6 Avance sobre etapa posterior a </w:t>
-      </w:r>
-      <w:r>
-        <w:rPr>
-          <w:rStyle w:val="CdigoHTML"/>
-        </w:rPr>
-        <w:t>sin-carta</w:t>
-      </w:r>
-    </w:p>
-    <w:p>
-      <w:pPr>
-        <w:pStyle w:val="NormalWeb"/>
-        <w:rPr>
-          <w:rFonts w:ascii="Calibri" w:hAnsi="Calibri" w:cs="Calibri"/>
-          <w:sz w:val="22"/>
-          <w:szCs w:val="22"/>
-        </w:rPr>
-      </w:pPr>
-      <w:r>
-        <w:rPr>
-          <w:rFonts w:ascii="Calibri" w:hAnsi="Calibri" w:cs="Calibri"/>
-          <w:sz w:val="22"/>
-          <w:szCs w:val="22"/>
-        </w:rPr>
-        <w:t>En mayo se ejecutó con éxito el diseño y prueba piloto del motor de plantillas de cartas de notificació</w:t>
-      </w:r>
-      <w:r>
-        <w:rPr>
-          <w:rFonts w:ascii="Calibri" w:hAnsi="Calibri" w:cs="Calibri"/>
-          <w:sz w:val="22"/>
-          <w:szCs w:val="22"/>
-        </w:rPr>
-        <w:t>n en formato Word, un hito que supera la limitación teórica identificada en abril:</w:t>
+        <w:pStyle w:val="Ttulo2"/>
+        <w:rPr>
+          <w:rFonts w:ascii="Calibri" w:eastAsia="Times New Roman" w:hAnsi="Calibri" w:cs="Calibri"/>
+        </w:rPr>
+      </w:pPr>
+      <w:r>
+        <w:rPr>
+          <w:rFonts w:ascii="Calibri" w:eastAsia="Times New Roman" w:hAnsi="Calibri" w:cs="Calibri"/>
+        </w:rPr>
+        <w:t>6. Próximos Pasos rumbo a Junio de 2026</w:t>
       </w:r>
     </w:p>
     <w:p>
       <w:pPr>
         <w:numPr>
           <w:ilvl w:val="0"/>
-          <w:numId w:val="2"/>
+          <w:numId w:val="5"/>
         </w:numPr>
         <w:spacing w:before="100" w:beforeAutospacing="1" w:after="100" w:afterAutospacing="1"/>
         <w:rPr>
@@ -3051,42 +2630,14 @@
           <w:sz w:val="22"/>
           <w:szCs w:val="22"/>
         </w:rPr>
-        <w:t xml:space="preserve">Se desarrolló el script de automatización compatible con Python que toma como entrada los metadatos y PDFs acumulados en la carpeta </w:t>
-      </w:r>
-      <w:r>
-        <w:rPr>
-          <w:rStyle w:val="CdigoHTML"/>
-        </w:rPr>
-        <w:t>sin-carta/</w:t>
-      </w:r>
-      <w:r>
-        <w:rPr>
-          <w:rFonts w:ascii="Calibri" w:eastAsia="Times New Roman" w:hAnsi="Calibri" w:cs="Calibri"/>
-          <w:sz w:val="22"/>
-          <w:szCs w:val="22"/>
-        </w:rPr>
-        <w:t xml:space="preserve"> y genera las cartas fusionadas definitivas en </w:t>
-      </w:r>
-      <w:r>
-        <w:rPr>
-          <w:rStyle w:val="CdigoHTML"/>
-        </w:rPr>
-        <w:t>cartas-generadas/</w:t>
-      </w:r>
-      <w:r>
-        <w:rPr>
-          <w:rFonts w:ascii="Calibri" w:eastAsia="Times New Roman" w:hAnsi="Calibri" w:cs="Calibri"/>
-          <w:sz w:val="22"/>
-          <w:szCs w:val="22"/>
-        </w:rPr>
-        <w:t>.</w:t>
+        <w:t>Desplegar los hooks de seguridad de repositorios pre-commit tras el incidente de datos reportado (ver Reporte de Alertamiento).</w:t>
       </w:r>
     </w:p>
     <w:p>
       <w:pPr>
         <w:numPr>
           <w:ilvl w:val="0"/>
-          <w:numId w:val="2"/>
+          <w:numId w:val="5"/>
         </w:numPr>
         <w:spacing w:before="100" w:beforeAutospacing="1" w:after="100" w:afterAutospacing="1"/>
         <w:rPr>
@@ -3101,47 +2652,14 @@
           <w:sz w:val="22"/>
           <w:szCs w:val="22"/>
         </w:rPr>
-        <w:t>Este script elimina la dependencia del procesamiento offline manual, garantizando la continuidad e integración directa del flujo post-carga para el inicio del trimestre de junio.</w:t>
-      </w:r>
-    </w:p>
-    <w:p>
-      <w:pPr>
-        <w:rPr>
-          <w:rFonts w:ascii="Calibri" w:eastAsia="Times New Roman" w:hAnsi="Calibri" w:cs="Calibri"/>
-          <w:sz w:val="22"/>
-          <w:szCs w:val="22"/>
-        </w:rPr>
-      </w:pPr>
-      <w:r>
-        <w:rPr>
-          <w:rFonts w:ascii="Calibri" w:eastAsia="Times New Roman" w:hAnsi="Calibri" w:cs="Calibri"/>
-          <w:sz w:val="22"/>
-          <w:szCs w:val="22"/>
-        </w:rPr>
-        <w:pict>
-          <v:rect id="_x0000_i1032" style="width:0;height:1.5pt" o:hralign="center" o:hrstd="t" o:hr="t" fillcolor="#a0a0a0" stroked="f"/>
-        </w:pict>
-      </w:r>
-    </w:p>
-    <w:p>
-      <w:pPr>
-        <w:pStyle w:val="Ttulo2"/>
-        <w:rPr>
-          <w:rFonts w:ascii="Calibri" w:eastAsia="Times New Roman" w:hAnsi="Calibri" w:cs="Calibri"/>
-        </w:rPr>
-      </w:pPr>
-      <w:r>
-        <w:rPr>
-          <w:rFonts w:ascii="Calibri" w:eastAsia="Times New Roman" w:hAnsi="Calibri" w:cs="Calibri"/>
-        </w:rPr>
-        <w:t>6. Riesgos y Dependencias para Mayo</w:t>
+        <w:t>Consolidar las bitácoras acumuladas de los lotes de mayo para el corte trimestral del 30 de junio.</w:t>
       </w:r>
     </w:p>
     <w:p>
       <w:pPr>
         <w:numPr>
           <w:ilvl w:val="0"/>
-          <w:numId w:val="3"/>
+          <w:numId w:val="5"/>
         </w:numPr>
         <w:spacing w:before="100" w:beforeAutospacing="1" w:after="100" w:afterAutospacing="1"/>
         <w:rPr>
@@ -3152,232 +2670,25 @@
       </w:pPr>
       <w:r>
         <w:rPr>
-          <w:rStyle w:val="Fuerte"/>
-          <w:rFonts w:ascii="Calibri" w:eastAsia="Times New Roman" w:hAnsi="Calibri" w:cs="Calibri"/>
-          <w:sz w:val="22"/>
-          <w:szCs w:val="22"/>
-        </w:rPr>
-        <w:t>Saturación IP Volumétrica:</w:t>
-      </w:r>
-      <w:r>
-        <w:rPr>
-          <w:rFonts w:ascii="Calibri" w:eastAsia="Times New Roman" w:hAnsi="Calibri" w:cs="Calibri"/>
-          <w:sz w:val="22"/>
-          <w:szCs w:val="22"/>
-        </w:rPr>
-        <w:t xml:space="preserve"> Dependencia severa de la disponibilidad y tolerancia a la alta concurrencia de la API externa del IMSS. Se sugiere mantener políticas de espera exponencial en reintentos (*Exponential Back-off*).</w:t>
-      </w:r>
-    </w:p>
-    <w:p>
-      <w:pPr>
-        <w:numPr>
-          <w:ilvl w:val="0"/>
-          <w:numId w:val="3"/>
-        </w:numPr>
-        <w:spacing w:before="100" w:beforeAutospacing="1" w:after="100" w:afterAutospacing="1"/>
-        <w:rPr>
-          <w:rFonts w:ascii="Calibri" w:eastAsia="Times New Roman" w:hAnsi="Calibri" w:cs="Calibri"/>
-          <w:sz w:val="22"/>
-          <w:szCs w:val="22"/>
-        </w:rPr>
-      </w:pPr>
-      <w:r>
-        <w:rPr>
-          <w:rStyle w:val="Fuerte"/>
-          <w:rFonts w:ascii="Calibri" w:eastAsia="Times New Roman" w:hAnsi="Calibri" w:cs="Calibri"/>
-          <w:sz w:val="22"/>
-          <w:szCs w:val="22"/>
-        </w:rPr>
-        <w:t>Estabilidad de DEV:</w:t>
-      </w:r>
-      <w:r>
-        <w:rPr>
-          <w:rFonts w:ascii="Calibri" w:eastAsia="Times New Roman" w:hAnsi="Calibri" w:cs="Calibri"/>
-          <w:sz w:val="22"/>
-          <w:szCs w:val="22"/>
-        </w:rPr>
-        <w:t xml:space="preserve"> Riesgo de inconsistencias si se ejecutan corridas simultáneas por múltiples agentes sin un control estricto de lote único.</w:t>
-      </w:r>
-    </w:p>
-    <w:p>
-      <w:pPr>
-        <w:numPr>
-          <w:ilvl w:val="0"/>
-          <w:numId w:val="3"/>
-        </w:numPr>
-        <w:spacing w:before="100" w:beforeAutospacing="1" w:after="100" w:afterAutospacing="1"/>
-        <w:rPr>
-          <w:rFonts w:ascii="Calibri" w:eastAsia="Times New Roman" w:hAnsi="Calibri" w:cs="Calibri"/>
-          <w:sz w:val="22"/>
-          <w:szCs w:val="22"/>
-        </w:rPr>
-      </w:pPr>
-      <w:r>
-        <w:rPr>
-          <w:rStyle w:val="Fuerte"/>
-          <w:rFonts w:ascii="Calibri" w:eastAsia="Times New Roman" w:hAnsi="Calibri" w:cs="Calibri"/>
-          <w:sz w:val="22"/>
-          <w:szCs w:val="22"/>
-        </w:rPr>
-        <w:t>Acoplamiento Contractual:</w:t>
-      </w:r>
-      <w:r>
-        <w:rPr>
-          <w:rFonts w:ascii="Calibri" w:eastAsia="Times New Roman" w:hAnsi="Calibri" w:cs="Calibri"/>
-          <w:sz w:val="22"/>
-          <w:szCs w:val="22"/>
-        </w:rPr>
-        <w:t xml:space="preserve"> El riesgo latente de que la etapa de cartas no unifique especificaciones de negocio oportunas con los usuarios corporativos finales de las áreas de TI previas a la entrega trimestral.</w:t>
-      </w:r>
-    </w:p>
-    <w:p>
-      <w:pPr>
-        <w:pStyle w:val="Ttulo2"/>
-        <w:rPr>
-          <w:rFonts w:ascii="Calibri" w:eastAsia="Times New Roman" w:hAnsi="Calibri" w:cs="Calibri"/>
-        </w:rPr>
-      </w:pPr>
-      <w:r>
-        <w:rPr>
-          <w:rFonts w:ascii="Calibri" w:eastAsia="Times New Roman" w:hAnsi="Calibri" w:cs="Calibri"/>
-        </w:rPr>
-        <w:t>7. Próximos Pasos rumbo a Junio de 2026</w:t>
-      </w:r>
-    </w:p>
-    <w:p>
-      <w:pPr>
-        <w:numPr>
-          <w:ilvl w:val="0"/>
-          <w:numId w:val="4"/>
-        </w:numPr>
-        <w:spacing w:before="100" w:beforeAutospacing="1" w:after="100" w:afterAutospacing="1"/>
-        <w:rPr>
-          <w:rFonts w:ascii="Calibri" w:eastAsia="Times New Roman" w:hAnsi="Calibri" w:cs="Calibri"/>
-          <w:sz w:val="22"/>
-          <w:szCs w:val="22"/>
-        </w:rPr>
-      </w:pPr>
-      <w:r>
-        <w:rPr>
-          <w:rFonts w:ascii="Calibri" w:eastAsia="Times New Roman" w:hAnsi="Calibri" w:cs="Calibri"/>
-          <w:sz w:val="22"/>
-          <w:szCs w:val="22"/>
-        </w:rPr>
-        <w:t>Consolidar las bitácoras acumuladas de los tres lotes de mayo para el corte trimestral del 30 de junio.</w:t>
-      </w:r>
-    </w:p>
-    <w:p>
-      <w:pPr>
-        <w:numPr>
-          <w:ilvl w:val="0"/>
-          <w:numId w:val="4"/>
-        </w:numPr>
-        <w:spacing w:before="100" w:beforeAutospacing="1" w:after="100" w:afterAutospacing="1"/>
-        <w:rPr>
-          <w:rFonts w:ascii="Calibri" w:eastAsia="Times New Roman" w:hAnsi="Calibri" w:cs="Calibri"/>
-          <w:sz w:val="22"/>
-          <w:szCs w:val="22"/>
-        </w:rPr>
-      </w:pPr>
-      <w:r>
-        <w:rPr>
-          <w:rFonts w:ascii="Calibri" w:eastAsia="Times New Roman" w:hAnsi="Calibri" w:cs="Calibri"/>
-          <w:sz w:val="22"/>
-          <w:szCs w:val="22"/>
-        </w:rPr>
-        <w:t>Ejecutar el despliegue del script de fusión de cartas a escala de producción.</w:t>
-      </w:r>
-    </w:p>
-    <w:p>
-      <w:pPr>
-        <w:numPr>
-          <w:ilvl w:val="0"/>
-          <w:numId w:val="4"/>
-        </w:numPr>
-        <w:spacing w:before="100" w:beforeAutospacing="1" w:after="100" w:afterAutospacing="1"/>
-        <w:rPr>
-          <w:rFonts w:ascii="Calibri" w:eastAsia="Times New Roman" w:hAnsi="Calibri" w:cs="Calibri"/>
-          <w:sz w:val="22"/>
-          <w:szCs w:val="22"/>
-        </w:rPr>
-      </w:pPr>
-      <w:r>
-        <w:rPr>
-          <w:rFonts w:ascii="Calibri" w:eastAsia="Times New Roman" w:hAnsi="Calibri" w:cs="Calibri"/>
-          <w:sz w:val="22"/>
-          <w:szCs w:val="22"/>
-        </w:rPr>
-        <w:t xml:space="preserve">Automatizar la calibración del parámetro </w:t>
+          <w:rFonts w:ascii="Calibri" w:eastAsia="Times New Roman" w:hAnsi="Calibri" w:cs="Calibri"/>
+          <w:sz w:val="22"/>
+          <w:szCs w:val="22"/>
+        </w:rPr>
+        <w:t xml:space="preserve">Ejecutar el despliegue del script de fusión de cartas a escala de producción desde la carpeta </w:t>
       </w:r>
       <w:r>
         <w:rPr>
           <w:rStyle w:val="CdigoHTML"/>
         </w:rPr>
-        <w:t>WORKERS</w:t>
-      </w:r>
-      <w:r>
-        <w:rPr>
-          <w:rFonts w:ascii="Calibri" w:eastAsia="Times New Roman" w:hAnsi="Calibri" w:cs="Calibri"/>
-          <w:sz w:val="22"/>
-          <w:szCs w:val="22"/>
-        </w:rPr>
-        <w:t xml:space="preserve"> para ajustarse dinámicamente según la latencia de red devuelta por la API IMSS.</w:t>
-      </w:r>
-    </w:p>
-    <w:p>
-      <w:pPr>
-        <w:rPr>
-          <w:rFonts w:ascii="Calibri" w:eastAsia="Times New Roman" w:hAnsi="Calibri" w:cs="Calibri"/>
-          <w:sz w:val="22"/>
-          <w:szCs w:val="22"/>
-        </w:rPr>
-      </w:pPr>
-      <w:r>
-        <w:rPr>
-          <w:rFonts w:ascii="Calibri" w:eastAsia="Times New Roman" w:hAnsi="Calibri" w:cs="Calibri"/>
-          <w:sz w:val="22"/>
-          <w:szCs w:val="22"/>
-        </w:rPr>
-        <w:pict>
-          <v:rect id="_x0000_i1033" style="width:0;height:1.5pt" o:hralign="center" o:hrstd="t" o:hr="t" fillcolor="#a0a0a0" stroked="f"/>
-        </w:pict>
-      </w:r>
-    </w:p>
-    <w:p>
-      <w:pPr>
-        <w:pStyle w:val="NormalWeb"/>
-        <w:rPr>
-          <w:rFonts w:ascii="Calibri" w:hAnsi="Calibri" w:cs="Calibri"/>
-          <w:sz w:val="22"/>
-          <w:szCs w:val="22"/>
-        </w:rPr>
-      </w:pPr>
-      <w:r>
-        <w:rPr>
-          <w:rStyle w:val="Fuerte"/>
-          <w:rFonts w:ascii="Calibri" w:hAnsi="Calibri" w:cs="Calibri"/>
-          <w:sz w:val="22"/>
-          <w:szCs w:val="22"/>
-        </w:rPr>
-        <w:t>Comentarios adicionales:</w:t>
-      </w:r>
-    </w:p>
-    <w:p>
-      <w:pPr>
-        <w:pStyle w:val="NormalWeb"/>
-        <w:rPr>
-          <w:rFonts w:ascii="Calibri" w:hAnsi="Calibri" w:cs="Calibri"/>
-          <w:sz w:val="22"/>
-          <w:szCs w:val="22"/>
-        </w:rPr>
-      </w:pPr>
-      <w:r>
-        <w:rPr>
-          <w:rFonts w:ascii="Calibri" w:hAnsi="Calibri" w:cs="Calibri"/>
-          <w:sz w:val="22"/>
-          <w:szCs w:val="22"/>
-        </w:rPr>
-        <w:t>Este entregable operativo de mayo consolida la evidencia tangible exigida por el contrato, logrando la trazabilidad absoluta de 14,500 transacciones y eliminando los supuestos teóricos planteados en la fase de análisis de abril.</w:t>
+        <w:t>sin-carta/</w:t>
+      </w:r>
+      <w:r>
+        <w:rPr>
+          <w:rFonts w:ascii="Calibri" w:eastAsia="Times New Roman" w:hAnsi="Calibri" w:cs="Calibri"/>
+          <w:sz w:val="22"/>
+          <w:szCs w:val="22"/>
+        </w:rPr>
+        <w:t>.</w:t>
       </w:r>
     </w:p>
     <w:sectPr>
@@ -3393,9 +2704,9 @@
 <file path=word/numbering.xml><?xml version="1.0" encoding="utf-8"?>
 <w:numbering xmlns:wpc="http://schemas.microsoft.com/office/word/2010/wordprocessingCanvas" xmlns:cx="http://schemas.microsoft.com/office/drawing/2014/chartex" xmlns:cx1="http://schemas.microsoft.com/office/drawing/2015/9/8/chartex" xmlns:cx2="http://schemas.microsoft.com/office/drawing/2015/10/21/chartex" xmlns:cx3="http://schemas.microsoft.com/office/drawing/2016/5/9/chartex" xmlns:cx4="http://schemas.microsoft.com/office/drawing/2016/5/10/chartex" xmlns:cx5="http://schemas.microsoft.com/office/drawing/2016/5/11/chartex" xmlns:cx6="http://schemas.microsoft.com/office/drawing/2016/5/12/chartex" xmlns:cx7="http://schemas.microsoft.com/office/drawing/2016/5/13/chartex" xmlns:cx8="http://schemas.microsoft.com/office/drawing/2016/5/14/chartex" xmlns:mc="http://schemas.openxmlformats.org/markup-compatibility/2006" xmlns:aink="http://schemas.microsoft.com/office/drawing/2016/ink" xmlns:am3d="http://schemas.microsoft.com/office/drawing/2017/model3d" xmlns:o="urn:schemas-microsoft-com:office:office" xmlns:oel="http://schemas.microsoft.com/office/2019/extlst" xmlns:r="http://schemas.openxmlformats.org/officeDocument/2006/relationships" xmlns:m="http://schemas.openxmlformats.org/officeDocument/2006/math" xmlns:v="urn:schemas-microsoft-com:vml" xmlns:wp14="http://schemas.microsoft.com/office/word/2010/wordprocessingDrawing" xmlns:wp="http://schemas.openxmlformats.org/drawingml/2006/wordprocessingDrawing" xmlns:w10="urn:schemas-microsoft-com:office:word" xmlns:w="http://schemas.openxmlformats.org/wordprocessingml/2006/main" xmlns:w14="http://schemas.microsoft.com/office/word/2010/wordml" xmlns:w15="http://schemas.microsoft.com/office/word/2012/wordml" xmlns:w16cex="http://schemas.microsoft.com/office/word/2018/wordml/cex" xmlns:w16cid="http://schemas.microsoft.com/office/word/2016/wordml/cid" xmlns:w16="http://schemas.microsoft.com/office/word/2018/wordml" xmlns:w16du="http://schemas.microsoft.com/office/word/2023/wordml/word16du" xmlns:w16sdtdh="http://schemas.microsoft.com/office/word/2020/wordml/sdtdatahash" xmlns:w16sdtfl="http://schemas.microsoft.com/office/word/2024/wordml/sdtformatlock" xmlns:w16se="http://schemas.microsoft.com/office/word/2015/wordml/symex" xmlns:wpg="http://schemas.microsoft.com/office/word/2010/wordprocessingGroup" xmlns:wpi="http://schemas.microsoft.com/office/word/2010/wordprocessingInk" xmlns:wne="http://schemas.microsoft.com/office/word/2006/wordml" xmlns:wps="http://schemas.microsoft.com/office/word/2010/wordprocessingShape" mc:Ignorable="w14 w15 w16se w16cid w16 w16cex w16sdtdh w16sdtfl w16du wp14">
   <w:abstractNum w:abstractNumId="0" w15:restartNumberingAfterBreak="0">
-    <w:nsid w:val="024135F9"/>
+    <w:nsid w:val="0889320C"/>
     <w:multiLevelType w:val="multilevel"/>
-    <w:tmpl w:val="E80C9F1E"/>
+    <w:tmpl w:val="77F8E816"/>
     <w:lvl w:ilvl="0">
       <w:start w:val="1"/>
       <w:numFmt w:val="bullet"/>
@@ -3542,9 +2853,9 @@
     </w:lvl>
   </w:abstractNum>
   <w:abstractNum w:abstractNumId="1" w15:restartNumberingAfterBreak="0">
-    <w:nsid w:val="3CAE23A2"/>
+    <w:nsid w:val="0E9B7C7D"/>
     <w:multiLevelType w:val="multilevel"/>
-    <w:tmpl w:val="77E29C1A"/>
+    <w:tmpl w:val="9CACDE5A"/>
     <w:lvl w:ilvl="0">
       <w:start w:val="1"/>
       <w:numFmt w:val="bullet"/>
@@ -3691,9 +3002,9 @@
     </w:lvl>
   </w:abstractNum>
   <w:abstractNum w:abstractNumId="2" w15:restartNumberingAfterBreak="0">
-    <w:nsid w:val="4C2029A2"/>
+    <w:nsid w:val="2D9865ED"/>
     <w:multiLevelType w:val="multilevel"/>
-    <w:tmpl w:val="D6F2A0D2"/>
+    <w:tmpl w:val="12361F2C"/>
     <w:lvl w:ilvl="0">
       <w:start w:val="1"/>
       <w:numFmt w:val="bullet"/>
@@ -3840,9 +3151,9 @@
     </w:lvl>
   </w:abstractNum>
   <w:abstractNum w:abstractNumId="3" w15:restartNumberingAfterBreak="0">
-    <w:nsid w:val="758F38E7"/>
+    <w:nsid w:val="2E69348D"/>
     <w:multiLevelType w:val="multilevel"/>
-    <w:tmpl w:val="8E3E8BAA"/>
+    <w:tmpl w:val="A35A48B8"/>
     <w:lvl w:ilvl="0">
       <w:start w:val="1"/>
       <w:numFmt w:val="bullet"/>
@@ -3988,16 +3299,168 @@
       </w:rPr>
     </w:lvl>
   </w:abstractNum>
-  <w:num w:numId="1" w16cid:durableId="1472674876">
+  <w:abstractNum w:abstractNumId="4" w15:restartNumberingAfterBreak="0">
+    <w:nsid w:val="3A69149F"/>
+    <w:multiLevelType w:val="multilevel"/>
+    <w:tmpl w:val="8774D9DA"/>
+    <w:lvl w:ilvl="0">
+      <w:start w:val="1"/>
+      <w:numFmt w:val="bullet"/>
+      <w:lvlText w:val=""/>
+      <w:lvlJc w:val="left"/>
+      <w:pPr>
+        <w:tabs>
+          <w:tab w:val="num" w:pos="720"/>
+        </w:tabs>
+        <w:ind w:left="720" w:hanging="360"/>
+      </w:pPr>
+      <w:rPr>
+        <w:rFonts w:ascii="Symbol" w:hAnsi="Symbol" w:hint="default"/>
+        <w:sz w:val="20"/>
+      </w:rPr>
+    </w:lvl>
+    <w:lvl w:ilvl="1" w:tentative="1">
+      <w:start w:val="1"/>
+      <w:numFmt w:val="bullet"/>
+      <w:lvlText w:val="o"/>
+      <w:lvlJc w:val="left"/>
+      <w:pPr>
+        <w:tabs>
+          <w:tab w:val="num" w:pos="1440"/>
+        </w:tabs>
+        <w:ind w:left="1440" w:hanging="360"/>
+      </w:pPr>
+      <w:rPr>
+        <w:rFonts w:ascii="Courier New" w:hAnsi="Courier New" w:hint="default"/>
+        <w:sz w:val="20"/>
+      </w:rPr>
+    </w:lvl>
+    <w:lvl w:ilvl="2" w:tentative="1">
+      <w:start w:val="1"/>
+      <w:numFmt w:val="bullet"/>
+      <w:lvlText w:val=""/>
+      <w:lvlJc w:val="left"/>
+      <w:pPr>
+        <w:tabs>
+          <w:tab w:val="num" w:pos="2160"/>
+        </w:tabs>
+        <w:ind w:left="2160" w:hanging="360"/>
+      </w:pPr>
+      <w:rPr>
+        <w:rFonts w:ascii="Wingdings" w:hAnsi="Wingdings" w:hint="default"/>
+        <w:sz w:val="20"/>
+      </w:rPr>
+    </w:lvl>
+    <w:lvl w:ilvl="3" w:tentative="1">
+      <w:start w:val="1"/>
+      <w:numFmt w:val="bullet"/>
+      <w:lvlText w:val=""/>
+      <w:lvlJc w:val="left"/>
+      <w:pPr>
+        <w:tabs>
+          <w:tab w:val="num" w:pos="2880"/>
+        </w:tabs>
+        <w:ind w:left="2880" w:hanging="360"/>
+      </w:pPr>
+      <w:rPr>
+        <w:rFonts w:ascii="Wingdings" w:hAnsi="Wingdings" w:hint="default"/>
+        <w:sz w:val="20"/>
+      </w:rPr>
+    </w:lvl>
+    <w:lvl w:ilvl="4" w:tentative="1">
+      <w:start w:val="1"/>
+      <w:numFmt w:val="bullet"/>
+      <w:lvlText w:val=""/>
+      <w:lvlJc w:val="left"/>
+      <w:pPr>
+        <w:tabs>
+          <w:tab w:val="num" w:pos="3600"/>
+        </w:tabs>
+        <w:ind w:left="3600" w:hanging="360"/>
+      </w:pPr>
+      <w:rPr>
+        <w:rFonts w:ascii="Wingdings" w:hAnsi="Wingdings" w:hint="default"/>
+        <w:sz w:val="20"/>
+      </w:rPr>
+    </w:lvl>
+    <w:lvl w:ilvl="5" w:tentative="1">
+      <w:start w:val="1"/>
+      <w:numFmt w:val="bullet"/>
+      <w:lvlText w:val=""/>
+      <w:lvlJc w:val="left"/>
+      <w:pPr>
+        <w:tabs>
+          <w:tab w:val="num" w:pos="4320"/>
+        </w:tabs>
+        <w:ind w:left="4320" w:hanging="360"/>
+      </w:pPr>
+      <w:rPr>
+        <w:rFonts w:ascii="Wingdings" w:hAnsi="Wingdings" w:hint="default"/>
+        <w:sz w:val="20"/>
+      </w:rPr>
+    </w:lvl>
+    <w:lvl w:ilvl="6" w:tentative="1">
+      <w:start w:val="1"/>
+      <w:numFmt w:val="bullet"/>
+      <w:lvlText w:val=""/>
+      <w:lvlJc w:val="left"/>
+      <w:pPr>
+        <w:tabs>
+          <w:tab w:val="num" w:pos="5040"/>
+        </w:tabs>
+        <w:ind w:left="5040" w:hanging="360"/>
+      </w:pPr>
+      <w:rPr>
+        <w:rFonts w:ascii="Wingdings" w:hAnsi="Wingdings" w:hint="default"/>
+        <w:sz w:val="20"/>
+      </w:rPr>
+    </w:lvl>
+    <w:lvl w:ilvl="7" w:tentative="1">
+      <w:start w:val="1"/>
+      <w:numFmt w:val="bullet"/>
+      <w:lvlText w:val=""/>
+      <w:lvlJc w:val="left"/>
+      <w:pPr>
+        <w:tabs>
+          <w:tab w:val="num" w:pos="5760"/>
+        </w:tabs>
+        <w:ind w:left="5760" w:hanging="360"/>
+      </w:pPr>
+      <w:rPr>
+        <w:rFonts w:ascii="Wingdings" w:hAnsi="Wingdings" w:hint="default"/>
+        <w:sz w:val="20"/>
+      </w:rPr>
+    </w:lvl>
+    <w:lvl w:ilvl="8" w:tentative="1">
+      <w:start w:val="1"/>
+      <w:numFmt w:val="bullet"/>
+      <w:lvlText w:val=""/>
+      <w:lvlJc w:val="left"/>
+      <w:pPr>
+        <w:tabs>
+          <w:tab w:val="num" w:pos="6480"/>
+        </w:tabs>
+        <w:ind w:left="6480" w:hanging="360"/>
+      </w:pPr>
+      <w:rPr>
+        <w:rFonts w:ascii="Wingdings" w:hAnsi="Wingdings" w:hint="default"/>
+        <w:sz w:val="20"/>
+      </w:rPr>
+    </w:lvl>
+  </w:abstractNum>
+  <w:num w:numId="1" w16cid:durableId="1634943218">
+    <w:abstractNumId w:val="1"/>
+  </w:num>
+  <w:num w:numId="2" w16cid:durableId="153761835">
+    <w:abstractNumId w:val="4"/>
+  </w:num>
+  <w:num w:numId="3" w16cid:durableId="600070487">
     <w:abstractNumId w:val="0"/>
   </w:num>
-  <w:num w:numId="2" w16cid:durableId="60564560">
-    <w:abstractNumId w:val="1"/>
-  </w:num>
-  <w:num w:numId="3" w16cid:durableId="138615979">
+  <w:num w:numId="4" w16cid:durableId="556940930">
     <w:abstractNumId w:val="2"/>
   </w:num>
-  <w:num w:numId="4" w16cid:durableId="1041052910">
+  <w:num w:numId="5" w16cid:durableId="317613500">
     <w:abstractNumId w:val="3"/>
   </w:num>
 </w:numbering>

</xml_diff>

<commit_message>
feat: Integración de Mermaid en DOCX vía API de Kroki en formato Base64
</commit_message>
<xml_diff>
--- a/04-Abril-Mayo/Entregables/2026-05/01-Reporte_Especificaciones_Vida_Saludable_2026-05.docx
+++ b/04-Abril-Mayo/Entregables/2026-05/01-Reporte_Especificaciones_Vida_Saludable_2026-05.docx
@@ -111,7 +111,7 @@
           <w:sz w:val="22"/>
           <w:szCs w:val="22"/>
         </w:rPr>
-        <w:pict w14:anchorId="13BA9CC1">
+        <w:pict>
           <v:rect id="_x0000_i1025" style="width:0;height:1.5pt" o:hralign="center" o:hrstd="t" o:hr="t" fillcolor="#a0a0a0" stroked="f"/>
         </w:pict>
       </w:r>
@@ -1365,59 +1365,68 @@
     </w:p>
     <w:p>
       <w:pPr>
-        <w:pStyle w:val="HTMLconformatoprevio"/>
-      </w:pPr>
-    </w:p>
-    <w:p>
-      <w:pPr>
-        <w:pStyle w:val="HTMLconformatoprevio"/>
-      </w:pPr>
-      <w:r>
-        <w:t>graph TD</w:t>
-      </w:r>
-    </w:p>
-    <w:p>
-      <w:pPr>
-        <w:pStyle w:val="HTMLconformatoprevio"/>
-      </w:pPr>
-      <w:r>
-        <w:t xml:space="preserve">    </w:t>
-      </w:r>
-      <w:r>
-        <w:t>A[Usuario Final / Navegador] --&gt;|HTTPS| B(Frontend SPA: React 18 + Vite)</w:t>
-      </w:r>
-    </w:p>
-    <w:p>
-      <w:pPr>
-        <w:pStyle w:val="HTMLconformatoprevio"/>
-      </w:pPr>
-      <w:r>
-        <w:t xml:space="preserve">    B --&gt;|Axios REST / JWT| C{API Gateway: FastAPI}</w:t>
-      </w:r>
-    </w:p>
-    <w:p>
-      <w:pPr>
-        <w:pStyle w:val="HTMLconformatoprevio"/>
-      </w:pPr>
-      <w:r>
-        <w:t xml:space="preserve">    C --&gt;|RBAC Validation| D[Middleware Seguridad]</w:t>
-      </w:r>
-    </w:p>
-    <w:p>
-      <w:pPr>
-        <w:pStyle w:val="HTMLconformatoprevio"/>
-      </w:pPr>
-      <w:r>
-        <w:t xml:space="preserve">    D --&gt;|oracledb Thin Mode| E[(Oracle 19c)]</w:t>
-      </w:r>
-    </w:p>
-    <w:p>
-      <w:pPr>
-        <w:pStyle w:val="HTMLconformatoprevio"/>
-      </w:pPr>
-      <w:r>
+        <w:rPr>
+          <w:rFonts w:ascii="Calibri" w:eastAsia="Times New Roman" w:hAnsi="Calibri" w:cs="Calibri"/>
+          <w:sz w:val="22"/>
+          <w:szCs w:val="22"/>
+        </w:rPr>
+      </w:pPr>
+      <w:r>
+        <w:rPr>
+          <w:rFonts w:ascii="Calibri" w:eastAsia="Times New Roman" w:hAnsi="Calibri" w:cs="Calibri"/>
+          <w:noProof/>
+          <w:sz w:val="22"/>
+          <w:szCs w:val="22"/>
+        </w:rPr>
         <w:lastRenderedPageBreak/>
-        <w:t xml:space="preserve">    E --&gt;|Lectura Optimizada| F[Vistas VW_BI_MUSEMS_*]</w:t>
+        <w:drawing>
+          <wp:inline distT="0" distB="0" distL="0" distR="0">
+            <wp:extent cx="2019300" cy="6842760"/>
+            <wp:effectExtent l="0" t="0" r="0" b="0"/>
+            <wp:docPr id="2" name="Imagen 2"/>
+            <wp:cNvGraphicFramePr>
+              <a:graphicFrameLocks xmlns:a="http://schemas.openxmlformats.org/drawingml/2006/main" noChangeAspect="1"/>
+            </wp:cNvGraphicFramePr>
+            <a:graphic xmlns:a="http://schemas.openxmlformats.org/drawingml/2006/main">
+              <a:graphicData uri="http://schemas.openxmlformats.org/drawingml/2006/picture">
+                <pic:pic xmlns:pic="http://schemas.openxmlformats.org/drawingml/2006/picture">
+                  <pic:nvPicPr>
+                    <pic:cNvPr id="0" name="Picture 2"/>
+                    <pic:cNvPicPr>
+                      <a:picLocks noChangeAspect="1" noChangeArrowheads="1"/>
+                    </pic:cNvPicPr>
+                  </pic:nvPicPr>
+                  <pic:blipFill>
+                    <a:blip r:embed="rId5">
+                      <a:extLst>
+                        <a:ext uri="{28A0092B-C50C-407E-A947-70E740481C1C}">
+                          <a14:useLocalDpi xmlns:a14="http://schemas.microsoft.com/office/drawing/2010/main" val="0"/>
+                        </a:ext>
+                      </a:extLst>
+                    </a:blip>
+                    <a:srcRect/>
+                    <a:stretch>
+                      <a:fillRect/>
+                    </a:stretch>
+                  </pic:blipFill>
+                  <pic:spPr bwMode="auto">
+                    <a:xfrm>
+                      <a:off x="0" y="0"/>
+                      <a:ext cx="2019300" cy="6842760"/>
+                    </a:xfrm>
+                    <a:prstGeom prst="rect">
+                      <a:avLst/>
+                    </a:prstGeom>
+                    <a:noFill/>
+                    <a:ln>
+                      <a:noFill/>
+                    </a:ln>
+                  </pic:spPr>
+                </pic:pic>
+              </a:graphicData>
+            </a:graphic>
+          </wp:inline>
+        </w:drawing>
       </w:r>
     </w:p>
     <w:p>
@@ -2160,15 +2169,7 @@
                 <w:sz w:val="22"/>
                 <w:szCs w:val="22"/>
               </w:rPr>
-              <w:t>Lógica así</w:t>
-            </w:r>
-            <w:r>
-              <w:rPr>
-                <w:rFonts w:ascii="Calibri" w:eastAsia="Times New Roman" w:hAnsi="Calibri" w:cs="Calibri"/>
-                <w:sz w:val="22"/>
-                <w:szCs w:val="22"/>
-              </w:rPr>
-              <w:t>ncrona de lotes, ThreadPoolExecutor y bitácoras.</w:t>
+              <w:t>Lógica asíncrona de lotes, ThreadPoolExecutor y bitácoras.</w:t>
             </w:r>
           </w:p>
         </w:tc>
@@ -3590,7 +3591,15 @@
           <w:sz w:val="22"/>
           <w:szCs w:val="22"/>
         </w:rPr>
-        <w:t xml:space="preserve"> Requiere una CURP única (18 caracteres), CCT oficial de 10 caracteres alineado al catálogo SEP y validación estructural de correos.</w:t>
+        <w:t xml:space="preserve"> Requiere una CURP ú</w:t>
+      </w:r>
+      <w:r>
+        <w:rPr>
+          <w:rFonts w:ascii="Calibri" w:eastAsia="Times New Roman" w:hAnsi="Calibri" w:cs="Calibri"/>
+          <w:sz w:val="22"/>
+          <w:szCs w:val="22"/>
+        </w:rPr>
+        <w:t>nica (18 caracteres), CCT oficial de 10 caracteres alineado al catálogo SEP y validación estructural de correos.</w:t>
       </w:r>
     </w:p>
     <w:p>
@@ -3844,122 +3853,67 @@
     </w:p>
     <w:p>
       <w:pPr>
-        <w:pStyle w:val="HTMLconformatoprevio"/>
-      </w:pPr>
-    </w:p>
-    <w:p>
-      <w:pPr>
-        <w:pStyle w:val="HTMLconformatoprevio"/>
-      </w:pPr>
-      <w:r>
-        <w:t>flowchart TD</w:t>
-      </w:r>
-    </w:p>
-    <w:p>
-      <w:pPr>
-        <w:pStyle w:val="HTMLconformatoprevio"/>
-      </w:pPr>
-      <w:r>
-        <w:t xml:space="preserve">    A[Inicio: GraphQL Mutation iniciarDescargaLote] --&gt; B[Registro de Lote en Tabla Lote]</w:t>
-      </w:r>
-    </w:p>
-    <w:p>
-      <w:pPr>
-        <w:pStyle w:val="HTMLconformatoprevio"/>
-      </w:pPr>
-      <w:r>
-        <w:t xml:space="preserve">    B --&gt; C[Consulta de Registros: menor_evaluado JOIN catalogo_cct]</w:t>
-      </w:r>
-    </w:p>
-    <w:p>
-      <w:pPr>
-        <w:pStyle w:val="HTMLconformatoprevio"/>
-      </w:pPr>
-      <w:r>
-        <w:t xml:space="preserve">    C --&gt; D{¿CURP en archivo SIN PADECIMIENTOS?}</w:t>
-      </w:r>
-    </w:p>
-    <w:p>
-      <w:pPr>
-        <w:pStyle w:val="HTMLconformatoprevio"/>
-      </w:pPr>
-      <w:r>
-        <w:t xml:space="preserve">    D -- SÍ --&gt; E[Descartar - No incluir Carta]</w:t>
-      </w:r>
-    </w:p>
-    <w:p>
-      <w:pPr>
-        <w:pStyle w:val="HTMLconformatoprevio"/>
-      </w:pPr>
-      <w:r>
-        <w:t xml:space="preserve">    D -- NO --&gt; F{¿CURP en archivos IMSS?}</w:t>
-      </w:r>
-    </w:p>
-    <w:p>
-      <w:pPr>
-        <w:pStyle w:val="HTMLconformatoprevio"/>
-      </w:pPr>
-      <w:r>
-        <w:t xml:space="preserve">    F -- SÍ --&gt; G[Descartar - No incluir Carta]</w:t>
-      </w:r>
-    </w:p>
-    <w:p>
-      <w:pPr>
-        <w:pStyle w:val="HTMLconformatoprevio"/>
-      </w:pPr>
-      <w:r>
-        <w:t xml:space="preserve">    F -- NO --&gt; H[Agregar a ThreadPoolExecutor]</w:t>
-      </w:r>
-    </w:p>
-    <w:p>
-      <w:pPr>
-        <w:pStyle w:val="HTMLconformatoprevio"/>
-      </w:pPr>
-      <w:r>
-        <w:t xml:space="preserve">    H --&gt; I[Construir Token Cifrado AES]</w:t>
-      </w:r>
-    </w:p>
-    <w:p>
-      <w:pPr>
-        <w:pStyle w:val="HTMLconformatoprevio"/>
-      </w:pPr>
-      <w:r>
-        <w:t xml:space="preserve">    I --&gt; </w:t>
-      </w:r>
-      <w:r>
-        <w:t>J[Llamada HTTPS a URL_IMSS con Timeout]</w:t>
-      </w:r>
-    </w:p>
-    <w:p>
-      <w:pPr>
-        <w:pStyle w:val="HTMLconformatoprevio"/>
-      </w:pPr>
-      <w:r>
-        <w:t xml:space="preserve">    J --&gt; K{¿Respuesta 200 OK?}</w:t>
-      </w:r>
-    </w:p>
-    <w:p>
-      <w:pPr>
-        <w:pStyle w:val="HTMLconformatoprevio"/>
-      </w:pPr>
-      <w:r>
-        <w:t xml:space="preserve">    K -- Sí --&gt; L[Descargar y Resguardar PDF en sin-carta/]</w:t>
-      </w:r>
-    </w:p>
-    <w:p>
-      <w:pPr>
-        <w:pStyle w:val="HTMLconformatoprevio"/>
-      </w:pPr>
-      <w:r>
-        <w:t xml:space="preserve">    K -- No --&gt; M[Registrar en BitacoraEvento y Reintentar]</w:t>
-      </w:r>
-    </w:p>
-    <w:p>
-      <w:pPr>
-        <w:pStyle w:val="HTMLconformatoprevio"/>
-      </w:pPr>
-      <w:r>
-        <w:t xml:space="preserve">    L --&gt; N[Actualizar CurpProcesada a EXITO]</w:t>
+        <w:rPr>
+          <w:rFonts w:ascii="Calibri" w:eastAsia="Times New Roman" w:hAnsi="Calibri" w:cs="Calibri"/>
+          <w:sz w:val="22"/>
+          <w:szCs w:val="22"/>
+        </w:rPr>
+      </w:pPr>
+      <w:r>
+        <w:rPr>
+          <w:rFonts w:ascii="Calibri" w:eastAsia="Times New Roman" w:hAnsi="Calibri" w:cs="Calibri"/>
+          <w:noProof/>
+          <w:sz w:val="22"/>
+          <w:szCs w:val="22"/>
+        </w:rPr>
+        <w:drawing>
+          <wp:inline distT="0" distB="0" distL="0" distR="0">
+            <wp:extent cx="6728460" cy="15133320"/>
+            <wp:effectExtent l="0" t="0" r="0" b="0"/>
+            <wp:docPr id="3" name="Imagen 3"/>
+            <wp:cNvGraphicFramePr>
+              <a:graphicFrameLocks xmlns:a="http://schemas.openxmlformats.org/drawingml/2006/main" noChangeAspect="1"/>
+            </wp:cNvGraphicFramePr>
+            <a:graphic xmlns:a="http://schemas.openxmlformats.org/drawingml/2006/main">
+              <a:graphicData uri="http://schemas.openxmlformats.org/drawingml/2006/picture">
+                <pic:pic xmlns:pic="http://schemas.openxmlformats.org/drawingml/2006/picture">
+                  <pic:nvPicPr>
+                    <pic:cNvPr id="0" name="Picture 3"/>
+                    <pic:cNvPicPr>
+                      <a:picLocks noChangeAspect="1" noChangeArrowheads="1"/>
+                    </pic:cNvPicPr>
+                  </pic:nvPicPr>
+                  <pic:blipFill>
+                    <a:blip r:embed="rId6">
+                      <a:extLst>
+                        <a:ext uri="{28A0092B-C50C-407E-A947-70E740481C1C}">
+                          <a14:useLocalDpi xmlns:a14="http://schemas.microsoft.com/office/drawing/2010/main" val="0"/>
+                        </a:ext>
+                      </a:extLst>
+                    </a:blip>
+                    <a:srcRect/>
+                    <a:stretch>
+                      <a:fillRect/>
+                    </a:stretch>
+                  </pic:blipFill>
+                  <pic:spPr bwMode="auto">
+                    <a:xfrm>
+                      <a:off x="0" y="0"/>
+                      <a:ext cx="6728460" cy="15133320"/>
+                    </a:xfrm>
+                    <a:prstGeom prst="rect">
+                      <a:avLst/>
+                    </a:prstGeom>
+                    <a:noFill/>
+                    <a:ln>
+                      <a:noFill/>
+                    </a:ln>
+                  </pic:spPr>
+                </pic:pic>
+              </a:graphicData>
+            </a:graphic>
+          </wp:inline>
+        </w:drawing>
       </w:r>
     </w:p>
     <w:p>
@@ -4091,7 +4045,15 @@
           <w:sz w:val="22"/>
           <w:szCs w:val="22"/>
         </w:rPr>
-        <w:t xml:space="preserve"> Prueba de saturación de API con 20 hilos simultáneos.</w:t>
+        <w:t xml:space="preserve"> Prueba de saturació</w:t>
+      </w:r>
+      <w:r>
+        <w:rPr>
+          <w:rFonts w:ascii="Calibri" w:hAnsi="Calibri" w:cs="Calibri"/>
+          <w:sz w:val="22"/>
+          <w:szCs w:val="22"/>
+        </w:rPr>
+        <w:t>n de API con 20 hilos simultáneos.</w:t>
       </w:r>
     </w:p>
     <w:p>
@@ -5548,15 +5510,7 @@
           <w:sz w:val="22"/>
           <w:szCs w:val="22"/>
         </w:rPr>
-        <w:t xml:space="preserve"> saturó </w:t>
-      </w:r>
-      <w:r>
-        <w:rPr>
-          <w:rFonts w:ascii="Calibri" w:eastAsia="Times New Roman" w:hAnsi="Calibri" w:cs="Calibri"/>
-          <w:sz w:val="22"/>
-          <w:szCs w:val="22"/>
-        </w:rPr>
-        <w:t>la cuota del WAF del IMSS.</w:t>
+        <w:t xml:space="preserve"> saturó la cuota del WAF del IMSS.</w:t>
       </w:r>
     </w:p>
     <w:p>
@@ -5812,7 +5766,15 @@
           <w:sz w:val="22"/>
           <w:szCs w:val="22"/>
         </w:rPr>
-        <w:t xml:space="preserve"> mediante f-strings. Se reemplazó por el uso estricto de parámetros SQL (</w:t>
+        <w:t xml:space="preserve"> </w:t>
+      </w:r>
+      <w:r>
+        <w:rPr>
+          <w:rFonts w:ascii="Calibri" w:hAnsi="Calibri" w:cs="Calibri"/>
+          <w:sz w:val="22"/>
+          <w:szCs w:val="22"/>
+        </w:rPr>
+        <w:t>mediante f-strings. Se reemplazó por el uso estricto de parámetros SQL (</w:t>
       </w:r>
       <w:r>
         <w:rPr>
@@ -5965,15 +5927,15 @@
           <w:sz w:val="22"/>
           <w:szCs w:val="22"/>
         </w:rPr>
-        <w:t xml:space="preserve"> </w:t>
-      </w:r>
-      <w:r>
-        <w:rPr>
-          <w:rFonts w:ascii="Calibri" w:eastAsia="Times New Roman" w:hAnsi="Calibri" w:cs="Calibri"/>
-          <w:sz w:val="22"/>
-          <w:szCs w:val="22"/>
-        </w:rPr>
-        <w:t>El Frontend de Angular aún se encuentra en etapa de "esqueleto" (estructura creada pero sin implementación de las features de visualización y Apollo Client).</w:t>
+        <w:t xml:space="preserve"> El Frontend de Angular aú</w:t>
+      </w:r>
+      <w:r>
+        <w:rPr>
+          <w:rFonts w:ascii="Calibri" w:eastAsia="Times New Roman" w:hAnsi="Calibri" w:cs="Calibri"/>
+          <w:sz w:val="22"/>
+          <w:szCs w:val="22"/>
+        </w:rPr>
+        <w:t>n se encuentra en etapa de "esqueleto" (estructura creada pero sin implementación de las features de visualización y Apollo Client).</w:t>
       </w:r>
     </w:p>
     <w:p>
@@ -6049,15 +6011,7 @@
           <w:sz w:val="22"/>
           <w:szCs w:val="22"/>
         </w:rPr>
-        <w:t xml:space="preserve"> </w:t>
-      </w:r>
-      <w:r>
-        <w:rPr>
-          <w:rFonts w:ascii="Calibri" w:eastAsia="Times New Roman" w:hAnsi="Calibri" w:cs="Calibri"/>
-          <w:sz w:val="22"/>
-          <w:szCs w:val="22"/>
-        </w:rPr>
-        <w:t>Aplicar parches de enmascaramiento GraphQL y parametrización SQL.</w:t>
+        <w:t xml:space="preserve"> Aplicar parches de enmascaramiento GraphQL y parametrización SQL.</w:t>
       </w:r>
     </w:p>
     <w:p>
@@ -6212,8 +6166,8 @@
           <w:sz w:val="22"/>
           <w:szCs w:val="22"/>
         </w:rPr>
-        <w:pict w14:anchorId="791C497D">
-          <v:rect id="_x0000_i1026" style="width:0;height:1.5pt" o:hralign="center" o:hrstd="t" o:hr="t" fillcolor="#a0a0a0" stroked="f"/>
+        <w:pict>
+          <v:rect id="_x0000_i1028" style="width:0;height:1.5pt" o:hralign="center" o:hrstd="t" o:hr="t" fillcolor="#a0a0a0" stroked="f"/>
         </w:pict>
       </w:r>
     </w:p>
@@ -6267,9 +6221,9 @@
 <file path=word/numbering.xml><?xml version="1.0" encoding="utf-8"?>
 <w:numbering xmlns:wpc="http://schemas.microsoft.com/office/word/2010/wordprocessingCanvas" xmlns:cx="http://schemas.microsoft.com/office/drawing/2014/chartex" xmlns:cx1="http://schemas.microsoft.com/office/drawing/2015/9/8/chartex" xmlns:cx2="http://schemas.microsoft.com/office/drawing/2015/10/21/chartex" xmlns:cx3="http://schemas.microsoft.com/office/drawing/2016/5/9/chartex" xmlns:cx4="http://schemas.microsoft.com/office/drawing/2016/5/10/chartex" xmlns:cx5="http://schemas.microsoft.com/office/drawing/2016/5/11/chartex" xmlns:cx6="http://schemas.microsoft.com/office/drawing/2016/5/12/chartex" xmlns:cx7="http://schemas.microsoft.com/office/drawing/2016/5/13/chartex" xmlns:cx8="http://schemas.microsoft.com/office/drawing/2016/5/14/chartex" xmlns:mc="http://schemas.openxmlformats.org/markup-compatibility/2006" xmlns:aink="http://schemas.microsoft.com/office/drawing/2016/ink" xmlns:am3d="http://schemas.microsoft.com/office/drawing/2017/model3d" xmlns:o="urn:schemas-microsoft-com:office:office" xmlns:oel="http://schemas.microsoft.com/office/2019/extlst" xmlns:r="http://schemas.openxmlformats.org/officeDocument/2006/relationships" xmlns:m="http://schemas.openxmlformats.org/officeDocument/2006/math" xmlns:v="urn:schemas-microsoft-com:vml" xmlns:wp14="http://schemas.microsoft.com/office/word/2010/wordprocessingDrawing" xmlns:wp="http://schemas.openxmlformats.org/drawingml/2006/wordprocessingDrawing" xmlns:w10="urn:schemas-microsoft-com:office:word" xmlns:w="http://schemas.openxmlformats.org/wordprocessingml/2006/main" xmlns:w14="http://schemas.microsoft.com/office/word/2010/wordml" xmlns:w15="http://schemas.microsoft.com/office/word/2012/wordml" xmlns:w16cex="http://schemas.microsoft.com/office/word/2018/wordml/cex" xmlns:w16cid="http://schemas.microsoft.com/office/word/2016/wordml/cid" xmlns:w16="http://schemas.microsoft.com/office/word/2018/wordml" xmlns:w16du="http://schemas.microsoft.com/office/word/2023/wordml/word16du" xmlns:w16sdtdh="http://schemas.microsoft.com/office/word/2020/wordml/sdtdatahash" xmlns:w16sdtfl="http://schemas.microsoft.com/office/word/2024/wordml/sdtformatlock" xmlns:w16se="http://schemas.microsoft.com/office/word/2015/wordml/symex" xmlns:wpg="http://schemas.microsoft.com/office/word/2010/wordprocessingGroup" xmlns:wpi="http://schemas.microsoft.com/office/word/2010/wordprocessingInk" xmlns:wne="http://schemas.microsoft.com/office/word/2006/wordml" xmlns:wps="http://schemas.microsoft.com/office/word/2010/wordprocessingShape" mc:Ignorable="w14 w15 w16se w16cid w16 w16cex w16sdtdh w16sdtfl w16du wp14">
   <w:abstractNum w:abstractNumId="0" w15:restartNumberingAfterBreak="0">
-    <w:nsid w:val="0E1A320B"/>
+    <w:nsid w:val="1E8E5FAA"/>
     <w:multiLevelType w:val="multilevel"/>
-    <w:tmpl w:val="F7E802BA"/>
+    <w:tmpl w:val="7A127000"/>
     <w:lvl w:ilvl="0">
       <w:start w:val="1"/>
       <w:numFmt w:val="bullet"/>
@@ -6416,9 +6370,9 @@
     </w:lvl>
   </w:abstractNum>
   <w:abstractNum w:abstractNumId="1" w15:restartNumberingAfterBreak="0">
-    <w:nsid w:val="243E0E92"/>
+    <w:nsid w:val="27801D2B"/>
     <w:multiLevelType w:val="multilevel"/>
-    <w:tmpl w:val="44942DAA"/>
+    <w:tmpl w:val="4AEA8942"/>
     <w:lvl w:ilvl="0">
       <w:start w:val="1"/>
       <w:numFmt w:val="bullet"/>
@@ -6565,9 +6519,9 @@
     </w:lvl>
   </w:abstractNum>
   <w:abstractNum w:abstractNumId="2" w15:restartNumberingAfterBreak="0">
-    <w:nsid w:val="3C611938"/>
+    <w:nsid w:val="28377495"/>
     <w:multiLevelType w:val="multilevel"/>
-    <w:tmpl w:val="61603E62"/>
+    <w:tmpl w:val="8AFA37DA"/>
     <w:lvl w:ilvl="0">
       <w:start w:val="1"/>
       <w:numFmt w:val="bullet"/>
@@ -6714,9 +6668,9 @@
     </w:lvl>
   </w:abstractNum>
   <w:abstractNum w:abstractNumId="3" w15:restartNumberingAfterBreak="0">
-    <w:nsid w:val="40083D4D"/>
+    <w:nsid w:val="2EB21DF7"/>
     <w:multiLevelType w:val="multilevel"/>
-    <w:tmpl w:val="013E18F0"/>
+    <w:tmpl w:val="629A39C0"/>
     <w:lvl w:ilvl="0">
       <w:start w:val="1"/>
       <w:numFmt w:val="bullet"/>
@@ -6863,9 +6817,9 @@
     </w:lvl>
   </w:abstractNum>
   <w:abstractNum w:abstractNumId="4" w15:restartNumberingAfterBreak="0">
-    <w:nsid w:val="40FC53AA"/>
+    <w:nsid w:val="358C6805"/>
     <w:multiLevelType w:val="multilevel"/>
-    <w:tmpl w:val="30F6B6A0"/>
+    <w:tmpl w:val="8A846DB6"/>
     <w:lvl w:ilvl="0">
       <w:start w:val="1"/>
       <w:numFmt w:val="bullet"/>
@@ -7012,9 +6966,9 @@
     </w:lvl>
   </w:abstractNum>
   <w:abstractNum w:abstractNumId="5" w15:restartNumberingAfterBreak="0">
-    <w:nsid w:val="47C93CC2"/>
+    <w:nsid w:val="49840155"/>
     <w:multiLevelType w:val="multilevel"/>
-    <w:tmpl w:val="1B8A02DA"/>
+    <w:tmpl w:val="0CEC2570"/>
     <w:lvl w:ilvl="0">
       <w:start w:val="1"/>
       <w:numFmt w:val="bullet"/>
@@ -7161,9 +7115,9 @@
     </w:lvl>
   </w:abstractNum>
   <w:abstractNum w:abstractNumId="6" w15:restartNumberingAfterBreak="0">
-    <w:nsid w:val="5D3216CA"/>
+    <w:nsid w:val="55B96554"/>
     <w:multiLevelType w:val="multilevel"/>
-    <w:tmpl w:val="D49CE9FE"/>
+    <w:tmpl w:val="20DC03CE"/>
     <w:lvl w:ilvl="0">
       <w:start w:val="1"/>
       <w:numFmt w:val="bullet"/>
@@ -7310,9 +7264,9 @@
     </w:lvl>
   </w:abstractNum>
   <w:abstractNum w:abstractNumId="7" w15:restartNumberingAfterBreak="0">
-    <w:nsid w:val="6460103C"/>
+    <w:nsid w:val="761D05BC"/>
     <w:multiLevelType w:val="multilevel"/>
-    <w:tmpl w:val="1C428612"/>
+    <w:tmpl w:val="4F3C04B8"/>
     <w:lvl w:ilvl="0">
       <w:start w:val="1"/>
       <w:numFmt w:val="bullet"/>
@@ -7459,9 +7413,9 @@
     </w:lvl>
   </w:abstractNum>
   <w:abstractNum w:abstractNumId="8" w15:restartNumberingAfterBreak="0">
-    <w:nsid w:val="73AA04DD"/>
+    <w:nsid w:val="79016DD2"/>
     <w:multiLevelType w:val="multilevel"/>
-    <w:tmpl w:val="90685116"/>
+    <w:tmpl w:val="BA12F992"/>
     <w:lvl w:ilvl="0">
       <w:start w:val="1"/>
       <w:numFmt w:val="bullet"/>
@@ -7607,31 +7561,31 @@
       </w:rPr>
     </w:lvl>
   </w:abstractNum>
-  <w:num w:numId="1" w16cid:durableId="1643928259">
+  <w:num w:numId="1" w16cid:durableId="1504664334">
+    <w:abstractNumId w:val="5"/>
+  </w:num>
+  <w:num w:numId="2" w16cid:durableId="154414757">
+    <w:abstractNumId w:val="8"/>
+  </w:num>
+  <w:num w:numId="3" w16cid:durableId="95683531">
+    <w:abstractNumId w:val="1"/>
+  </w:num>
+  <w:num w:numId="4" w16cid:durableId="550073792">
     <w:abstractNumId w:val="4"/>
   </w:num>
-  <w:num w:numId="2" w16cid:durableId="1228495931">
+  <w:num w:numId="5" w16cid:durableId="298925484">
+    <w:abstractNumId w:val="0"/>
+  </w:num>
+  <w:num w:numId="6" w16cid:durableId="2004313765">
+    <w:abstractNumId w:val="3"/>
+  </w:num>
+  <w:num w:numId="7" w16cid:durableId="604701733">
+    <w:abstractNumId w:val="6"/>
+  </w:num>
+  <w:num w:numId="8" w16cid:durableId="285504205">
     <w:abstractNumId w:val="2"/>
   </w:num>
-  <w:num w:numId="3" w16cid:durableId="153254919">
-    <w:abstractNumId w:val="3"/>
-  </w:num>
-  <w:num w:numId="4" w16cid:durableId="1923100014">
-    <w:abstractNumId w:val="5"/>
-  </w:num>
-  <w:num w:numId="5" w16cid:durableId="827205974">
-    <w:abstractNumId w:val="1"/>
-  </w:num>
-  <w:num w:numId="6" w16cid:durableId="87044897">
-    <w:abstractNumId w:val="0"/>
-  </w:num>
-  <w:num w:numId="7" w16cid:durableId="514729341">
-    <w:abstractNumId w:val="8"/>
-  </w:num>
-  <w:num w:numId="8" w16cid:durableId="973098131">
-    <w:abstractNumId w:val="6"/>
-  </w:num>
-  <w:num w:numId="9" w16cid:durableId="2003073235">
+  <w:num w:numId="9" w16cid:durableId="528184758">
     <w:abstractNumId w:val="7"/>
   </w:num>
 </w:numbering>

</xml_diff>